<commit_message>
EE series polish: Book 4 Part II bridge, Ch 20 part opening, specific chapter pointers, closing section 40.5; Book 7 Ch 1 de-duplicated from front matter, Part II and III openers, Ch 28 closes Part II; Book 3 Part I heading and 'file' wording; Book 1 series arc for seven books; author metadata Lothar J. Musiol on all masters; Book 1 KDP duplicate sentence; b2lib paths; backups in bak/pre-polish-20261001-2059
</commit_message>
<xml_diff>
--- a/EE - Series/Packaging_Layout_EMC_and_Test_Book7.docx
+++ b/EE - Series/Packaging_Layout_EMC_and_Test_Book7.docx
@@ -473,7 +473,7 @@
         <w:rPr>
           <w:i w:val="0"/>
         </w:rPr>
-        <w:t>The previous books of the series designed circuits, devices, radios, and power converters. This last book is about where they meet: the package that holds the chips, the board that connects them, the copper that carries their current and their signals, and the heat they produce. It begins with the system that most clearly shows why packaging has become a first-rank engineering problem, the AI accelerator of 2026. Its performance is limited less by how fast it computes than by how fast memory can feed it, and how much current and heat its package can carry. A modern accelerator is a memory system with compute attached.</w:t>
+        <w:t>Every chip in the earlier books ends up in a package on a board, and no system shows more clearly why that step has become a first-rank engineering problem than the AI accelerator of 2026. Its performance is limited less by how fast it computes than by how fast memory can feed it, and how much current and heat its package can carry. A modern accelerator is a memory system with compute attached.</w:t>
       </w:r>
     </w:p>
     <w:p>
@@ -7153,6 +7153,15 @@
       </w:r>
     </w:p>
     <w:p>
+      <w:pPr/>
+      <w:r>
+        <w:rPr>
+          <w:i w:val="0"/>
+        </w:rPr>
+        <w:t>Part I kept signals where they were meant to go: on the traces, through the package, and into the die. Part II asks what escapes. Every product offered for sale must show that it does not radiate or conduct more than the regulations allow, and that it keeps working when its neighbors are noisy. The layout habits of Chapter 5, the decoupling network of Chapter 11, and the stack-up of Chapter 12 return here as the designer's main defenses, now judged by a calibrated receiver in a chamber rather than by an eye diagram. Chapter 20 ended with the instruments that verify an interconnect; this part ends with the laboratory that certifies the product.</w:t>
+      </w:r>
+    </w:p>
+    <w:p>
       <w:pPr>
         <w:pStyle w:val="Heading1"/>
       </w:pPr>
@@ -9430,7 +9439,7 @@
         <w:rPr>
           <w:i w:val="0"/>
         </w:rPr>
-        <w:t>The earlier chapters explained why boards radiate, how the test measures it, and what the limits mean. This chapter puts the pieces into the order an engineer uses them: choose the right simulator for each question, measure early with cheap tools, keep enough margin for the uncertainty of the final test, and arrive at the accredited lab with a product that is expected to pass. It closes the book by stating plainly who does what, because the designer and the test laboratory do different jobs.</w:t>
+        <w:t>The earlier chapters explained why boards radiate, how the test measures it, and what the limits mean. This chapter puts the pieces into the order an engineer uses them: choose the right simulator for each question, measure early with cheap tools, keep enough margin for the uncertainty of the final test, and arrive at the accredited lab with a product that is expected to pass. It closes Part II by stating plainly who does what, because the designer and the test laboratory do different jobs.</w:t>
       </w:r>
     </w:p>
     <w:p>
@@ -9787,6 +9796,15 @@
           <w:i w:val="0"/>
         </w:rPr>
         <w:t>Part III. Where the Series Meets</w:t>
+      </w:r>
+    </w:p>
+    <w:p>
+      <w:pPr/>
+      <w:r>
+        <w:rPr>
+          <w:i w:val="0"/>
+        </w:rPr>
+        <w:t>The package, the board, and the test lab are where every earlier book becomes hardware. The last part of the book, and of the series, follows that idea to its end by looking at one product that draws on nearly every book at once.</w:t>
       </w:r>
     </w:p>
     <w:p>

</xml_diff>

<commit_message>
EE Book 7 expansion, chapters 1-10: new section, worked example, problem, and closing bridge each
</commit_message>
<xml_diff>
--- a/EE - Series/Packaging_Layout_EMC_and_Test_Book7.docx
+++ b/EE - Series/Packaging_Layout_EMC_and_Test_Book7.docx
@@ -663,7 +663,79 @@
         <w:rPr>
           <w:i w:val="0"/>
         </w:rPr>
-        <w:t>1.4 What the rest of the book does</w:t>
+        <w:t>1.4 The roofline: when bandwidth, not arithmetic, sets the speed</w:t>
+      </w:r>
+    </w:p>
+    <w:p>
+      <w:pPr/>
+      <w:r>
+        <w:rPr>
+          <w:i w:val="0"/>
+        </w:rPr>
+        <w:t>A processor can be limited by how fast it computes or by how fast it is fed. The roofline model makes the choice explicit. Divide the peak arithmetic rate by the memory bandwidth and the result is the ridge point, in operations per byte: a workload that performs more operations than that for every byte it fetches is compute-bound, and one that performs fewer is bandwidth-bound and runs at the bandwidth times its arithmetic intensity, however many arithmetic units sit idle. A 2026 accelerator with about 2 × 10¹⁵ low-precision operations per second and 8 TB/s of HBM has a ridge at 250 operations per byte. Training large models, which reuses each weight across a large batch, sits above it. Generating text one token at a time for a single user, which reads every weight once per token for about two operations each, sits far below it, which is why the memory bandwidth of Chapter 17, and the packaging that delivers it, decides inference speed.</w:t>
+      </w:r>
+    </w:p>
+    <w:p>
+      <w:pPr>
+        <w:jc w:val="center"/>
+      </w:pPr>
+      <w:r>
+        <w:rPr>
+          <w:i w:val="0"/>
+        </w:rPr>
+        <w:t>attainable rate = min(peak rate, bandwidth × arithmetic intensity)</w:t>
+      </w:r>
+    </w:p>
+    <w:p>
+      <w:pPr>
+        <w:pStyle w:val="Heading2"/>
+      </w:pPr>
+      <w:r>
+        <w:rPr>
+          <w:i w:val="0"/>
+        </w:rPr>
+        <w:t>Worked Example 1.3</w:t>
+      </w:r>
+    </w:p>
+    <w:p>
+      <w:pPr/>
+      <w:r>
+        <w:rPr>
+          <w:b/>
+        </w:rPr>
+        <w:t xml:space="preserve">Problem. </w:t>
+      </w:r>
+      <w:r>
+        <w:rPr>
+          <w:i w:val="0"/>
+        </w:rPr>
+        <w:t>A model has 70 × 10⁹ parameters stored in 8-bit form, and generation at batch size 1 reads all of them for each token. Find the token rate on an accelerator with 8 TB/s of memory bandwidth, and the fraction of its 2 × 10¹⁵ operations per second that it uses.</w:t>
+      </w:r>
+    </w:p>
+    <w:p>
+      <w:pPr/>
+      <w:r>
+        <w:rPr>
+          <w:b/>
+        </w:rPr>
+        <w:t xml:space="preserve">Solution. </w:t>
+      </w:r>
+      <w:r>
+        <w:rPr>
+          <w:i w:val="0"/>
+        </w:rPr>
+        <w:t>Each token reads 70 GB, so the rate is 8 × 10¹²/70 × 10⁹ = 114 tokens per second. Each token costs about 2 operations per parameter, 1.4 × 10¹¹ operations, so the accelerator performs 1.6 × 10¹³ operations per second, under 1 % of its peak. Batching many users together reuses each weight fetch and moves the workload toward the ridge, which is how servers make the arithmetic pay.</w:t>
+      </w:r>
+    </w:p>
+    <w:p>
+      <w:pPr>
+        <w:pStyle w:val="Heading2"/>
+      </w:pPr>
+      <w:r>
+        <w:rPr>
+          <w:i w:val="0"/>
+        </w:rPr>
+        <w:t>1.5 What the rest of the book does</w:t>
       </w:r>
     </w:p>
     <w:p>
@@ -676,6 +748,15 @@
       </w:r>
     </w:p>
     <w:p>
+      <w:pPr/>
+      <w:r>
+        <w:rPr>
+          <w:i w:val="0"/>
+        </w:rPr>
+        <w:t>Bandwidth per watt, energy per bit, and current are the three numbers this book follows. The package that connects the processor to its memory comes first, in Chapter 2.</w:t>
+      </w:r>
+    </w:p>
+    <w:p>
       <w:pPr>
         <w:pStyle w:val="Heading2"/>
       </w:pPr>
@@ -777,6 +858,36 @@
       </w:r>
     </w:p>
     <w:p>
+      <w:pPr/>
+      <w:r>
+        <w:rPr>
+          <w:b/>
+        </w:rPr>
+        <w:t xml:space="preserve">7. </w:t>
+      </w:r>
+      <w:r>
+        <w:rPr>
+          <w:i w:val="0"/>
+        </w:rPr>
+        <w:t>Find the ridge point of a processor with 400 × 10¹² operations per second and 3.2 TB/s of bandwidth.</w:t>
+      </w:r>
+    </w:p>
+    <w:p>
+      <w:pPr/>
+      <w:r>
+        <w:rPr>
+          <w:b/>
+        </w:rPr>
+        <w:t xml:space="preserve">8. </w:t>
+      </w:r>
+      <w:r>
+        <w:rPr>
+          <w:i w:val="0"/>
+        </w:rPr>
+        <w:t>How many tokens per second can 16 TB/s of bandwidth deliver for a 140 GB model at batch size 1?</w:t>
+      </w:r>
+    </w:p>
+    <w:p>
       <w:pPr>
         <w:pStyle w:val="Heading1"/>
       </w:pPr>
@@ -992,6 +1103,87 @@
         <w:rPr>
           <w:i w:val="0"/>
         </w:rPr>
+        <w:t>2.5 Bump pitch and the density of connections</w:t>
+      </w:r>
+    </w:p>
+    <w:p>
+      <w:pPr/>
+      <w:r>
+        <w:rPr>
+          <w:i w:val="0"/>
+        </w:rPr>
+        <w:t>The number of connections a package can make between two dies grows as the inverse square of the pitch. Solder microbumps on a silicon interposer reached about 40 to 55 µm pitch; below roughly 20 µm solder bridges and the volume of each joint becomes too small to tolerate warpage, so the industry moved to hybrid bonding, in which copper pads set in an oxide surface are polished flat, bonded oxide to oxide at room temperature, and annealed so that the copper expands and fuses. Hybrid-bond pitches of 9 µm are in production in 2026 and below 5 µm in development. Each step multiplies the connections per square millimeter, and with them the bandwidth that the die-to-die links of Chapter 8 can carry across a given edge or area, while shortening each connection and so lowering its capacitance and energy per bit.</w:t>
+      </w:r>
+    </w:p>
+    <w:p>
+      <w:pPr>
+        <w:jc w:val="center"/>
+      </w:pPr>
+      <w:r>
+        <w:rPr>
+          <w:i w:val="0"/>
+        </w:rPr>
+        <w:t>connections per mm² = 1 / p²   (p in mm)</w:t>
+      </w:r>
+    </w:p>
+    <w:p>
+      <w:pPr>
+        <w:pStyle w:val="Heading2"/>
+      </w:pPr>
+      <w:r>
+        <w:rPr>
+          <w:i w:val="0"/>
+        </w:rPr>
+        <w:t>Worked Example 2.3</w:t>
+      </w:r>
+    </w:p>
+    <w:p>
+      <w:pPr/>
+      <w:r>
+        <w:rPr>
+          <w:b/>
+        </w:rPr>
+        <w:t xml:space="preserve">Problem. </w:t>
+      </w:r>
+      <w:r>
+        <w:rPr>
+          <w:i w:val="0"/>
+        </w:rPr>
+        <w:t>Compare the connection density of 40 µm microbumps and 9 µm hybrid bonds, and the bandwidth through 10 mm² of each if every connection carries 4 Gbit/s.</w:t>
+      </w:r>
+    </w:p>
+    <w:p>
+      <w:pPr/>
+      <w:r>
+        <w:rPr>
+          <w:b/>
+        </w:rPr>
+        <w:t xml:space="preserve">Solution. </w:t>
+      </w:r>
+      <w:r>
+        <w:rPr>
+          <w:i w:val="0"/>
+        </w:rPr>
+        <w:t>At 40 µm, 1/0.04² = 625 connections per mm², 6250 in 10 mm², 25 Tbit/s. At 9 µm, 1/0.009² = 12 300 per mm², 123 000 in 10 mm², about 490 Tbit/s, twenty times as much. In practice a share of the pads carry power and ground, but the ratio holds, which is why stacked memory and logic-on-logic designs moved to hybrid bonding.</w:t>
+      </w:r>
+    </w:p>
+    <w:p>
+      <w:pPr/>
+      <w:r>
+        <w:rPr>
+          <w:i w:val="0"/>
+        </w:rPr>
+        <w:t>The package now carries thousands of signals between dies. It must also carry the largest currents in the system, which Chapter 3 delivers.</w:t>
+      </w:r>
+    </w:p>
+    <w:p>
+      <w:pPr>
+        <w:pStyle w:val="Heading2"/>
+      </w:pPr>
+      <w:r>
+        <w:rPr>
+          <w:i w:val="0"/>
+        </w:rPr>
         <w:t>Practice</w:t>
       </w:r>
     </w:p>
@@ -1086,6 +1278,36 @@
       </w:r>
     </w:p>
     <w:p>
+      <w:pPr/>
+      <w:r>
+        <w:rPr>
+          <w:b/>
+        </w:rPr>
+        <w:t xml:space="preserve">7. </w:t>
+      </w:r>
+      <w:r>
+        <w:rPr>
+          <w:i w:val="0"/>
+        </w:rPr>
+        <w:t>How many connections per mm² does a 25 µm pitch give?</w:t>
+      </w:r>
+    </w:p>
+    <w:p>
+      <w:pPr/>
+      <w:r>
+        <w:rPr>
+          <w:b/>
+        </w:rPr>
+        <w:t xml:space="preserve">8. </w:t>
+      </w:r>
+      <w:r>
+        <w:rPr>
+          <w:i w:val="0"/>
+        </w:rPr>
+        <w:t>Why can solder microbumps not shrink indefinitely?</w:t>
+      </w:r>
+    </w:p>
+    <w:p>
       <w:pPr>
         <w:pStyle w:val="Heading1"/>
       </w:pPr>
@@ -1353,6 +1575,76 @@
         <w:rPr>
           <w:i w:val="0"/>
         </w:rPr>
+        <w:t>3.5 Vertical power delivery</w:t>
+      </w:r>
+    </w:p>
+    <w:p>
+      <w:pPr/>
+      <w:r>
+        <w:rPr>
+          <w:i w:val="0"/>
+        </w:rPr>
+        <w:t>The planes of Section 3.2 carry current laterally from regulators at the edge of the package to the die at its center, and at 875 A even a tenth of a milliohm costs tens of watts. Vertical power delivery moves the final regulation stage directly beneath the processor, on the back of the board or inside the package substrate, so that the current flows up through the board's thickness, a millimeter or two, instead of across several centimeters. Integrated voltage regulators go further and place the last conversion on the die or in the package, fed at a higher voltage and lower current. The price is heat in a place already crowded with it and a regulator that must fit beneath the processor's ball field, which is why the power stages for these designs are thin, high-frequency modules with integrated magnetics.</w:t>
+      </w:r>
+    </w:p>
+    <w:p>
+      <w:pPr>
+        <w:pStyle w:val="Heading2"/>
+      </w:pPr>
+      <w:r>
+        <w:rPr>
+          <w:i w:val="0"/>
+        </w:rPr>
+        <w:t>Worked Example 3.4</w:t>
+      </w:r>
+    </w:p>
+    <w:p>
+      <w:pPr/>
+      <w:r>
+        <w:rPr>
+          <w:b/>
+        </w:rPr>
+        <w:t xml:space="preserve">Problem. </w:t>
+      </w:r>
+      <w:r>
+        <w:rPr>
+          <w:i w:val="0"/>
+        </w:rPr>
+        <w:t>A processor draws 875 A. The lateral path from edge-mounted regulators has 0.1 mΩ of resistance; a vertical design reduces it to 0.02 mΩ. Find the loss in each and the saving.</w:t>
+      </w:r>
+    </w:p>
+    <w:p>
+      <w:pPr/>
+      <w:r>
+        <w:rPr>
+          <w:b/>
+        </w:rPr>
+        <w:t xml:space="preserve">Solution. </w:t>
+      </w:r>
+      <w:r>
+        <w:rPr>
+          <w:i w:val="0"/>
+        </w:rPr>
+        <w:t>Laterally, 875² × 10⁻⁴ = 76.6 W; vertically, 875² × 2 × 10⁻⁵ = 15.3 W. The 61 W saved is 7 % of a 875 W load at 1 V, and it also removes the voltage drop of 87.5 mV, which the regulator would otherwise have to compensate by raising its output.</w:t>
+      </w:r>
+    </w:p>
+    <w:p>
+      <w:pPr/>
+      <w:r>
+        <w:rPr>
+          <w:i w:val="0"/>
+        </w:rPr>
+        <w:t>Current reaches the die through the board as well as the package, and the board's materials, Chapter 4, set what its signals can do.</w:t>
+      </w:r>
+    </w:p>
+    <w:p>
+      <w:pPr>
+        <w:pStyle w:val="Heading2"/>
+      </w:pPr>
+      <w:r>
+        <w:rPr>
+          <w:i w:val="0"/>
+        </w:rPr>
         <w:t>Practice</w:t>
       </w:r>
     </w:p>
@@ -1447,6 +1739,21 @@
       </w:r>
     </w:p>
     <w:p>
+      <w:pPr/>
+      <w:r>
+        <w:rPr>
+          <w:b/>
+        </w:rPr>
+        <w:t xml:space="preserve">7. </w:t>
+      </w:r>
+      <w:r>
+        <w:rPr>
+          <w:i w:val="0"/>
+        </w:rPr>
+        <w:t>Find the voltage drop across 0.05 mΩ at 600 A.</w:t>
+      </w:r>
+    </w:p>
+    <w:p>
       <w:pPr>
         <w:pStyle w:val="Heading1"/>
       </w:pPr>
@@ -1662,6 +1969,87 @@
         <w:rPr>
           <w:i w:val="0"/>
         </w:rPr>
+        <w:t>4.5 How much copper roughness costs</w:t>
+      </w:r>
+    </w:p>
+    <w:p>
+      <w:pPr/>
+      <w:r>
+        <w:rPr>
+          <w:i w:val="0"/>
+        </w:rPr>
+        <w:t>At high frequency the current crowds into the outermost skin depth of the conductor, 0.39 µm at 28 GHz, and if the copper surface has peaks and valleys taller than that, the current must follow them. The Hammerstad correction multiplies the smooth-conductor loss by 1 + (2/π) arctan[1.4(Δ/δ)²], where Δ is the RMS roughness, so the factor approaches 2 once the roughness is a few skin depths. More accurate models, such as Huray's snowball model, treat the nodules of electrodeposited foil as spheres, but the conclusion is the same. Board vendors therefore sell grades: standard foil with several micrometers of roughness, very-low-profile (VLP) foil near 1 µm, and hyper-very-low-profile (HVLP) foil of a few tenths of a micrometer, at progressively higher cost and with adhesion that the laminate chemistry must restore.</w:t>
+      </w:r>
+    </w:p>
+    <w:p>
+      <w:pPr>
+        <w:jc w:val="center"/>
+      </w:pPr>
+      <w:r>
+        <w:rPr>
+          <w:i w:val="0"/>
+        </w:rPr>
+        <w:t>K_rough = 1 + (2/π) arctan[1.4 (Δ/δ)²]</w:t>
+      </w:r>
+    </w:p>
+    <w:p>
+      <w:pPr>
+        <w:pStyle w:val="Heading2"/>
+      </w:pPr>
+      <w:r>
+        <w:rPr>
+          <w:i w:val="0"/>
+        </w:rPr>
+        <w:t>Worked Example 4.3</w:t>
+      </w:r>
+    </w:p>
+    <w:p>
+      <w:pPr/>
+      <w:r>
+        <w:rPr>
+          <w:b/>
+        </w:rPr>
+        <w:t xml:space="preserve">Problem. </w:t>
+      </w:r>
+      <w:r>
+        <w:rPr>
+          <w:i w:val="0"/>
+        </w:rPr>
+        <w:t>Find the roughness factor at 28 GHz for VLP foil with Δ = 1.0 µm and HVLP foil with Δ = 0.3 µm.</w:t>
+      </w:r>
+    </w:p>
+    <w:p>
+      <w:pPr/>
+      <w:r>
+        <w:rPr>
+          <w:b/>
+        </w:rPr>
+        <w:t xml:space="preserve">Solution. </w:t>
+      </w:r>
+      <w:r>
+        <w:rPr>
+          <w:i w:val="0"/>
+        </w:rPr>
+        <w:t>δ = 66/√(28 × 10⁹) mm = 0.394 µm. For VLP, (1.0/0.394)² = 6.44, and K = 1 + (2/π) arctan(9.0) = 1.93. For HVLP, (0.3/0.394)² = 0.58, and K = 1 + (2/π) arctan(0.81) = 1.43. The conductor loss of the HVLP trace is 26 % lower, a saving that can be worth several decibels on a long 112 Gbit/s channel.</w:t>
+      </w:r>
+    </w:p>
+    <w:p>
+      <w:pPr/>
+      <w:r>
+        <w:rPr>
+          <w:i w:val="0"/>
+        </w:rPr>
+        <w:t>The board's materials set the loss per inch. Layout, Chapter 5, decides how the signals and their return currents use them.</w:t>
+      </w:r>
+    </w:p>
+    <w:p>
+      <w:pPr>
+        <w:pStyle w:val="Heading2"/>
+      </w:pPr>
+      <w:r>
+        <w:rPr>
+          <w:i w:val="0"/>
+        </w:rPr>
         <w:t>Practice</w:t>
       </w:r>
     </w:p>
@@ -1756,6 +2144,21 @@
       </w:r>
     </w:p>
     <w:p>
+      <w:pPr/>
+      <w:r>
+        <w:rPr>
+          <w:b/>
+        </w:rPr>
+        <w:t xml:space="preserve">7. </w:t>
+      </w:r>
+      <w:r>
+        <w:rPr>
+          <w:i w:val="0"/>
+        </w:rPr>
+        <w:t>What is the Hammerstad factor when the roughness equals the skin depth?</w:t>
+      </w:r>
+    </w:p>
+    <w:p>
       <w:pPr>
         <w:pStyle w:val="Heading1"/>
       </w:pPr>
@@ -1993,6 +2396,87 @@
         <w:rPr>
           <w:i w:val="0"/>
         </w:rPr>
+        <w:t>5.5 Plane resonances</w:t>
+      </w:r>
+    </w:p>
+    <w:p>
+      <w:pPr/>
+      <w:r>
+        <w:rPr>
+          <w:i w:val="0"/>
+        </w:rPr>
+        <w:t>A pair of power and ground planes is a parallel-plate cavity, and it resonates whenever a dimension equals a whole number of half wavelengths in the dielectric. The lowest mode of a rectangular plane pair of length a resonates at c/(2a√εr). At those frequencies the impedance between the planes peaks, any noise current injected there, by a switching driver or a via carrying a signal between layers, excites a large voltage, and the plane pair's edges radiate. Decoupling capacitors damp the low modes, but their inductance makes them useless above a few hundred megahertz, so the higher modes are controlled by stitching vias along the edges, by keeping signal vias that change reference planes next to a ground via, and in demanding designs by thin, high-capacitance laminates or resistive edge termination.</w:t>
+      </w:r>
+    </w:p>
+    <w:p>
+      <w:pPr>
+        <w:jc w:val="center"/>
+      </w:pPr>
+      <w:r>
+        <w:rPr>
+          <w:i w:val="0"/>
+        </w:rPr>
+        <w:t>f₁₀ = c / (2a √εr)</w:t>
+      </w:r>
+    </w:p>
+    <w:p>
+      <w:pPr>
+        <w:pStyle w:val="Heading2"/>
+      </w:pPr>
+      <w:r>
+        <w:rPr>
+          <w:i w:val="0"/>
+        </w:rPr>
+        <w:t>Worked Example 5.3</w:t>
+      </w:r>
+    </w:p>
+    <w:p>
+      <w:pPr/>
+      <w:r>
+        <w:rPr>
+          <w:b/>
+        </w:rPr>
+        <w:t xml:space="preserve">Problem. </w:t>
+      </w:r>
+      <w:r>
+        <w:rPr>
+          <w:i w:val="0"/>
+        </w:rPr>
+        <w:t>Find the lowest resonance of a 100 mm by 80 mm plane pair in a dielectric with εr = 4.2, and the next one.</w:t>
+      </w:r>
+    </w:p>
+    <w:p>
+      <w:pPr/>
+      <w:r>
+        <w:rPr>
+          <w:b/>
+        </w:rPr>
+        <w:t xml:space="preserve">Solution. </w:t>
+      </w:r>
+      <w:r>
+        <w:rPr>
+          <w:i w:val="0"/>
+        </w:rPr>
+        <w:t>Along the 100 mm side, f = 3 × 10⁸/(2 × 0.1 × 2.05) = 732 MHz; along the 80 mm side, 915 MHz. A board with a 3.3 V plane of this size will show impedance peaks there, and a clock harmonic that lands near 732 MHz will radiate far more than its neighbors, which is a common reason one harmonic fails an emissions test while the rest pass.</w:t>
+      </w:r>
+    </w:p>
+    <w:p>
+      <w:pPr/>
+      <w:r>
+        <w:rPr>
+          <w:i w:val="0"/>
+        </w:rPr>
+        <w:t>Return paths, transitions, and plane behavior are layout's electrical side. The thermal side, Chapter 6, removes what the electrons leave behind as heat.</w:t>
+      </w:r>
+    </w:p>
+    <w:p>
+      <w:pPr>
+        <w:pStyle w:val="Heading2"/>
+      </w:pPr>
+      <w:r>
+        <w:rPr>
+          <w:i w:val="0"/>
+        </w:rPr>
         <w:t>Practice</w:t>
       </w:r>
     </w:p>
@@ -2087,6 +2571,21 @@
       </w:r>
     </w:p>
     <w:p>
+      <w:pPr/>
+      <w:r>
+        <w:rPr>
+          <w:b/>
+        </w:rPr>
+        <w:t xml:space="preserve">7. </w:t>
+      </w:r>
+      <w:r>
+        <w:rPr>
+          <w:i w:val="0"/>
+        </w:rPr>
+        <w:t>Find the lowest plane-pair resonance of a 200 mm board with εr = 4.</w:t>
+      </w:r>
+    </w:p>
+    <w:p>
       <w:pPr>
         <w:pStyle w:val="Heading1"/>
       </w:pPr>
@@ -2313,6 +2812,87 @@
         <w:rPr>
           <w:i w:val="0"/>
         </w:rPr>
+        <w:t>6.5 The thermal stack of an accelerator</w:t>
+      </w:r>
+    </w:p>
+    <w:p>
+      <w:pPr/>
+      <w:r>
+        <w:rPr>
+          <w:i w:val="0"/>
+        </w:rPr>
+        <w:t>Heat leaves a die through a stack of layers, and each adds a thermal resistance per unit area, R″, in K·cm²/W. The temperature rise across a layer is the heat flux times R″. For a bare die under a cold plate the stack is the silicon itself, the first thermal interface material between die and lid, the lid, the second interface between lid and cold plate, and the cold plate's convective resistance. Interface materials are the weak links: thermal grease reaches about 0.05 to 0.1 K·cm²/W when thin, indium solder and liquid metal reach 0.01 to 0.02, and every void or dry spot creates a hot spot. At 100 W/cm² and above, a tenth of a K·cm²/W is ten degrees, so the move from grease to metal interfaces and to lidless designs is one of the larger gains available to an accelerator's cooling.</w:t>
+      </w:r>
+    </w:p>
+    <w:p>
+      <w:pPr>
+        <w:jc w:val="center"/>
+      </w:pPr>
+      <w:r>
+        <w:rPr>
+          <w:i w:val="0"/>
+        </w:rPr>
+        <w:t>ΔT = q″ × Σ R″</w:t>
+      </w:r>
+    </w:p>
+    <w:p>
+      <w:pPr>
+        <w:pStyle w:val="Heading2"/>
+      </w:pPr>
+      <w:r>
+        <w:rPr>
+          <w:i w:val="0"/>
+        </w:rPr>
+        <w:t>Worked Example 6.3</w:t>
+      </w:r>
+    </w:p>
+    <w:p>
+      <w:pPr/>
+      <w:r>
+        <w:rPr>
+          <w:b/>
+        </w:rPr>
+        <w:t xml:space="preserve">Problem. </w:t>
+      </w:r>
+      <w:r>
+        <w:rPr>
+          <w:i w:val="0"/>
+        </w:rPr>
+        <w:t>A 1000 W die of 8 cm² sits under a lid with a TIM1 of 0.05 K·cm²/W and a TIM2 of 0.10 K·cm²/W. Find the temperature rise across each interface, and the improvement if TIM1 is replaced by indium at 0.015 K·cm²/W.</w:t>
+      </w:r>
+    </w:p>
+    <w:p>
+      <w:pPr/>
+      <w:r>
+        <w:rPr>
+          <w:b/>
+        </w:rPr>
+        <w:t xml:space="preserve">Solution. </w:t>
+      </w:r>
+      <w:r>
+        <w:rPr>
+          <w:i w:val="0"/>
+        </w:rPr>
+        <w:t>q″ = 1000/8 = 125 W/cm². TIM1 adds 125 × 0.05 = 6.3 K and TIM2 125 × 0.10 = 12.5 K, assuming the lid does not spread the heat much. Indium cuts TIM1 to 1.9 K, saving 4.4 K, which allows a warmer coolant or a higher clock at the same junction temperature.</w:t>
+      </w:r>
+    </w:p>
+    <w:p>
+      <w:pPr/>
+      <w:r>
+        <w:rPr>
+          <w:i w:val="0"/>
+        </w:rPr>
+        <w:t>Heat ends the chain from die to coolant. Chapter 7 turns to devices whose mechanical motion, not just their heat, is the point: MEMS.</w:t>
+      </w:r>
+    </w:p>
+    <w:p>
+      <w:pPr>
+        <w:pStyle w:val="Heading2"/>
+      </w:pPr>
+      <w:r>
+        <w:rPr>
+          <w:i w:val="0"/>
+        </w:rPr>
         <w:t>Practice</w:t>
       </w:r>
     </w:p>
@@ -2407,6 +2987,21 @@
       </w:r>
     </w:p>
     <w:p>
+      <w:pPr/>
+      <w:r>
+        <w:rPr>
+          <w:b/>
+        </w:rPr>
+        <w:t xml:space="preserve">7. </w:t>
+      </w:r>
+      <w:r>
+        <w:rPr>
+          <w:i w:val="0"/>
+        </w:rPr>
+        <w:t>Find the temperature rise across 0.08 K·cm²/W at 200 W/cm².</w:t>
+      </w:r>
+    </w:p>
+    <w:p>
       <w:pPr>
         <w:pStyle w:val="Heading1"/>
       </w:pPr>
@@ -2674,6 +3269,76 @@
         <w:rPr>
           <w:i w:val="0"/>
         </w:rPr>
+        <w:t>7.5 Reading a MEMS microphone data sheet</w:t>
+      </w:r>
+    </w:p>
+    <w:p>
+      <w:pPr/>
+      <w:r>
+        <w:rPr>
+          <w:i w:val="0"/>
+        </w:rPr>
+        <w:t>A MEMS microphone's data sheet reduces it to a few numbers. Sensitivity is the output for a 1 kHz tone at 94 dB sound pressure level, 1 pascal, quoted in dBV or dBFS for digital parts. Signal-to-noise ratio is the 94 dB reference minus the self-noise expressed as an equivalent A-weighted sound level; 65 dB SNR means a self-noise of 29 dBA, and the best parts in 2026, such as Infineon's sealed-dual-membrane designs, reach about 70 to 75 dB. The acoustic overload point, AOP, is the level at which distortion reaches 10 %, about 120 to 135 dB SPL. The dynamic range is AOP minus self-noise. Phones use several microphones and beamforming, Book 5's array gain in air, so matching sensitivity and phase between parts, typically within ±1 dB, matters as much as each part's own figures.</w:t>
+      </w:r>
+    </w:p>
+    <w:p>
+      <w:pPr>
+        <w:pStyle w:val="Heading2"/>
+      </w:pPr>
+      <w:r>
+        <w:rPr>
+          <w:i w:val="0"/>
+        </w:rPr>
+        <w:t>Worked Example 7.4</w:t>
+      </w:r>
+    </w:p>
+    <w:p>
+      <w:pPr/>
+      <w:r>
+        <w:rPr>
+          <w:b/>
+        </w:rPr>
+        <w:t xml:space="preserve">Problem. </w:t>
+      </w:r>
+      <w:r>
+        <w:rPr>
+          <w:i w:val="0"/>
+        </w:rPr>
+        <w:t>A microphone has 65 dB SNR and an AOP of 130 dB SPL. Find its self-noise and dynamic range, and the SNR improvement from beamforming four such microphones on a distant talker, if their noise is independent.</w:t>
+      </w:r>
+    </w:p>
+    <w:p>
+      <w:pPr/>
+      <w:r>
+        <w:rPr>
+          <w:b/>
+        </w:rPr>
+        <w:t xml:space="preserve">Solution. </w:t>
+      </w:r>
+      <w:r>
+        <w:rPr>
+          <w:i w:val="0"/>
+        </w:rPr>
+        <w:t>Self-noise is 94 − 65 = 29 dBA, and the dynamic range 130 − 29 = 101 dB. Averaging four microphones adds the signal coherently and the self-noise in power, a gain of 10 log₁₀4 = 6 dB, to 71 dB, before any rejection of room noise from other directions.</w:t>
+      </w:r>
+    </w:p>
+    <w:p>
+      <w:pPr/>
+      <w:r>
+        <w:rPr>
+          <w:i w:val="0"/>
+        </w:rPr>
+        <w:t>MEMS sensors and resonators live inside packages and next to processors. The next chapter turns to the chiplets and die-to-die links that make up the processors themselves, in Chapter 8.</w:t>
+      </w:r>
+    </w:p>
+    <w:p>
+      <w:pPr>
+        <w:pStyle w:val="Heading2"/>
+      </w:pPr>
+      <w:r>
+        <w:rPr>
+          <w:i w:val="0"/>
+        </w:rPr>
         <w:t>Practice</w:t>
       </w:r>
     </w:p>
@@ -2768,6 +3433,21 @@
       </w:r>
     </w:p>
     <w:p>
+      <w:pPr/>
+      <w:r>
+        <w:rPr>
+          <w:b/>
+        </w:rPr>
+        <w:t xml:space="preserve">7. </w:t>
+      </w:r>
+      <w:r>
+        <w:rPr>
+          <w:i w:val="0"/>
+        </w:rPr>
+        <w:t>A microphone has a self-noise of 32 dBA. What is its SNR?</w:t>
+      </w:r>
+    </w:p>
+    <w:p>
       <w:pPr>
         <w:pStyle w:val="Heading1"/>
       </w:pPr>
@@ -3014,6 +3694,87 @@
         <w:rPr>
           <w:i w:val="0"/>
         </w:rPr>
+        <w:t>8.5 The energy budget of die-to-die links</w:t>
+      </w:r>
+    </w:p>
+    <w:p>
+      <w:pPr/>
+      <w:r>
+        <w:rPr>
+          <w:i w:val="0"/>
+        </w:rPr>
+        <w:t>Splitting a processor into chiplets turns on-die wires into die-to-die links, and those links cost energy that the monolithic design did not pay. Short parallel interfaces of the UCIe and BoW type, with simple unterminated drivers across a millimeter or two of interposer, cost roughly 0.25 to 0.5 pJ per bit; serial links across an organic substrate cost 1 to 2 pJ/bit; hybrid-bonded stacked dies, with connections only micrometers long, fall below 0.1 pJ/bit. The power is the energy per bit times the traffic. For a large accelerator moving terabytes per second between compute chiplets, the difference between 0.5 and 0.1 pJ/bit is tens of watts, which is why the highest-bandwidth boundaries are placed where stacking, not lateral links, can serve them.</w:t>
+      </w:r>
+    </w:p>
+    <w:p>
+      <w:pPr>
+        <w:jc w:val="center"/>
+      </w:pPr>
+      <w:r>
+        <w:rPr>
+          <w:i w:val="0"/>
+        </w:rPr>
+        <w:t>P = E_bit × bit rate</w:t>
+      </w:r>
+    </w:p>
+    <w:p>
+      <w:pPr>
+        <w:pStyle w:val="Heading2"/>
+      </w:pPr>
+      <w:r>
+        <w:rPr>
+          <w:i w:val="0"/>
+        </w:rPr>
+        <w:t>Worked Example 8.3</w:t>
+      </w:r>
+    </w:p>
+    <w:p>
+      <w:pPr/>
+      <w:r>
+        <w:rPr>
+          <w:b/>
+        </w:rPr>
+        <w:t xml:space="preserve">Problem. </w:t>
+      </w:r>
+      <w:r>
+        <w:rPr>
+          <w:i w:val="0"/>
+        </w:rPr>
+        <w:t>Two compute chiplets exchange 10 TB/s. Find the link power at 0.5 pJ/bit and at 0.1 pJ/bit.</w:t>
+      </w:r>
+    </w:p>
+    <w:p>
+      <w:pPr/>
+      <w:r>
+        <w:rPr>
+          <w:b/>
+        </w:rPr>
+        <w:t xml:space="preserve">Solution. </w:t>
+      </w:r>
+      <w:r>
+        <w:rPr>
+          <w:i w:val="0"/>
+        </w:rPr>
+        <w:t>10 TB/s is 8 × 10¹³ bit/s. At 0.5 pJ/bit the links take 40 W; at 0.1 pJ/bit, 8 W. The 32 W difference, on a part with a 1000 W budget, is the price or the reward of the packaging choice.</w:t>
+      </w:r>
+    </w:p>
+    <w:p>
+      <w:pPr/>
+      <w:r>
+        <w:rPr>
+          <w:i w:val="0"/>
+        </w:rPr>
+        <w:t>The first eight chapters have assembled the package, the board, the power, the heat, and the chiplets of a modern system. The next chapters look at the package as an electrical circuit and a mechanical structure, beginning with its wires and bumps.</w:t>
+      </w:r>
+    </w:p>
+    <w:p>
+      <w:pPr>
+        <w:pStyle w:val="Heading2"/>
+      </w:pPr>
+      <w:r>
+        <w:rPr>
+          <w:i w:val="0"/>
+        </w:rPr>
         <w:t>Practice</w:t>
       </w:r>
     </w:p>
@@ -3108,6 +3869,21 @@
       </w:r>
     </w:p>
     <w:p>
+      <w:pPr/>
+      <w:r>
+        <w:rPr>
+          <w:b/>
+        </w:rPr>
+        <w:t xml:space="preserve">7. </w:t>
+      </w:r>
+      <w:r>
+        <w:rPr>
+          <w:i w:val="0"/>
+        </w:rPr>
+        <w:t>What power do die-to-die links consume at 1.5 pJ/bit and 2 TB/s?</w:t>
+      </w:r>
+    </w:p>
+    <w:p>
       <w:pPr>
         <w:pStyle w:val="Heading1"/>
       </w:pPr>
@@ -3334,6 +4110,87 @@
         <w:rPr>
           <w:i w:val="0"/>
         </w:rPr>
+        <w:t>9.5 Junction temperature from a package's thermal numbers</w:t>
+      </w:r>
+    </w:p>
+    <w:p>
+      <w:pPr/>
+      <w:r>
+        <w:rPr>
+          <w:i w:val="0"/>
+        </w:rPr>
+        <w:t>Package data sheets quote several thermal figures, and confusing them is a common error. θJA, junction to ambient, is measured on a standard JEDEC test board in still air and describes that board, not yours. θJC, junction to case, applies when essentially all the heat leaves through the case into a heatsink. ψJT, the junction-to-top characterization parameter, is not a thermal resistance at all: it relates the junction temperature to the temperature measured at the top of the package when most heat flows elsewhere, into the board. Because it is small, typically 0.5 to 2 °C/W, it lets an engineer with a thermocouple or an infrared camera on the package top estimate the junction temperature in the real product, which is the measurement that matters.</w:t>
+      </w:r>
+    </w:p>
+    <w:p>
+      <w:pPr>
+        <w:jc w:val="center"/>
+      </w:pPr>
+      <w:r>
+        <w:rPr>
+          <w:i w:val="0"/>
+        </w:rPr>
+        <w:t>TJ ≈ T_top + ψJT × P</w:t>
+      </w:r>
+    </w:p>
+    <w:p>
+      <w:pPr>
+        <w:pStyle w:val="Heading2"/>
+      </w:pPr>
+      <w:r>
+        <w:rPr>
+          <w:i w:val="0"/>
+        </w:rPr>
+        <w:t>Worked Example 9.3</w:t>
+      </w:r>
+    </w:p>
+    <w:p>
+      <w:pPr/>
+      <w:r>
+        <w:rPr>
+          <w:b/>
+        </w:rPr>
+        <w:t xml:space="preserve">Problem. </w:t>
+      </w:r>
+      <w:r>
+        <w:rPr>
+          <w:i w:val="0"/>
+        </w:rPr>
+        <w:t>A QFN regulator dissipating 1.5 W measures 92 °C on top. Its data sheet gives ψJT = 1.2 °C/W and θJA = 35 °C/W on the JEDEC board. Estimate the junction temperature, and explain why θJA would mislead.</w:t>
+      </w:r>
+    </w:p>
+    <w:p>
+      <w:pPr/>
+      <w:r>
+        <w:rPr>
+          <w:b/>
+        </w:rPr>
+        <w:t xml:space="preserve">Solution. </w:t>
+      </w:r>
+      <w:r>
+        <w:rPr>
+          <w:i w:val="0"/>
+        </w:rPr>
+        <w:t>TJ ≈ 92 + 1.2 × 1.5 = 93.8 °C. Using θJA with a 50 °C ambient would predict 50 + 35 × 1.5 = 102.5 °C, a figure that describes a different board; the real board's copper and airflow decide the junction temperature, and only a measurement on it, through ψJT, captures them.</w:t>
+      </w:r>
+    </w:p>
+    <w:p>
+      <w:pPr/>
+      <w:r>
+        <w:rPr>
+          <w:i w:val="0"/>
+        </w:rPr>
+        <w:t>The package's electrical and thermal behavior sets its performance on day one. Chapter 10 asks what wears it out.</w:t>
+      </w:r>
+    </w:p>
+    <w:p>
+      <w:pPr>
+        <w:pStyle w:val="Heading2"/>
+      </w:pPr>
+      <w:r>
+        <w:rPr>
+          <w:i w:val="0"/>
+        </w:rPr>
         <w:t>Practice</w:t>
       </w:r>
     </w:p>
@@ -3428,6 +4285,21 @@
       </w:r>
     </w:p>
     <w:p>
+      <w:pPr/>
+      <w:r>
+        <w:rPr>
+          <w:b/>
+        </w:rPr>
+        <w:t xml:space="preserve">7. </w:t>
+      </w:r>
+      <w:r>
+        <w:rPr>
+          <w:i w:val="0"/>
+        </w:rPr>
+        <w:t>A part dissipating 3 W shows 70 °C on top with ψJT = 0.8 °C/W. Estimate TJ.</w:t>
+      </w:r>
+    </w:p>
+    <w:p>
       <w:pPr>
         <w:pStyle w:val="Heading1"/>
       </w:pPr>
@@ -3665,6 +4537,76 @@
         <w:rPr>
           <w:i w:val="0"/>
         </w:rPr>
+        <w:t>10.5 Moisture and the popcorn failure</w:t>
+      </w:r>
+    </w:p>
+    <w:p>
+      <w:pPr/>
+      <w:r>
+        <w:rPr>
+          <w:i w:val="0"/>
+        </w:rPr>
+        <w:t>Plastic packages absorb moisture from the air. During reflow soldering, at peak temperatures near 250 °C, that moisture turns to steam within seconds, and the pressure can delaminate the mold compound from the die or lead frame, or crack the package outright, sometimes with an audible pop. IPC/JEDEC J-STD-020 classifies packages by moisture sensitivity level, MSL 1 to 6, according to how long they may sit in a factory at 30 °C and 60 % relative humidity before they must be soldered: unlimited for MSL 1, one year for MSL 2, 168 hours for MSL 3, 72 hours for MSL 4, and so on. J-STD-033 governs the dry packs, humidity indicator cards, and baking that reset the clock. Large BGAs and thin packages are usually MSL 3 or worse, which is why a production line tracks the floor life of every opened reel.</w:t>
+      </w:r>
+    </w:p>
+    <w:p>
+      <w:pPr>
+        <w:pStyle w:val="Heading2"/>
+      </w:pPr>
+      <w:r>
+        <w:rPr>
+          <w:i w:val="0"/>
+        </w:rPr>
+        <w:t>Worked Example 10.3</w:t>
+      </w:r>
+    </w:p>
+    <w:p>
+      <w:pPr/>
+      <w:r>
+        <w:rPr>
+          <w:b/>
+        </w:rPr>
+        <w:t xml:space="preserve">Problem. </w:t>
+      </w:r>
+      <w:r>
+        <w:rPr>
+          <w:i w:val="0"/>
+        </w:rPr>
+        <w:t>A reel of MSL 3 parts is opened on Monday at 08:00 and the line will not reflow the last of them until the following Tuesday at 17:00. Are they within their floor life, and what must be done if not?</w:t>
+      </w:r>
+    </w:p>
+    <w:p>
+      <w:pPr/>
+      <w:r>
+        <w:rPr>
+          <w:b/>
+        </w:rPr>
+        <w:t xml:space="preserve">Solution. </w:t>
+      </w:r>
+      <w:r>
+        <w:rPr>
+          <w:i w:val="0"/>
+        </w:rPr>
+        <w:t>Monday 08:00 to the next Tuesday 17:00 is 8 days and 9 hours, 201 hours, beyond the 168-hour floor life of MSL 3. The remaining parts must be baked according to J-STD-033, typically for many hours at 125 °C for BGAs if the reel tolerates it, or at lower temperature for longer, before use; alternatively they can be returned to dry storage before the limit, which pauses or partially resets the clock.</w:t>
+      </w:r>
+    </w:p>
+    <w:p>
+      <w:pPr/>
+      <w:r>
+        <w:rPr>
+          <w:i w:val="0"/>
+        </w:rPr>
+        <w:t>Moisture, expansion, fatigue, and electromigration set the package's life. Chapter 11 returns to its electrical role and to the network of capacitors that keeps the supply quiet.</w:t>
+      </w:r>
+    </w:p>
+    <w:p>
+      <w:pPr>
+        <w:pStyle w:val="Heading2"/>
+      </w:pPr>
+      <w:r>
+        <w:rPr>
+          <w:i w:val="0"/>
+        </w:rPr>
         <w:t>Practice</w:t>
       </w:r>
     </w:p>
@@ -3759,6 +4701,21 @@
       </w:r>
     </w:p>
     <w:p>
+      <w:pPr/>
+      <w:r>
+        <w:rPr>
+          <w:b/>
+        </w:rPr>
+        <w:t xml:space="preserve">7. </w:t>
+      </w:r>
+      <w:r>
+        <w:rPr>
+          <w:i w:val="0"/>
+        </w:rPr>
+        <w:t>What is the floor life of an MSL 4 part?</w:t>
+      </w:r>
+    </w:p>
+    <w:p>
       <w:pPr>
         <w:pStyle w:val="Heading1"/>
       </w:pPr>
@@ -10483,6 +11440,36 @@
       </w:r>
     </w:p>
     <w:p>
+      <w:pPr/>
+      <w:r>
+        <w:rPr>
+          <w:b/>
+        </w:rPr>
+        <w:t xml:space="preserve">7. </w:t>
+      </w:r>
+      <w:r>
+        <w:rPr>
+          <w:i w:val="0"/>
+        </w:rPr>
+        <w:t>400 × 10¹²/3.2 × 10¹² = 125 operations per byte.</w:t>
+      </w:r>
+    </w:p>
+    <w:p>
+      <w:pPr/>
+      <w:r>
+        <w:rPr>
+          <w:b/>
+        </w:rPr>
+        <w:t xml:space="preserve">8. </w:t>
+      </w:r>
+      <w:r>
+        <w:rPr>
+          <w:i w:val="0"/>
+        </w:rPr>
+        <w:t>16 × 10¹²/140 × 10⁹ = 114 tokens per second.</w:t>
+      </w:r>
+    </w:p>
+    <w:p>
       <w:pPr>
         <w:pStyle w:val="Heading2"/>
       </w:pPr>
@@ -10584,6 +11571,36 @@
       </w:r>
     </w:p>
     <w:p>
+      <w:pPr/>
+      <w:r>
+        <w:rPr>
+          <w:b/>
+        </w:rPr>
+        <w:t xml:space="preserve">7. </w:t>
+      </w:r>
+      <w:r>
+        <w:rPr>
+          <w:i w:val="0"/>
+        </w:rPr>
+        <w:t>1/0.025² = 1600.</w:t>
+      </w:r>
+    </w:p>
+    <w:p>
+      <w:pPr/>
+      <w:r>
+        <w:rPr>
+          <w:b/>
+        </w:rPr>
+        <w:t xml:space="preserve">8. </w:t>
+      </w:r>
+      <w:r>
+        <w:rPr>
+          <w:i w:val="0"/>
+        </w:rPr>
+        <w:t>Below about 20 µm the solder volume per joint becomes too small to accommodate warpage and coplanarity variation, and neighboring joints bridge.</w:t>
+      </w:r>
+    </w:p>
+    <w:p>
       <w:pPr>
         <w:pStyle w:val="Heading2"/>
       </w:pPr>
@@ -10685,6 +11702,21 @@
       </w:r>
     </w:p>
     <w:p>
+      <w:pPr/>
+      <w:r>
+        <w:rPr>
+          <w:b/>
+        </w:rPr>
+        <w:t xml:space="preserve">7. </w:t>
+      </w:r>
+      <w:r>
+        <w:rPr>
+          <w:i w:val="0"/>
+        </w:rPr>
+        <w:t>30 mV.</w:t>
+      </w:r>
+    </w:p>
+    <w:p>
       <w:pPr>
         <w:pStyle w:val="Heading2"/>
       </w:pPr>
@@ -10786,6 +11818,21 @@
       </w:r>
     </w:p>
     <w:p>
+      <w:pPr/>
+      <w:r>
+        <w:rPr>
+          <w:b/>
+        </w:rPr>
+        <w:t xml:space="preserve">7. </w:t>
+      </w:r>
+      <w:r>
+        <w:rPr>
+          <w:i w:val="0"/>
+        </w:rPr>
+        <w:t>1 + (2/π) arctan(1.4) = 1.61.</w:t>
+      </w:r>
+    </w:p>
+    <w:p>
       <w:pPr>
         <w:pStyle w:val="Heading2"/>
       </w:pPr>
@@ -10887,6 +11934,21 @@
       </w:r>
     </w:p>
     <w:p>
+      <w:pPr/>
+      <w:r>
+        <w:rPr>
+          <w:b/>
+        </w:rPr>
+        <w:t xml:space="preserve">7. </w:t>
+      </w:r>
+      <w:r>
+        <w:rPr>
+          <w:i w:val="0"/>
+        </w:rPr>
+        <w:t>3 × 10⁸/(2 × 0.2 × 2) = 375 MHz.</w:t>
+      </w:r>
+    </w:p>
+    <w:p>
       <w:pPr>
         <w:pStyle w:val="Heading2"/>
       </w:pPr>
@@ -10988,6 +12050,21 @@
       </w:r>
     </w:p>
     <w:p>
+      <w:pPr/>
+      <w:r>
+        <w:rPr>
+          <w:b/>
+        </w:rPr>
+        <w:t xml:space="preserve">7. </w:t>
+      </w:r>
+      <w:r>
+        <w:rPr>
+          <w:i w:val="0"/>
+        </w:rPr>
+        <w:t>16 K.</w:t>
+      </w:r>
+    </w:p>
+    <w:p>
       <w:pPr>
         <w:pStyle w:val="Heading2"/>
       </w:pPr>
@@ -11089,6 +12166,21 @@
       </w:r>
     </w:p>
     <w:p>
+      <w:pPr/>
+      <w:r>
+        <w:rPr>
+          <w:b/>
+        </w:rPr>
+        <w:t xml:space="preserve">7. </w:t>
+      </w:r>
+      <w:r>
+        <w:rPr>
+          <w:i w:val="0"/>
+        </w:rPr>
+        <w:t>94 − 32 = 62 dB.</w:t>
+      </w:r>
+    </w:p>
+    <w:p>
       <w:pPr>
         <w:pStyle w:val="Heading2"/>
       </w:pPr>
@@ -11190,6 +12282,21 @@
       </w:r>
     </w:p>
     <w:p>
+      <w:pPr/>
+      <w:r>
+        <w:rPr>
+          <w:b/>
+        </w:rPr>
+        <w:t xml:space="preserve">7. </w:t>
+      </w:r>
+      <w:r>
+        <w:rPr>
+          <w:i w:val="0"/>
+        </w:rPr>
+        <w:t>1.6 × 10¹³ × 1.5 × 10⁻¹² = 24 W.</w:t>
+      </w:r>
+    </w:p>
+    <w:p>
       <w:pPr>
         <w:pStyle w:val="Heading2"/>
       </w:pPr>
@@ -11291,6 +12398,21 @@
       </w:r>
     </w:p>
     <w:p>
+      <w:pPr/>
+      <w:r>
+        <w:rPr>
+          <w:b/>
+        </w:rPr>
+        <w:t xml:space="preserve">7. </w:t>
+      </w:r>
+      <w:r>
+        <w:rPr>
+          <w:i w:val="0"/>
+        </w:rPr>
+        <w:t>72.4 °C.</w:t>
+      </w:r>
+    </w:p>
+    <w:p>
       <w:pPr>
         <w:pStyle w:val="Heading2"/>
       </w:pPr>
@@ -11389,6 +12511,21 @@
           <w:i w:val="0"/>
         </w:rPr>
         <w:t>The underfill bonds the die to the substrate so that the two bend together under temperature change instead of shearing the bumps, reducing the cyclic strain on each joint.</w:t>
+      </w:r>
+    </w:p>
+    <w:p>
+      <w:pPr/>
+      <w:r>
+        <w:rPr>
+          <w:b/>
+        </w:rPr>
+        <w:t xml:space="preserve">7. </w:t>
+      </w:r>
+      <w:r>
+        <w:rPr>
+          <w:i w:val="0"/>
+        </w:rPr>
+        <w:t>72 hours at 30 °C and 60 % RH.</w:t>
       </w:r>
     </w:p>
     <w:p>

</xml_diff>

<commit_message>
EE Book 7 expansion, chapters 11-20: new section, worked example, problem, and closing bridge each
</commit_message>
<xml_diff>
--- a/EE - Series/Packaging_Layout_EMC_and_Test_Book7.docx
+++ b/EE - Series/Packaging_Layout_EMC_and_Test_Book7.docx
@@ -4942,6 +4942,87 @@
         <w:rPr>
           <w:i w:val="0"/>
         </w:rPr>
+        <w:t>11.5 Anti-resonance between capacitor values</w:t>
+      </w:r>
+    </w:p>
+    <w:p>
+      <w:pPr/>
+      <w:r>
+        <w:rPr>
+          <w:i w:val="0"/>
+        </w:rPr>
+        <w:t>Every real capacitor is a series RLC circuit: below its self-resonant frequency it behaves as a capacitor, above it as an inductor set by its mounted inductance. Placing two different values in parallel creates a problem between their self-resonances. There the large capacitor already looks inductive and the small one still capacitive, and an inductance in parallel with a capacitance forms a parallel resonance, an anti-resonant peak in the impedance that can exceed the target impedance of Chapter 3 by a large factor. The peak's height is set by the capacitors' ESR, which is why low-ESR ceramics make it worse. Designers either use many capacitors of the same value, so their resonances coincide, choose values closely spaced so the peaks are shallow, or deliberately include a few higher-ESR parts to damp the network.</w:t>
+      </w:r>
+    </w:p>
+    <w:p>
+      <w:pPr>
+        <w:jc w:val="center"/>
+      </w:pPr>
+      <w:r>
+        <w:rPr>
+          <w:i w:val="0"/>
+        </w:rPr>
+        <w:t>f_SRF = 1 / (2π √(L_mount C))</w:t>
+      </w:r>
+    </w:p>
+    <w:p>
+      <w:pPr>
+        <w:pStyle w:val="Heading2"/>
+      </w:pPr>
+      <w:r>
+        <w:rPr>
+          <w:i w:val="0"/>
+        </w:rPr>
+        <w:t>Worked Example 11.3</w:t>
+      </w:r>
+    </w:p>
+    <w:p>
+      <w:pPr/>
+      <w:r>
+        <w:rPr>
+          <w:b/>
+        </w:rPr>
+        <w:t xml:space="preserve">Problem. </w:t>
+      </w:r>
+      <w:r>
+        <w:rPr>
+          <w:i w:val="0"/>
+        </w:rPr>
+        <w:t>A board uses 10 µF capacitors with 1 nH of mounted inductance and 100 nF capacitors with 0.5 nH. Find each self-resonant frequency, and the region where an anti-resonance can appear.</w:t>
+      </w:r>
+    </w:p>
+    <w:p>
+      <w:pPr/>
+      <w:r>
+        <w:rPr>
+          <w:b/>
+        </w:rPr>
+        <w:t xml:space="preserve">Solution. </w:t>
+      </w:r>
+      <w:r>
+        <w:rPr>
+          <w:i w:val="0"/>
+        </w:rPr>
+        <w:t>The 10 µF part resonates at 1/(2π√(10⁻⁹ × 10⁻⁵)) = 1.59 MHz and the 100 nF part at 1/(2π√(0.5 × 10⁻⁹ × 10⁻⁷)) = 22.5 MHz. Between them, roughly 2 to 20 MHz, the 10 µF bank is inductive and the 100 nF bank capacitive, and their parallel resonance sits where the two reactances are equal. A simulation of the full network with the real ESR values shows whether the peak breaks the target; if it does, more 100 nF parts, or an intermediate 1 µF value, fill the gap.</w:t>
+      </w:r>
+    </w:p>
+    <w:p>
+      <w:pPr/>
+      <w:r>
+        <w:rPr>
+          <w:i w:val="0"/>
+        </w:rPr>
+        <w:t>Decoupling keeps the supply quiet; the stack-up of Chapter 12 decides how close those capacitors, planes, and signals can sit to each other.</w:t>
+      </w:r>
+    </w:p>
+    <w:p>
+      <w:pPr>
+        <w:pStyle w:val="Heading2"/>
+      </w:pPr>
+      <w:r>
+        <w:rPr>
+          <w:i w:val="0"/>
+        </w:rPr>
         <w:t>Practice</w:t>
       </w:r>
     </w:p>
@@ -5036,6 +5117,21 @@
       </w:r>
     </w:p>
     <w:p>
+      <w:pPr/>
+      <w:r>
+        <w:rPr>
+          <w:b/>
+        </w:rPr>
+        <w:t xml:space="preserve">7. </w:t>
+      </w:r>
+      <w:r>
+        <w:rPr>
+          <w:i w:val="0"/>
+        </w:rPr>
+        <w:t>Find the self-resonant frequency of a 1 µF capacitor with 0.7 nH of mounted inductance.</w:t>
+      </w:r>
+    </w:p>
+    <w:p>
       <w:pPr>
         <w:pStyle w:val="Heading1"/>
       </w:pPr>
@@ -5230,6 +5326,87 @@
         <w:rPr>
           <w:i w:val="0"/>
         </w:rPr>
+        <w:t>12.6 Estimating impedance before the field solver</w:t>
+      </w:r>
+    </w:p>
+    <w:p>
+      <w:pPr/>
+      <w:r>
+        <w:rPr>
+          <w:i w:val="0"/>
+        </w:rPr>
+        <w:t>A field solver gives the final impedance of a trace, but a closed-form estimate shows the sensitivities. The classic IPC-2141 approximation for a surface microstrip of width w and thickness t over a dielectric of height h and permittivity εr is 87/√(εr + 1.41) × ln[5.98h/(0.8w + t)] ohms, adequate to a few percent for typical geometries. It shows that the impedance depends on the logarithm of h/w, so a 10 % change in dielectric height moves it by only a few ohms, while εr enters through a square root. Fabricators control impedance to ±10 % routinely and ±5 % at extra cost, by adjusting the trace width on a test coupon at the panel edge, which they measure with a TDR, Chapter 20, before shipping the boards.</w:t>
+      </w:r>
+    </w:p>
+    <w:p>
+      <w:pPr>
+        <w:jc w:val="center"/>
+      </w:pPr>
+      <w:r>
+        <w:rPr>
+          <w:i w:val="0"/>
+        </w:rPr>
+        <w:t>Z₀ ≈ 87/√(εr + 1.41) × ln[5.98 h / (0.8 w + t)]</w:t>
+      </w:r>
+    </w:p>
+    <w:p>
+      <w:pPr>
+        <w:pStyle w:val="Heading2"/>
+      </w:pPr>
+      <w:r>
+        <w:rPr>
+          <w:i w:val="0"/>
+        </w:rPr>
+        <w:t>Worked Example 12.2</w:t>
+      </w:r>
+    </w:p>
+    <w:p>
+      <w:pPr/>
+      <w:r>
+        <w:rPr>
+          <w:b/>
+        </w:rPr>
+        <w:t xml:space="preserve">Problem. </w:t>
+      </w:r>
+      <w:r>
+        <w:rPr>
+          <w:i w:val="0"/>
+        </w:rPr>
+        <w:t>A microstrip has w = 0.18 mm, t = 0.035 mm, h = 0.10 mm, and εr = 3.5. Estimate its impedance, and the change if h grows by 10 %.</w:t>
+      </w:r>
+    </w:p>
+    <w:p>
+      <w:pPr/>
+      <w:r>
+        <w:rPr>
+          <w:b/>
+        </w:rPr>
+        <w:t xml:space="preserve">Solution. </w:t>
+      </w:r>
+      <w:r>
+        <w:rPr>
+          <w:i w:val="0"/>
+        </w:rPr>
+        <w:t>87/√4.91 = 39.3, and 5.98 × 0.10/(0.144 + 0.035) = 3.34, whose logarithm is 1.206, so Z₀ ≈ 47.4 Ω. With h = 0.11 mm, the logarithm becomes 1.302 and Z₀ = 51.1 Ω, a rise of 3.7 Ω for a 10 % change in height, which is why fabricators tune width rather than height to hit the target.</w:t>
+      </w:r>
+    </w:p>
+    <w:p>
+      <w:pPr/>
+      <w:r>
+        <w:rPr>
+          <w:i w:val="0"/>
+        </w:rPr>
+        <w:t>The stack-up places conductors close to each other on purpose. Chapter 13 measures what happens when they are too close: crosstalk.</w:t>
+      </w:r>
+    </w:p>
+    <w:p>
+      <w:pPr>
+        <w:pStyle w:val="Heading2"/>
+      </w:pPr>
+      <w:r>
+        <w:rPr>
+          <w:i w:val="0"/>
+        </w:rPr>
         <w:t>Practice</w:t>
       </w:r>
     </w:p>
@@ -5324,6 +5501,21 @@
       </w:r>
     </w:p>
     <w:p>
+      <w:pPr/>
+      <w:r>
+        <w:rPr>
+          <w:b/>
+        </w:rPr>
+        <w:t xml:space="preserve">7. </w:t>
+      </w:r>
+      <w:r>
+        <w:rPr>
+          <w:i w:val="0"/>
+        </w:rPr>
+        <w:t>By roughly how many ohms does the impedance of Worked Example 12.2 change if εr falls to 3.0?</w:t>
+      </w:r>
+    </w:p>
+    <w:p>
       <w:pPr>
         <w:pStyle w:val="Heading1"/>
       </w:pPr>
@@ -5570,6 +5762,87 @@
         <w:rPr>
           <w:i w:val="0"/>
         </w:rPr>
+        <w:t>13.6 How crosstalk falls with spacing</w:t>
+      </w:r>
+    </w:p>
+    <w:p>
+      <w:pPr/>
+      <w:r>
+        <w:rPr>
+          <w:i w:val="0"/>
+        </w:rPr>
+        <w:t>The coupling between two traces over a plane falls quickly as they move apart, because the fields of a trace over a plane are concentrated between the trace and the plane. A useful approximation for both microstrip and stripline makes the coupled noise proportional to 1/[1 + (s/h)²], where s is the center-to-center spacing and h the height above the reference plane. The rule of thumb that spaces traces three times their width apart is an expression of this: tripling s/h from 1 to 3 cuts the coupling by a factor of five. The same formula shows the alternative, often cheaper: halving the height to the plane, by a thinner dielectric, quarters the coupling at large spacings without using any more routing area.</w:t>
+      </w:r>
+    </w:p>
+    <w:p>
+      <w:pPr>
+        <w:jc w:val="center"/>
+      </w:pPr>
+      <w:r>
+        <w:rPr>
+          <w:i w:val="0"/>
+        </w:rPr>
+        <w:t>crosstalk ∝ 1 / [1 + (s/h)²]</w:t>
+      </w:r>
+    </w:p>
+    <w:p>
+      <w:pPr>
+        <w:pStyle w:val="Heading2"/>
+      </w:pPr>
+      <w:r>
+        <w:rPr>
+          <w:i w:val="0"/>
+        </w:rPr>
+        <w:t>Worked Example 13.3</w:t>
+      </w:r>
+    </w:p>
+    <w:p>
+      <w:pPr/>
+      <w:r>
+        <w:rPr>
+          <w:b/>
+        </w:rPr>
+        <w:t xml:space="preserve">Problem. </w:t>
+      </w:r>
+      <w:r>
+        <w:rPr>
+          <w:i w:val="0"/>
+        </w:rPr>
+        <w:t>Two traces 0.1 mm above their plane have 4 % near-end crosstalk at a center spacing of 0.1 mm. Estimate the crosstalk at 0.3 mm spacing, and at 0.1 mm spacing with the plane 0.05 mm below.</w:t>
+      </w:r>
+    </w:p>
+    <w:p>
+      <w:pPr/>
+      <w:r>
+        <w:rPr>
+          <w:b/>
+        </w:rPr>
+        <w:t xml:space="preserve">Solution. </w:t>
+      </w:r>
+      <w:r>
+        <w:rPr>
+          <w:i w:val="0"/>
+        </w:rPr>
+        <w:t>At s/h = 1 the factor is 1/2; at s/h = 3, 1/10, so the crosstalk falls to 4 % × (1/10)/(1/2) = 0.8 %. With h = 0.05 mm at 0.1 mm spacing, s/h = 2 and the factor is 1/5, giving 1.6 %: thinning the dielectric gains a factor of 2.5 without moving the traces.</w:t>
+      </w:r>
+    </w:p>
+    <w:p>
+      <w:pPr/>
+      <w:r>
+        <w:rPr>
+          <w:i w:val="0"/>
+        </w:rPr>
+        <w:t>Crosstalk is one way a channel loses margin. Loss, equalization, and the resulting eye, Chapter 14, are the others.</w:t>
+      </w:r>
+    </w:p>
+    <w:p>
+      <w:pPr>
+        <w:pStyle w:val="Heading2"/>
+      </w:pPr>
+      <w:r>
+        <w:rPr>
+          <w:i w:val="0"/>
+        </w:rPr>
         <w:t>Practice</w:t>
       </w:r>
     </w:p>
@@ -5664,6 +5937,21 @@
       </w:r>
     </w:p>
     <w:p>
+      <w:pPr/>
+      <w:r>
+        <w:rPr>
+          <w:b/>
+        </w:rPr>
+        <w:t xml:space="preserve">7. </w:t>
+      </w:r>
+      <w:r>
+        <w:rPr>
+          <w:i w:val="0"/>
+        </w:rPr>
+        <w:t>By what factor does the crosstalk fall when s/h rises from 2 to 4?</w:t>
+      </w:r>
+    </w:p>
+    <w:p>
       <w:pPr>
         <w:pStyle w:val="Heading1"/>
       </w:pPr>
@@ -5920,6 +6208,87 @@
         <w:rPr>
           <w:i w:val="0"/>
         </w:rPr>
+        <w:t>14.5 Channel operating margin</w:t>
+      </w:r>
+    </w:p>
+    <w:p>
+      <w:pPr/>
+      <w:r>
+        <w:rPr>
+          <w:i w:val="0"/>
+        </w:rPr>
+        <w:t>An eye diagram is an intuitive picture but a poor specification, because it depends on how long the simulation ran and which patterns it saw. The IEEE 802.3 standards for 100 and 200 Gbit/s per lane therefore define channel compliance by a single number, the channel operating margin, COM. A reference transmitter, receiver, and equalizer are applied to the channel's measured S-parameters; the tool computes the signal amplitude at the decision point and the statistical distribution of every impairment, residual intersymbol interference, crosstalk, jitter, and noise, at the target error rate, and reports their ratio in decibels. A channel passes if COM is at least 3 dB. Because the reference equalizer is fixed, COM measures the channel, not the cleverness of a particular SerDes, and both board designers and silicon vendors can test against it independently.</w:t>
+      </w:r>
+    </w:p>
+    <w:p>
+      <w:pPr>
+        <w:jc w:val="center"/>
+      </w:pPr>
+      <w:r>
+        <w:rPr>
+          <w:i w:val="0"/>
+        </w:rPr>
+        <w:t>COM = 20 log₁₀(A_signal / A_noise)   ≥ 3 dB</w:t>
+      </w:r>
+    </w:p>
+    <w:p>
+      <w:pPr>
+        <w:pStyle w:val="Heading2"/>
+      </w:pPr>
+      <w:r>
+        <w:rPr>
+          <w:i w:val="0"/>
+        </w:rPr>
+        <w:t>Worked Example 14.4</w:t>
+      </w:r>
+    </w:p>
+    <w:p>
+      <w:pPr/>
+      <w:r>
+        <w:rPr>
+          <w:b/>
+        </w:rPr>
+        <w:t xml:space="preserve">Problem. </w:t>
+      </w:r>
+      <w:r>
+        <w:rPr>
+          <w:i w:val="0"/>
+        </w:rPr>
+        <w:t>A channel's computed signal amplitude at the slicer is 30 mV and the combined noise and interference amplitude at the target error rate is 20 mV. Find COM, and say whether the channel passes.</w:t>
+      </w:r>
+    </w:p>
+    <w:p>
+      <w:pPr/>
+      <w:r>
+        <w:rPr>
+          <w:b/>
+        </w:rPr>
+        <w:t xml:space="preserve">Solution. </w:t>
+      </w:r>
+      <w:r>
+        <w:rPr>
+          <w:i w:val="0"/>
+        </w:rPr>
+        <w:t>COM = 20 log₁₀(30/20) = 3.5 dB, a pass with 0.5 dB to spare. Shortening the backplane's longest trace by an inch or moving to a lower-loss laminate are the usual ways to buy more.</w:t>
+      </w:r>
+    </w:p>
+    <w:p>
+      <w:pPr/>
+      <w:r>
+        <w:rPr>
+          <w:i w:val="0"/>
+        </w:rPr>
+        <w:t>Electrical channels lose more per inch at every generation. Chapter 15 asks when light should replace them.</w:t>
+      </w:r>
+    </w:p>
+    <w:p>
+      <w:pPr>
+        <w:pStyle w:val="Heading2"/>
+      </w:pPr>
+      <w:r>
+        <w:rPr>
+          <w:i w:val="0"/>
+        </w:rPr>
         <w:t>Practice</w:t>
       </w:r>
     </w:p>
@@ -6014,6 +6383,21 @@
       </w:r>
     </w:p>
     <w:p>
+      <w:pPr/>
+      <w:r>
+        <w:rPr>
+          <w:b/>
+        </w:rPr>
+        <w:t xml:space="preserve">7. </w:t>
+      </w:r>
+      <w:r>
+        <w:rPr>
+          <w:i w:val="0"/>
+        </w:rPr>
+        <w:t>What signal-to-noise amplitude ratio corresponds to a COM of exactly 3 dB?</w:t>
+      </w:r>
+    </w:p>
+    <w:p>
       <w:pPr>
         <w:pStyle w:val="Heading1"/>
       </w:pPr>
@@ -6240,6 +6624,76 @@
         <w:rPr>
           <w:i w:val="0"/>
         </w:rPr>
+        <w:t>15.5 Why co-packaged optics saves power</w:t>
+      </w:r>
+    </w:p>
+    <w:p>
+      <w:pPr/>
+      <w:r>
+        <w:rPr>
+          <w:i w:val="0"/>
+        </w:rPr>
+        <w:t>A pluggable optical module sits at the front panel, and the switch chip must drive each lane across 20 to 30 cm of board to reach it, through a long-reach SerDes with heavy equalization and often a retimer in the module. Co-packaged optics moves the optical engine onto the switch package, so the electrical path shrinks to millimeters and the SerDes can be a simple short-reach link. Published system figures put pluggable modules with their host SerDes at roughly 15 pJ per bit in 2026 and co-packaged designs near 5 pJ/bit. At the 51.2 and 102.4 Tbit/s of current switch chips, that difference is hundreds of watts per switch. The obstacles are serviceability, since a failed laser can no longer be swapped from the front panel, which is why designs keep the lasers in a replaceable external light source, and the thermal coupling of temperature-sensitive optics to a hot switch die.</w:t>
+      </w:r>
+    </w:p>
+    <w:p>
+      <w:pPr>
+        <w:pStyle w:val="Heading2"/>
+      </w:pPr>
+      <w:r>
+        <w:rPr>
+          <w:i w:val="0"/>
+        </w:rPr>
+        <w:t>Worked Example 15.3</w:t>
+      </w:r>
+    </w:p>
+    <w:p>
+      <w:pPr/>
+      <w:r>
+        <w:rPr>
+          <w:b/>
+        </w:rPr>
+        <w:t xml:space="preserve">Problem. </w:t>
+      </w:r>
+      <w:r>
+        <w:rPr>
+          <w:i w:val="0"/>
+        </w:rPr>
+        <w:t>A 51.2 Tbit/s switch uses optical I/O at 15 pJ/bit with pluggables or 5 pJ/bit with co-packaged optics. Find the I/O power in each case and the saving across 1000 switches.</w:t>
+      </w:r>
+    </w:p>
+    <w:p>
+      <w:pPr/>
+      <w:r>
+        <w:rPr>
+          <w:b/>
+        </w:rPr>
+        <w:t xml:space="preserve">Solution. </w:t>
+      </w:r>
+      <w:r>
+        <w:rPr>
+          <w:i w:val="0"/>
+        </w:rPr>
+        <w:t>51.2 × 10¹² × 15 × 10⁻¹² = 768 W with pluggables; 256 W co-packaged. The 512 W saved per switch is 512 kW across 1000 switches, before cooling, about a megawatt-scale saving in a large AI cluster.</w:t>
+      </w:r>
+    </w:p>
+    <w:p>
+      <w:pPr/>
+      <w:r>
+        <w:rPr>
+          <w:i w:val="0"/>
+        </w:rPr>
+        <w:t>Optics carries the bits between packages. Chapter 16 returns to sensors, with the motion sensors that let a device know where it is.</w:t>
+      </w:r>
+    </w:p>
+    <w:p>
+      <w:pPr>
+        <w:pStyle w:val="Heading2"/>
+      </w:pPr>
+      <w:r>
+        <w:rPr>
+          <w:i w:val="0"/>
+        </w:rPr>
         <w:t>Practice</w:t>
       </w:r>
     </w:p>
@@ -6334,6 +6788,21 @@
       </w:r>
     </w:p>
     <w:p>
+      <w:pPr/>
+      <w:r>
+        <w:rPr>
+          <w:b/>
+        </w:rPr>
+        <w:t xml:space="preserve">7. </w:t>
+      </w:r>
+      <w:r>
+        <w:rPr>
+          <w:i w:val="0"/>
+        </w:rPr>
+        <w:t>What I/O power does a 102.4 Tbit/s switch need at 5 pJ/bit?</w:t>
+      </w:r>
+    </w:p>
+    <w:p>
       <w:pPr>
         <w:pStyle w:val="Heading1"/>
       </w:pPr>
@@ -6560,6 +7029,87 @@
         <w:rPr>
           <w:i w:val="0"/>
         </w:rPr>
+        <w:t>16.5 How fast dead reckoning drifts</w:t>
+      </w:r>
+    </w:p>
+    <w:p>
+      <w:pPr/>
+      <w:r>
+        <w:rPr>
+          <w:i w:val="0"/>
+        </w:rPr>
+        <w:t>Dead reckoning integrates the IMU's outputs to obtain velocity, position, and orientation, and integration turns small constant errors into growing ones. An accelerometer bias b, once the gravity vector has been subtracted, integrates twice into a position error of ½bt², growing with the square of time. A gyroscope bias integrates once into an attitude error, and an attitude error of θ misprojects gravity into a false horizontal acceleration of gθ, which then integrates twice again, so gyro errors grow position error with the cube of time. This is why consumer IMUs alone can hold position only for seconds, why navigation-grade units cost tens of thousands of dollars, and why every practical system fuses the IMU with GNSS, wheel odometry, vision, or the known constraints of walking, as Section 16.3 describes.</w:t>
+      </w:r>
+    </w:p>
+    <w:p>
+      <w:pPr>
+        <w:jc w:val="center"/>
+      </w:pPr>
+      <w:r>
+        <w:rPr>
+          <w:i w:val="0"/>
+        </w:rPr>
+        <w:t>position error ≈ ½ b t²</w:t>
+      </w:r>
+    </w:p>
+    <w:p>
+      <w:pPr>
+        <w:pStyle w:val="Heading2"/>
+      </w:pPr>
+      <w:r>
+        <w:rPr>
+          <w:i w:val="0"/>
+        </w:rPr>
+        <w:t>Worked Example 16.3</w:t>
+      </w:r>
+    </w:p>
+    <w:p>
+      <w:pPr/>
+      <w:r>
+        <w:rPr>
+          <w:b/>
+        </w:rPr>
+        <w:t xml:space="preserve">Problem. </w:t>
+      </w:r>
+      <w:r>
+        <w:rPr>
+          <w:i w:val="0"/>
+        </w:rPr>
+        <w:t>An accelerometer has a residual bias of 1 mg after calibration. Find the position error after 10 s and after 60 s of unaided dead reckoning.</w:t>
+      </w:r>
+    </w:p>
+    <w:p>
+      <w:pPr/>
+      <w:r>
+        <w:rPr>
+          <w:b/>
+        </w:rPr>
+        <w:t xml:space="preserve">Solution. </w:t>
+      </w:r>
+      <w:r>
+        <w:rPr>
+          <w:i w:val="0"/>
+        </w:rPr>
+        <w:t>b = 9.81 × 10⁻³ m/s². After 10 s, ½ × 9.81 × 10⁻³ × 100 = 0.49 m; after 60 s, ½ × 9.81 × 10⁻³ × 3600 = 17.7 m. A pedestrian navigator therefore resets the velocity to zero at every footstep, when the foot is still, which turns the quadratic growth into a much slower one.</w:t>
+      </w:r>
+    </w:p>
+    <w:p>
+      <w:pPr/>
+      <w:r>
+        <w:rPr>
+          <w:i w:val="0"/>
+        </w:rPr>
+        <w:t>Motion sensors, like every chip in this book, depend on their package. Chapter 17 opens the most demanding package of all, the high-bandwidth memory stack.</w:t>
+      </w:r>
+    </w:p>
+    <w:p>
+      <w:pPr>
+        <w:pStyle w:val="Heading2"/>
+      </w:pPr>
+      <w:r>
+        <w:rPr>
+          <w:i w:val="0"/>
+        </w:rPr>
         <w:t>Practice</w:t>
       </w:r>
     </w:p>
@@ -6654,6 +7204,21 @@
       </w:r>
     </w:p>
     <w:p>
+      <w:pPr/>
+      <w:r>
+        <w:rPr>
+          <w:b/>
+        </w:rPr>
+        <w:t xml:space="preserve">7. </w:t>
+      </w:r>
+      <w:r>
+        <w:rPr>
+          <w:i w:val="0"/>
+        </w:rPr>
+        <w:t>Find the position error after 30 s for a bias of 0.5 mg.</w:t>
+      </w:r>
+    </w:p>
+    <w:p>
       <w:pPr>
         <w:pStyle w:val="Heading1"/>
       </w:pPr>
@@ -6952,6 +7517,76 @@
         <w:rPr>
           <w:i w:val="0"/>
         </w:rPr>
+        <w:t>17.6 Temperature and refresh in the stack</w:t>
+      </w:r>
+    </w:p>
+    <w:p>
+      <w:pPr/>
+      <w:r>
+        <w:rPr>
+          <w:i w:val="0"/>
+        </w:rPr>
+        <w:t>A DRAM cell is a capacitor that leaks, and the leakage roughly doubles for every 10 °C, so cells must be refreshed more often when hot. JEDEC's standard refresh interval of 64 ms, with a refresh command every 7.8 µs, applies up to 85 °C; between 85 and 95 °C the rate doubles, to every 32 ms, and HBM stacks above that need still more. Refresh is not free: during each refresh the affected banks cannot be accessed, and the refresh current adds to the stack's power. An HBM stack sits next to a processor dissipating up to a kilowatt, and its upper dies are the farthest from the cold plate, so the thermal design of Chapter 6 directly sets the memory's usable bandwidth, and HBM controllers read the stack's temperature sensors to adjust the refresh rate dynamically.</w:t>
+      </w:r>
+    </w:p>
+    <w:p>
+      <w:pPr>
+        <w:pStyle w:val="Heading2"/>
+      </w:pPr>
+      <w:r>
+        <w:rPr>
+          <w:i w:val="0"/>
+        </w:rPr>
+        <w:t>Worked Example 17.4</w:t>
+      </w:r>
+    </w:p>
+    <w:p>
+      <w:pPr/>
+      <w:r>
+        <w:rPr>
+          <w:b/>
+        </w:rPr>
+        <w:t xml:space="preserve">Problem. </w:t>
+      </w:r>
+      <w:r>
+        <w:rPr>
+          <w:i w:val="0"/>
+        </w:rPr>
+        <w:t>A memory bank is unavailable for 350 ns per refresh command, and commands come every 7.8 µs at normal temperature. Find the fraction of time lost to refresh, and the fraction when the rate doubles above 85 °C.</w:t>
+      </w:r>
+    </w:p>
+    <w:p>
+      <w:pPr/>
+      <w:r>
+        <w:rPr>
+          <w:b/>
+        </w:rPr>
+        <w:t xml:space="preserve">Solution. </w:t>
+      </w:r>
+      <w:r>
+        <w:rPr>
+          <w:i w:val="0"/>
+        </w:rPr>
+        <w:t>350 ns/7.8 µs = 4.5 % at normal temperature; doubling the rate gives 9.0 %. A hot stack therefore loses almost a tenth of its bank availability to refresh, which, with the extra refresh power, is why HBM cooling matters as much as the processor's.</w:t>
+      </w:r>
+    </w:p>
+    <w:p>
+      <w:pPr/>
+      <w:r>
+        <w:rPr>
+          <w:i w:val="0"/>
+        </w:rPr>
+        <w:t>Memory stacks are the densest packages in a system. Chapter 18 puts something entirely different into the package: an antenna.</w:t>
+      </w:r>
+    </w:p>
+    <w:p>
+      <w:pPr>
+        <w:pStyle w:val="Heading2"/>
+      </w:pPr>
+      <w:r>
+        <w:rPr>
+          <w:i w:val="0"/>
+        </w:rPr>
         <w:t>Practice</w:t>
       </w:r>
     </w:p>
@@ -7046,6 +7681,21 @@
       </w:r>
     </w:p>
     <w:p>
+      <w:pPr/>
+      <w:r>
+        <w:rPr>
+          <w:b/>
+        </w:rPr>
+        <w:t xml:space="preserve">7. </w:t>
+      </w:r>
+      <w:r>
+        <w:rPr>
+          <w:i w:val="0"/>
+        </w:rPr>
+        <w:t>What fraction of time is lost if each refresh blocks a bank for 280 ns every 3.9 µs?</w:t>
+      </w:r>
+    </w:p>
+    <w:p>
       <w:pPr>
         <w:pStyle w:val="Heading1"/>
       </w:pPr>
@@ -7313,6 +7963,87 @@
         <w:rPr>
           <w:i w:val="0"/>
         </w:rPr>
+        <w:t>18.5 Element spacing and the scan range</w:t>
+      </w:r>
+    </w:p>
+    <w:p>
+      <w:pPr/>
+      <w:r>
+        <w:rPr>
+          <w:i w:val="0"/>
+        </w:rPr>
+        <w:t>A phased array steers its beam by setting the phase of each element, and the element spacing decides how far it can steer before a second, unwanted beam, a grating lobe, appears. Book 4 derives the condition; for packaging the consequence is a hard geometric limit. To scan to an angle θmax from broadside without a grating lobe, the spacing must not exceed λ/(1 + sin θmax): half a wavelength allows a full ±90°, and ±60° scanning needs about 0.54 λ. At 28 GHz that is under 6 mm, and at 60 or 140 GHz it is a few millimeters or less, so each element's feed, its RF chain, and its share of the beamformer chip must fit inside that cell. This is the deepest reason millimeter-wave arrays are built in the package rather than on the board.</w:t>
+      </w:r>
+    </w:p>
+    <w:p>
+      <w:pPr>
+        <w:jc w:val="center"/>
+      </w:pPr>
+      <w:r>
+        <w:rPr>
+          <w:i w:val="0"/>
+        </w:rPr>
+        <w:t>d ≤ λ / (1 + sin θmax)</w:t>
+      </w:r>
+    </w:p>
+    <w:p>
+      <w:pPr>
+        <w:pStyle w:val="Heading2"/>
+      </w:pPr>
+      <w:r>
+        <w:rPr>
+          <w:i w:val="0"/>
+        </w:rPr>
+        <w:t>Worked Example 18.4</w:t>
+      </w:r>
+    </w:p>
+    <w:p>
+      <w:pPr/>
+      <w:r>
+        <w:rPr>
+          <w:b/>
+        </w:rPr>
+        <w:t xml:space="preserve">Problem. </w:t>
+      </w:r>
+      <w:r>
+        <w:rPr>
+          <w:i w:val="0"/>
+        </w:rPr>
+        <w:t>Find the largest element spacing for a 28 GHz array that must scan ±60° without grating lobes, and the area per element.</w:t>
+      </w:r>
+    </w:p>
+    <w:p>
+      <w:pPr/>
+      <w:r>
+        <w:rPr>
+          <w:b/>
+        </w:rPr>
+        <w:t xml:space="preserve">Solution. </w:t>
+      </w:r>
+      <w:r>
+        <w:rPr>
+          <w:i w:val="0"/>
+        </w:rPr>
+        <w:t>λ = 3 × 10⁸/28 × 10⁹ = 10.7 mm, so d ≤ 10.7/(1 + 0.866) = 5.74 mm and each element owns at most 33 mm². A beamformer chip serving four elements must route four RF feeds within 132 mm² of package, which is why such chips sit directly beneath their antennas.</w:t>
+      </w:r>
+    </w:p>
+    <w:p>
+      <w:pPr/>
+      <w:r>
+        <w:rPr>
+          <w:i w:val="0"/>
+        </w:rPr>
+        <w:t>An antenna in the package adds radiation to the package's duties. Chapter 19 adds the one duty every product shares: being built and tested in volume.</w:t>
+      </w:r>
+    </w:p>
+    <w:p>
+      <w:pPr>
+        <w:pStyle w:val="Heading2"/>
+      </w:pPr>
+      <w:r>
+        <w:rPr>
+          <w:i w:val="0"/>
+        </w:rPr>
         <w:t>Practice</w:t>
       </w:r>
     </w:p>
@@ -7407,6 +8138,21 @@
       </w:r>
     </w:p>
     <w:p>
+      <w:pPr/>
+      <w:r>
+        <w:rPr>
+          <w:b/>
+        </w:rPr>
+        <w:t xml:space="preserve">7. </w:t>
+      </w:r>
+      <w:r>
+        <w:rPr>
+          <w:i w:val="0"/>
+        </w:rPr>
+        <w:t>Find the largest spacing for ±45° scanning at 60 GHz.</w:t>
+      </w:r>
+    </w:p>
+    <w:p>
       <w:pPr>
         <w:pStyle w:val="Heading1"/>
       </w:pPr>
@@ -7685,6 +8431,87 @@
         <w:rPr>
           <w:i w:val="0"/>
         </w:rPr>
+        <w:t>19.5 Stencils and the area ratio</w:t>
+      </w:r>
+    </w:p>
+    <w:p>
+      <w:pPr/>
+      <w:r>
+        <w:rPr>
+          <w:i w:val="0"/>
+        </w:rPr>
+        <w:t>Most surface-mount defects start at the solder-paste printer. Paste is pushed through apertures in a thin steel stencil, and it releases onto the pad only if the pad pulls it out of the aperture more strongly than the aperture walls hold it. IPC-7525 expresses this as the area ratio, the pad-side opening area divided by the area of the aperture walls; for a circular aperture of diameter D in a foil of thickness T it is D/(4T). Ratios of 0.66 or more release reliably; below about 0.5, paste stays in the stencil and joints are starved. Fine-pitch BGAs and 0201 or 01005 passives therefore push stencils thinner, to 100 µm or less, which then gives too little paste for large connectors, a conflict solved with step stencils of two thicknesses or with laser-cut apertures and nanocoated walls.</w:t>
+      </w:r>
+    </w:p>
+    <w:p>
+      <w:pPr>
+        <w:jc w:val="center"/>
+      </w:pPr>
+      <w:r>
+        <w:rPr>
+          <w:i w:val="0"/>
+        </w:rPr>
+        <w:t>area ratio = D / (4T)   (circular aperture)</w:t>
+      </w:r>
+    </w:p>
+    <w:p>
+      <w:pPr>
+        <w:pStyle w:val="Heading2"/>
+      </w:pPr>
+      <w:r>
+        <w:rPr>
+          <w:i w:val="0"/>
+        </w:rPr>
+        <w:t>Worked Example 19.4</w:t>
+      </w:r>
+    </w:p>
+    <w:p>
+      <w:pPr/>
+      <w:r>
+        <w:rPr>
+          <w:b/>
+        </w:rPr>
+        <w:t xml:space="preserve">Problem. </w:t>
+      </w:r>
+      <w:r>
+        <w:rPr>
+          <w:i w:val="0"/>
+        </w:rPr>
+        <w:t>A 0.4 mm-pitch BGA uses 0.25 mm circular apertures. Find the area ratio for a 125 µm and a 100 µm stencil.</w:t>
+      </w:r>
+    </w:p>
+    <w:p>
+      <w:pPr/>
+      <w:r>
+        <w:rPr>
+          <w:b/>
+        </w:rPr>
+        <w:t xml:space="preserve">Solution. </w:t>
+      </w:r>
+      <w:r>
+        <w:rPr>
+          <w:i w:val="0"/>
+        </w:rPr>
+        <w:t>At 125 µm, 0.25/(4 × 0.125) = 0.50, marginal; at 100 µm, 0.25/0.40 = 0.625, close to the 0.66 guideline. The design would use a 100 µm stencil, possibly stepped up to 150 µm around large connectors that need more paste.</w:t>
+      </w:r>
+    </w:p>
+    <w:p>
+      <w:pPr/>
+      <w:r>
+        <w:rPr>
+          <w:i w:val="0"/>
+        </w:rPr>
+        <w:t>Assembly and test complete the product's journey through the factory. Chapter 20 turns to measuring what was built, starting with the interconnect itself.</w:t>
+      </w:r>
+    </w:p>
+    <w:p>
+      <w:pPr>
+        <w:pStyle w:val="Heading2"/>
+      </w:pPr>
+      <w:r>
+        <w:rPr>
+          <w:i w:val="0"/>
+        </w:rPr>
         <w:t>Practice</w:t>
       </w:r>
     </w:p>
@@ -7779,6 +8606,21 @@
       </w:r>
     </w:p>
     <w:p>
+      <w:pPr/>
+      <w:r>
+        <w:rPr>
+          <w:b/>
+        </w:rPr>
+        <w:t xml:space="preserve">7. </w:t>
+      </w:r>
+      <w:r>
+        <w:rPr>
+          <w:i w:val="0"/>
+        </w:rPr>
+        <w:t>What aperture diameter gives an area ratio of 0.66 in a 100 µm stencil?</w:t>
+      </w:r>
+    </w:p>
+    <w:p>
       <w:pPr>
         <w:pStyle w:val="Heading1"/>
       </w:pPr>
@@ -8005,6 +8847,87 @@
         <w:rPr>
           <w:i w:val="0"/>
         </w:rPr>
+        <w:t>20.5 Reading S-parameters: insertion loss, return loss, and sanity checks</w:t>
+      </w:r>
+    </w:p>
+    <w:p>
+      <w:pPr/>
+      <w:r>
+        <w:rPr>
+          <w:i w:val="0"/>
+        </w:rPr>
+        <w:t>A two-port measurement produces four complex S-parameters at every frequency, and two of them answer most questions. S21 in decibels is the insertion loss, the fraction of incident power that reaches the far end: −3 dB is half the power, −20 dB a hundredth. S11 is the return loss, the fraction reflected: −20 dB means 1 % of the power, a reflection coefficient of 0.1, which for a 50 Ω system corresponds to an impedance within about ±20 % of 50 Ω. Before trusting a file, engineers check passivity, that no frequency shows more power out than in, |S11|² + |S21|² ≤ 1, and causality, that the time-domain response does not begin before the signal arrives. Files that fail either check usually come from calibration errors or too coarse a frequency step, and they make channel simulators produce nonsense.</w:t>
+      </w:r>
+    </w:p>
+    <w:p>
+      <w:pPr>
+        <w:jc w:val="center"/>
+      </w:pPr>
+      <w:r>
+        <w:rPr>
+          <w:i w:val="0"/>
+        </w:rPr>
+        <w:t>|S11|² + |S21|² ≤ 1   (passive, lossless at equality)</w:t>
+      </w:r>
+    </w:p>
+    <w:p>
+      <w:pPr>
+        <w:pStyle w:val="Heading2"/>
+      </w:pPr>
+      <w:r>
+        <w:rPr>
+          <w:i w:val="0"/>
+        </w:rPr>
+        <w:t>Worked Example 20.3</w:t>
+      </w:r>
+    </w:p>
+    <w:p>
+      <w:pPr/>
+      <w:r>
+        <w:rPr>
+          <w:b/>
+        </w:rPr>
+        <w:t xml:space="preserve">Problem. </w:t>
+      </w:r>
+      <w:r>
+        <w:rPr>
+          <w:i w:val="0"/>
+        </w:rPr>
+        <w:t>A channel shows S21 = −18 dB and S11 = −12 dB at 26.6 GHz. Find the fractions of power transmitted and reflected, and the fraction lost in the channel.</w:t>
+      </w:r>
+    </w:p>
+    <w:p>
+      <w:pPr/>
+      <w:r>
+        <w:rPr>
+          <w:b/>
+        </w:rPr>
+        <w:t xml:space="preserve">Solution. </w:t>
+      </w:r>
+      <w:r>
+        <w:rPr>
+          <w:i w:val="0"/>
+        </w:rPr>
+        <w:t>Transmitted: 10^(−1.8) = 0.016; reflected: 10^(−1.2) = 0.063. Their sum is 0.079, so 92 % of the incident power is dissipated or radiated in the channel. The −12 dB return loss is poor; a reflection coefficient of 0.25 suggests a via or connector discontinuity that the TDR of Section 20.1 can locate.</w:t>
+      </w:r>
+    </w:p>
+    <w:p>
+      <w:pPr/>
+      <w:r>
+        <w:rPr>
+          <w:i w:val="0"/>
+        </w:rPr>
+        <w:t>Measurement closes Part I's tour of packages and boards. Part II asks how those boards radiate, and how the laboratories that certify them measure it.</w:t>
+      </w:r>
+    </w:p>
+    <w:p>
+      <w:pPr>
+        <w:pStyle w:val="Heading2"/>
+      </w:pPr>
+      <w:r>
+        <w:rPr>
+          <w:i w:val="0"/>
+        </w:rPr>
         <w:t>Practice</w:t>
       </w:r>
     </w:p>
@@ -8099,6 +9022,21 @@
       </w:r>
     </w:p>
     <w:p>
+      <w:pPr/>
+      <w:r>
+        <w:rPr>
+          <w:b/>
+        </w:rPr>
+        <w:t xml:space="preserve">7. </w:t>
+      </w:r>
+      <w:r>
+        <w:rPr>
+          <w:i w:val="0"/>
+        </w:rPr>
+        <w:t>What reflection coefficient corresponds to a return loss of 15 dB?</w:t>
+      </w:r>
+    </w:p>
+    <w:p>
       <w:pPr>
         <w:pStyle w:val="Heading1"/>
       </w:pPr>
@@ -12630,6 +13568,21 @@
       </w:r>
     </w:p>
     <w:p>
+      <w:pPr/>
+      <w:r>
+        <w:rPr>
+          <w:b/>
+        </w:rPr>
+        <w:t xml:space="preserve">7. </w:t>
+      </w:r>
+      <w:r>
+        <w:rPr>
+          <w:i w:val="0"/>
+        </w:rPr>
+        <w:t>1/(2π√(0.7 × 10⁻⁹ × 10⁻⁶)) = 6.0 MHz.</w:t>
+      </w:r>
+    </w:p>
+    <w:p>
       <w:pPr>
         <w:pStyle w:val="Heading2"/>
       </w:pPr>
@@ -12731,6 +13684,21 @@
       </w:r>
     </w:p>
     <w:p>
+      <w:pPr/>
+      <w:r>
+        <w:rPr>
+          <w:b/>
+        </w:rPr>
+        <w:t xml:space="preserve">7. </w:t>
+      </w:r>
+      <w:r>
+        <w:rPr>
+          <w:i w:val="0"/>
+        </w:rPr>
+        <w:t>87/√4.41 = 41.4 × 1.206 = 50.0 Ω, a rise of about 2.6 Ω.</w:t>
+      </w:r>
+    </w:p>
+    <w:p>
       <w:pPr>
         <w:pStyle w:val="Heading2"/>
       </w:pPr>
@@ -12832,6 +13800,21 @@
       </w:r>
     </w:p>
     <w:p>
+      <w:pPr/>
+      <w:r>
+        <w:rPr>
+          <w:b/>
+        </w:rPr>
+        <w:t xml:space="preserve">7. </w:t>
+      </w:r>
+      <w:r>
+        <w:rPr>
+          <w:i w:val="0"/>
+        </w:rPr>
+        <w:t>(1 + 4)/(1 + 16) = 0.29, a factor of 3.4.</w:t>
+      </w:r>
+    </w:p>
+    <w:p>
       <w:pPr>
         <w:pStyle w:val="Heading2"/>
       </w:pPr>
@@ -12933,6 +13916,21 @@
       </w:r>
     </w:p>
     <w:p>
+      <w:pPr/>
+      <w:r>
+        <w:rPr>
+          <w:b/>
+        </w:rPr>
+        <w:t xml:space="preserve">7. </w:t>
+      </w:r>
+      <w:r>
+        <w:rPr>
+          <w:i w:val="0"/>
+        </w:rPr>
+        <w:t>10^(3/20) = 1.41.</w:t>
+      </w:r>
+    </w:p>
+    <w:p>
       <w:pPr>
         <w:pStyle w:val="Heading2"/>
       </w:pPr>
@@ -13034,6 +14032,21 @@
       </w:r>
     </w:p>
     <w:p>
+      <w:pPr/>
+      <w:r>
+        <w:rPr>
+          <w:b/>
+        </w:rPr>
+        <w:t xml:space="preserve">7. </w:t>
+      </w:r>
+      <w:r>
+        <w:rPr>
+          <w:i w:val="0"/>
+        </w:rPr>
+        <w:t>512 W.</w:t>
+      </w:r>
+    </w:p>
+    <w:p>
       <w:pPr>
         <w:pStyle w:val="Heading2"/>
       </w:pPr>
@@ -13135,6 +14148,21 @@
       </w:r>
     </w:p>
     <w:p>
+      <w:pPr/>
+      <w:r>
+        <w:rPr>
+          <w:b/>
+        </w:rPr>
+        <w:t xml:space="preserve">7. </w:t>
+      </w:r>
+      <w:r>
+        <w:rPr>
+          <w:i w:val="0"/>
+        </w:rPr>
+        <w:t>½ × 4.9 × 10⁻³ × 900 = 2.2 m.</w:t>
+      </w:r>
+    </w:p>
+    <w:p>
       <w:pPr>
         <w:pStyle w:val="Heading2"/>
       </w:pPr>
@@ -13236,6 +14264,21 @@
       </w:r>
     </w:p>
     <w:p>
+      <w:pPr/>
+      <w:r>
+        <w:rPr>
+          <w:b/>
+        </w:rPr>
+        <w:t xml:space="preserve">7. </w:t>
+      </w:r>
+      <w:r>
+        <w:rPr>
+          <w:i w:val="0"/>
+        </w:rPr>
+        <w:t>280/3900 = 7.2 %.</w:t>
+      </w:r>
+    </w:p>
+    <w:p>
       <w:pPr>
         <w:pStyle w:val="Heading2"/>
       </w:pPr>
@@ -13337,6 +14380,21 @@
       </w:r>
     </w:p>
     <w:p>
+      <w:pPr/>
+      <w:r>
+        <w:rPr>
+          <w:b/>
+        </w:rPr>
+        <w:t xml:space="preserve">7. </w:t>
+      </w:r>
+      <w:r>
+        <w:rPr>
+          <w:i w:val="0"/>
+        </w:rPr>
+        <w:t>λ = 5.0 mm; d ≤ 5.0/1.707 = 2.93 mm.</w:t>
+      </w:r>
+    </w:p>
+    <w:p>
       <w:pPr>
         <w:pStyle w:val="Heading2"/>
       </w:pPr>
@@ -13438,6 +14496,21 @@
       </w:r>
     </w:p>
     <w:p>
+      <w:pPr/>
+      <w:r>
+        <w:rPr>
+          <w:b/>
+        </w:rPr>
+        <w:t xml:space="preserve">7. </w:t>
+      </w:r>
+      <w:r>
+        <w:rPr>
+          <w:i w:val="0"/>
+        </w:rPr>
+        <w:t>D = 0.66 × 4 × 0.1 = 0.264 mm.</w:t>
+      </w:r>
+    </w:p>
+    <w:p>
       <w:pPr>
         <w:pStyle w:val="Heading2"/>
       </w:pPr>
@@ -13536,6 +14609,21 @@
           <w:i w:val="0"/>
         </w:rPr>
         <w:t>About 1.1 to 8.9 GHz.</w:t>
+      </w:r>
+    </w:p>
+    <w:p>
+      <w:pPr/>
+      <w:r>
+        <w:rPr>
+          <w:b/>
+        </w:rPr>
+        <w:t xml:space="preserve">7. </w:t>
+      </w:r>
+      <w:r>
+        <w:rPr>
+          <w:i w:val="0"/>
+        </w:rPr>
+        <w:t>10^(−15/20) = 0.18.</w:t>
       </w:r>
     </w:p>
     <w:p>

</xml_diff>

<commit_message>
EE Book 7 expansion, chapters 21-29: slot/heat-sink and cable resonance, limits above 1 GHz, FFT scan time, fully anechoic >1 GHz, Y-cap touch current, TVS sizing, 80/80 rule, motor-drive common mode
</commit_message>
<xml_diff>
--- a/EE - Series/Packaging_Layout_EMC_and_Test_Book7.docx
+++ b/EE - Series/Packaging_Layout_EMC_and_Test_Book7.docx
@@ -9263,6 +9263,87 @@
         <w:rPr>
           <w:i w:val="0"/>
         </w:rPr>
+        <w:t>21.4 Slots, seams, and heat sinks that resonate</w:t>
+      </w:r>
+    </w:p>
+    <w:p>
+      <w:pPr/>
+      <w:r>
+        <w:rPr>
+          <w:i w:val="0"/>
+        </w:rPr>
+        <w:t>An enclosure seam or a ventilation slot is also an antenna. By Babinet's principle a thin slot of length L in a metal sheet radiates like a dipole of the same length, and it resonates when L is half a wavelength. A 15 cm seam therefore resonates near 1 GHz and passes almost everything at that frequency. Below resonance, a slot attenuates roughly as SE ≈ 20 log₁₀(λ/2L), so the longest dimension of an opening, not its area, sets the shielding. A row of small holes shields far better than one long slot of the same open area, and gasketed seams with fasteners every few centimetres keep the longest gap short. Heat sinks give the same trouble from the other side. A heat sink bolted to a switching transistor couples to the switching node through the device's tab capacitance, and a fin assembly of length L acts as a monopole that resonates at a quarter wavelength. Grounding the heat sink to the return plane at several points, or using an insulating pad with a grounded shield layer, moves that resonance out of the band or removes the drive.</w:t>
+      </w:r>
+    </w:p>
+    <w:p>
+      <w:pPr>
+        <w:jc w:val="center"/>
+      </w:pPr>
+      <w:r>
+        <w:rPr>
+          <w:i w:val="0"/>
+        </w:rPr>
+        <w:t>f_res = c / 2L  (slot),    SE ≈ 20 log₁₀(λ / 2L)  for L &lt; λ/2</w:t>
+      </w:r>
+    </w:p>
+    <w:p>
+      <w:pPr>
+        <w:pStyle w:val="Heading2"/>
+      </w:pPr>
+      <w:r>
+        <w:rPr>
+          <w:i w:val="0"/>
+        </w:rPr>
+        <w:t>Worked Example 21.3</w:t>
+      </w:r>
+    </w:p>
+    <w:p>
+      <w:pPr/>
+      <w:r>
+        <w:rPr>
+          <w:b/>
+        </w:rPr>
+        <w:t xml:space="preserve">Problem. </w:t>
+      </w:r>
+      <w:r>
+        <w:rPr>
+          <w:i w:val="0"/>
+        </w:rPr>
+        <w:t>An enclosure has a 15 cm seam. Find its resonant frequency and its shielding effectiveness at 300 MHz. What is the shielding at 300 MHz if fasteners limit the longest gap to 3 cm?</w:t>
+      </w:r>
+    </w:p>
+    <w:p>
+      <w:pPr/>
+      <w:r>
+        <w:rPr>
+          <w:b/>
+        </w:rPr>
+        <w:t xml:space="preserve">Solution. </w:t>
+      </w:r>
+      <w:r>
+        <w:rPr>
+          <w:i w:val="0"/>
+        </w:rPr>
+        <w:t>f_res = 3 × 10⁸ / (2 × 0.15) = 1.0 GHz. At 300 MHz, λ = 1 m, so SE ≈ 20 log₁₀(1/0.3) = 10.5 dB, which is little protection. With the gap limited to 3 cm, SE ≈ 20 log₁₀(1/0.06) = 24.4 dB, about 14 dB better, and the resonance moves up to 5 GHz.</w:t>
+      </w:r>
+    </w:p>
+    <w:p>
+      <w:pPr/>
+      <w:r>
+        <w:rPr>
+          <w:i w:val="0"/>
+        </w:rPr>
+        <w:t>Loops, slots, and heat sinks are the small antennas. Chapter 22 turns to the large ones, the cables attached to every product.</w:t>
+      </w:r>
+    </w:p>
+    <w:p>
+      <w:pPr>
+        <w:pStyle w:val="Heading2"/>
+      </w:pPr>
+      <w:r>
+        <w:rPr>
+          <w:i w:val="0"/>
+        </w:rPr>
         <w:t>Practice</w:t>
       </w:r>
     </w:p>
@@ -9357,6 +9438,21 @@
       </w:r>
     </w:p>
     <w:p>
+      <w:pPr/>
+      <w:r>
+        <w:rPr>
+          <w:b/>
+        </w:rPr>
+        <w:t xml:space="preserve">7. </w:t>
+      </w:r>
+      <w:r>
+        <w:rPr>
+          <w:i w:val="0"/>
+        </w:rPr>
+        <w:t>Find the resonant frequency of a 10 cm slot.</w:t>
+      </w:r>
+    </w:p>
+    <w:p>
       <w:pPr>
         <w:pStyle w:val="Heading1"/>
       </w:pPr>
@@ -9635,6 +9731,87 @@
         <w:rPr>
           <w:i w:val="0"/>
         </w:rPr>
+        <w:t>22.5 Cable resonance and where the peaks fall</w:t>
+      </w:r>
+    </w:p>
+    <w:p>
+      <w:pPr/>
+      <w:r>
+        <w:rPr>
+          <w:i w:val="0"/>
+        </w:rPr>
+        <w:t>A cable driven in common mode behaves like a monopole above the product's ground, or like a dipole when it connects two products. Its radiation peaks where it is resonant: a quarter wavelength for a cable driven against a small product, a half wavelength for a cable strung between two products of similar size. Because the common-mode current flows on the outside of the cable, in air, its velocity is close to the speed of light, so a 1.5 m cable between two units resonates near 100 MHz, with further peaks near the harmonics of that frequency. The practical consequence is that a radiated scan of a product with cables often shows broad humps whose frequency moves when the cable length changes, and the test standards fix cable lengths and their arrangement for that reason. If a peak moves when the cable is moved or replaced by a shorter one, the cable is the antenna, and the cure is at the cable entry: a ferrite, a choke, or a better shield bond.</w:t>
+      </w:r>
+    </w:p>
+    <w:p>
+      <w:pPr>
+        <w:jc w:val="center"/>
+      </w:pPr>
+      <w:r>
+        <w:rPr>
+          <w:i w:val="0"/>
+        </w:rPr>
+        <w:t>f_λ/2 ≈ c / 2L,    f_λ/4 ≈ c / 4L</w:t>
+      </w:r>
+    </w:p>
+    <w:p>
+      <w:pPr>
+        <w:pStyle w:val="Heading2"/>
+      </w:pPr>
+      <w:r>
+        <w:rPr>
+          <w:i w:val="0"/>
+        </w:rPr>
+        <w:t>Worked Example 22.4</w:t>
+      </w:r>
+    </w:p>
+    <w:p>
+      <w:pPr/>
+      <w:r>
+        <w:rPr>
+          <w:b/>
+        </w:rPr>
+        <w:t xml:space="preserve">Problem. </w:t>
+      </w:r>
+      <w:r>
+        <w:rPr>
+          <w:i w:val="0"/>
+        </w:rPr>
+        <w:t>A product connected to a monitor by a 1.5 m cable shows radiated peaks near 100 MHz and 200 MHz. Explain the peaks, and predict where the first one moves if the cable is replaced by a 1 m cable.</w:t>
+      </w:r>
+    </w:p>
+    <w:p>
+      <w:pPr/>
+      <w:r>
+        <w:rPr>
+          <w:b/>
+        </w:rPr>
+        <w:t xml:space="preserve">Solution. </w:t>
+      </w:r>
+      <w:r>
+        <w:rPr>
+          <w:i w:val="0"/>
+        </w:rPr>
+        <w:t>For a half-wave resonance, f = 3 × 10⁸ / (2 × 1.5) = 100 MHz, and the second resonance is near 200 MHz, so the cable is radiating common-mode current. With a 1 m cable the first resonance moves to 3 × 10⁸ / 2 = 150 MHz. Seeing the peak move confirms the diagnosis before any filter is fitted.</w:t>
+      </w:r>
+    </w:p>
+    <w:p>
+      <w:pPr/>
+      <w:r>
+        <w:rPr>
+          <w:i w:val="0"/>
+        </w:rPr>
+        <w:t>Knowing how a product radiates is half the problem. Chapter 23 describes the documents that say how much radiation is allowed and how it must be measured.</w:t>
+      </w:r>
+    </w:p>
+    <w:p>
+      <w:pPr>
+        <w:pStyle w:val="Heading2"/>
+      </w:pPr>
+      <w:r>
+        <w:rPr>
+          <w:i w:val="0"/>
+        </w:rPr>
         <w:t>Practice</w:t>
       </w:r>
     </w:p>
@@ -9729,6 +9906,21 @@
       </w:r>
     </w:p>
     <w:p>
+      <w:pPr/>
+      <w:r>
+        <w:rPr>
+          <w:b/>
+        </w:rPr>
+        <w:t xml:space="preserve">7. </w:t>
+      </w:r>
+      <w:r>
+        <w:rPr>
+          <w:i w:val="0"/>
+        </w:rPr>
+        <w:t>At what frequency does a 2 m cable between two products show its first half-wave resonance?</w:t>
+      </w:r>
+    </w:p>
+    <w:p>
       <w:pPr>
         <w:pStyle w:val="Heading1"/>
       </w:pPr>
@@ -9955,6 +10147,87 @@
         <w:rPr>
           <w:i w:val="0"/>
         </w:rPr>
+        <w:t>23.5 Limits above 1 GHz and how high to scan</w:t>
+      </w:r>
+    </w:p>
+    <w:p>
+      <w:pPr/>
+      <w:r>
+        <w:rPr>
+          <w:i w:val="0"/>
+        </w:rPr>
+        <w:t>Above 1 GHz the limits change form. The FCC Class B limit above 960 MHz is 500 µV/m at 3 m, which is 54 dBµV/m, measured with an average detector in a 1 MHz bandwidth, and a peak limit 20 dB higher, 74 dBµV/m, applies at the same time. CISPR 32 also sets separate average and peak limits above 1 GHz. How high the scan must go depends on the highest frequency generated or used inside the product, including clocks and processor cores. FCC Part 15 and CISPR 32 use nearly the same steps: if the highest internal frequency is below 108 MHz, scan to 1 GHz; below 500 MHz, to 2 GHz; below 1 GHz, to 5 GHz; above 1 GHz, to five times that frequency, which the FCC caps at 40 GHz and CISPR 32 at 6 GHz. A product with a fast processor therefore needs horn antennas and a test well into the microwave range, and its report must state the highest internal frequency it declared.</w:t>
+      </w:r>
+    </w:p>
+    <w:p>
+      <w:pPr>
+        <w:jc w:val="center"/>
+      </w:pPr>
+      <w:r>
+        <w:rPr>
+          <w:i w:val="0"/>
+        </w:rPr>
+        <w:t>500 µV/m = 20 log₁₀(500) = 54.0 dBµV/m (average);   peak limit = average + 20 dB</w:t>
+      </w:r>
+    </w:p>
+    <w:p>
+      <w:pPr>
+        <w:pStyle w:val="Heading2"/>
+      </w:pPr>
+      <w:r>
+        <w:rPr>
+          <w:i w:val="0"/>
+        </w:rPr>
+        <w:t>Worked Example 23.3</w:t>
+      </w:r>
+    </w:p>
+    <w:p>
+      <w:pPr/>
+      <w:r>
+        <w:rPr>
+          <w:b/>
+        </w:rPr>
+        <w:t xml:space="preserve">Problem. </w:t>
+      </w:r>
+      <w:r>
+        <w:rPr>
+          <w:i w:val="0"/>
+        </w:rPr>
+        <w:t>A product contains a 1.6 GHz processor clock. To what frequency must it be scanned under FCC Part 15 and under CISPR 32? At 2 GHz it measures 68 dBµV/m peak and 50 dBµV/m average at 3 m. Does it meet the FCC Class B limits?</w:t>
+      </w:r>
+    </w:p>
+    <w:p>
+      <w:pPr/>
+      <w:r>
+        <w:rPr>
+          <w:b/>
+        </w:rPr>
+        <w:t xml:space="preserve">Solution. </w:t>
+      </w:r>
+      <w:r>
+        <w:rPr>
+          <w:i w:val="0"/>
+        </w:rPr>
+        <w:t>Five times 1.6 GHz is 8 GHz, so the FCC scan goes to 8 GHz; CISPR 32 caps the scan at 6 GHz. Against the FCC limits, the peak margin is 74 − 68 = 6 dB and the average margin is 54 − 50 = 4 dB, so the product passes both, the average limit being the tighter one here.</w:t>
+      </w:r>
+    </w:p>
+    <w:p>
+      <w:pPr/>
+      <w:r>
+        <w:rPr>
+          <w:i w:val="0"/>
+        </w:rPr>
+        <w:t>A limit is meaningless without the receiver that measures against it. Chapter 24 opens the receiver and asks what its detectors and bandwidths actually report.</w:t>
+      </w:r>
+    </w:p>
+    <w:p>
+      <w:pPr>
+        <w:pStyle w:val="Heading2"/>
+      </w:pPr>
+      <w:r>
+        <w:rPr>
+          <w:i w:val="0"/>
+        </w:rPr>
         <w:t>Practice</w:t>
       </w:r>
     </w:p>
@@ -10049,6 +10322,21 @@
       </w:r>
     </w:p>
     <w:p>
+      <w:pPr/>
+      <w:r>
+        <w:rPr>
+          <w:b/>
+        </w:rPr>
+        <w:t xml:space="preserve">7. </w:t>
+      </w:r>
+      <w:r>
+        <w:rPr>
+          <w:i w:val="0"/>
+        </w:rPr>
+        <w:t>The highest internal frequency of a product is 400 MHz. To what frequency must the radiated scan extend?</w:t>
+      </w:r>
+    </w:p>
+    <w:p>
       <w:pPr>
         <w:pStyle w:val="Heading1"/>
       </w:pPr>
@@ -10223,6 +10511,87 @@
         <w:rPr>
           <w:i w:val="0"/>
         </w:rPr>
+        <w:t>24.5 Scan time, step size, and the FFT receiver</w:t>
+      </w:r>
+    </w:p>
+    <w:p>
+      <w:pPr/>
+      <w:r>
+        <w:rPr>
+          <w:i w:val="0"/>
+        </w:rPr>
+        <w:t>A stepped receiver measures one frequency at a time, and CISPR 16 requires the step to be no more than half the resolution bandwidth so that no narrowband emission falls between steps. The number of steps is the span divided by the step, and the time is the number of steps times the dwell at each. The quasi-peak detector needs a dwell of about a second to settle, so a quasi-peak scan of the whole band at every antenna position would take hours, which is why labs scan with the peak detector first and apply quasi-peak only at the suspect frequencies. A time-domain or FFT-based receiver digitizes a wide segment at once and computes all the bins in that segment in parallel, applying the CISPR weighting digitally. It replaces thousands of dwells with a few dozen segment captures. It also catches intermittent emissions, a burst from a radio or a motor start, that a stepped scan would see only if the burst happened to coincide with the step.</w:t>
+      </w:r>
+    </w:p>
+    <w:p>
+      <w:pPr>
+        <w:jc w:val="center"/>
+      </w:pPr>
+      <w:r>
+        <w:rPr>
+          <w:i w:val="0"/>
+        </w:rPr>
+        <w:t>N_steps = span / step,   step ≤ RBW / 2,   T_scan = N_steps × dwell</w:t>
+      </w:r>
+    </w:p>
+    <w:p>
+      <w:pPr>
+        <w:pStyle w:val="Heading2"/>
+      </w:pPr>
+      <w:r>
+        <w:rPr>
+          <w:i w:val="0"/>
+        </w:rPr>
+        <w:t>Worked Example 24.2</w:t>
+      </w:r>
+    </w:p>
+    <w:p>
+      <w:pPr/>
+      <w:r>
+        <w:rPr>
+          <w:b/>
+        </w:rPr>
+        <w:t xml:space="preserve">Problem. </w:t>
+      </w:r>
+      <w:r>
+        <w:rPr>
+          <w:i w:val="0"/>
+        </w:rPr>
+        <w:t>Find the number of steps and the quasi-peak scan time for 30 MHz to 1 GHz with a 120 kHz bandwidth and a 1 s dwell. Compare an FFT receiver that captures 20 MHz segments with a 1 s dwell each.</w:t>
+      </w:r>
+    </w:p>
+    <w:p>
+      <w:pPr/>
+      <w:r>
+        <w:rPr>
+          <w:b/>
+        </w:rPr>
+        <w:t xml:space="preserve">Solution. </w:t>
+      </w:r>
+      <w:r>
+        <w:rPr>
+          <w:i w:val="0"/>
+        </w:rPr>
+        <w:t>The step is 60 kHz, so N = 970 MHz / 60 kHz = 16,167 steps, and the scan takes 16,167 s, about 4.5 hours, for one antenna height and turntable angle. The FFT receiver needs 970/20 = 48.5, so 49 segments, about 49 s, a speedup of more than 300 times. The difference is what makes full quasi-peak final scans practical.</w:t>
+      </w:r>
+    </w:p>
+    <w:p>
+      <w:pPr/>
+      <w:r>
+        <w:rPr>
+          <w:i w:val="0"/>
+        </w:rPr>
+        <w:t>The receiver is only one part of the measurement. Chapter 25 turns to the room around the product, the semi-anechoic chamber, and why its floor is metal.</w:t>
+      </w:r>
+    </w:p>
+    <w:p>
+      <w:pPr>
+        <w:pStyle w:val="Heading2"/>
+      </w:pPr>
+      <w:r>
+        <w:rPr>
+          <w:i w:val="0"/>
+        </w:rPr>
         <w:t>Practice</w:t>
       </w:r>
     </w:p>
@@ -10317,6 +10686,21 @@
       </w:r>
     </w:p>
     <w:p>
+      <w:pPr/>
+      <w:r>
+        <w:rPr>
+          <w:b/>
+        </w:rPr>
+        <w:t xml:space="preserve">7. </w:t>
+      </w:r>
+      <w:r>
+        <w:rPr>
+          <w:i w:val="0"/>
+        </w:rPr>
+        <w:t>How many steps and how long a quasi-peak scan does 150 kHz to 30 MHz take with a 9 kHz bandwidth and a 1 s dwell?</w:t>
+      </w:r>
+    </w:p>
+    <w:p>
       <w:pPr>
         <w:pStyle w:val="Heading1"/>
       </w:pPr>
@@ -10543,6 +10927,87 @@
         <w:rPr>
           <w:i w:val="0"/>
         </w:rPr>
+        <w:t>25.5 Above 1 GHz: absorber on the floor and the horn's footprint</w:t>
+      </w:r>
+    </w:p>
+    <w:p>
+      <w:pPr/>
+      <w:r>
+        <w:rPr>
+          <w:i w:val="0"/>
+        </w:rPr>
+        <w:t>Above 1 GHz the reflecting floor stops being an advantage. The ground-reflected ray produces deep nulls that move with small changes in height, and CISPR 16-1-4 therefore requires a free-space test environment: absorber is laid on the floor between the antenna and the product, turning the semi-anechoic chamber into a fully anechoic one for these frequencies. The site is validated by a site voltage standing-wave ratio measurement, S_VSWR, which must not exceed 6 dB across the test volume. The receive antenna is now a horn, and its beam must cover the product. At distance d, a horn with a 3 dB beamwidth θ illuminates a width w = 2d tan(θ/2). Horn beamwidth narrows as frequency rises, so a product that is fully covered at 1 GHz may extend outside the beam at 6 GHz, and the standard then requires the antenna to be scanned in height to find the maximum. The horn's own far field, 2D²/λ, must also lie inside the test distance: a horn with a 0.2 m aperture at 6 GHz has 2 × 0.04 / 0.05 = 1.6 m, comfortably less than 3 m.</w:t>
+      </w:r>
+    </w:p>
+    <w:p>
+      <w:pPr>
+        <w:jc w:val="center"/>
+      </w:pPr>
+      <w:r>
+        <w:rPr>
+          <w:i w:val="0"/>
+        </w:rPr>
+        <w:t>w = 2 d tan(θ/2),    S_VSWR ≤ 6 dB</w:t>
+      </w:r>
+    </w:p>
+    <w:p>
+      <w:pPr>
+        <w:pStyle w:val="Heading2"/>
+      </w:pPr>
+      <w:r>
+        <w:rPr>
+          <w:i w:val="0"/>
+        </w:rPr>
+        <w:t>Worked Example 25.3</w:t>
+      </w:r>
+    </w:p>
+    <w:p>
+      <w:pPr/>
+      <w:r>
+        <w:rPr>
+          <w:b/>
+        </w:rPr>
+        <w:t xml:space="preserve">Problem. </w:t>
+      </w:r>
+      <w:r>
+        <w:rPr>
+          <w:i w:val="0"/>
+        </w:rPr>
+        <w:t>A horn has a 3 dB beamwidth of 40° at 1 GHz and 20° at 6 GHz. At a 3 m distance, find the width it illuminates at each frequency, and say whether a 1.5 m tall product is covered at 6 GHz.</w:t>
+      </w:r>
+    </w:p>
+    <w:p>
+      <w:pPr/>
+      <w:r>
+        <w:rPr>
+          <w:b/>
+        </w:rPr>
+        <w:t xml:space="preserve">Solution. </w:t>
+      </w:r>
+      <w:r>
+        <w:rPr>
+          <w:i w:val="0"/>
+        </w:rPr>
+        <w:t>At 1 GHz, w = 2 × 3 × tan 20° = 2.18 m, which covers the product. At 6 GHz, w = 2 × 3 × tan 10° = 1.06 m, less than 1.5 m, so the product is not covered and the horn must be scanned in height to find the maximum emission.</w:t>
+      </w:r>
+    </w:p>
+    <w:p>
+      <w:pPr/>
+      <w:r>
+        <w:rPr>
+          <w:i w:val="0"/>
+        </w:rPr>
+        <w:t>The chamber measures what the product radiates. Chapter 26 measures what it pushes back into the mains, with a quite different instrument, the LISN.</w:t>
+      </w:r>
+    </w:p>
+    <w:p>
+      <w:pPr>
+        <w:pStyle w:val="Heading2"/>
+      </w:pPr>
+      <w:r>
+        <w:rPr>
+          <w:i w:val="0"/>
+        </w:rPr>
         <w:t>Practice</w:t>
       </w:r>
     </w:p>
@@ -10637,6 +11102,21 @@
       </w:r>
     </w:p>
     <w:p>
+      <w:pPr/>
+      <w:r>
+        <w:rPr>
+          <w:b/>
+        </w:rPr>
+        <w:t xml:space="preserve">7. </w:t>
+      </w:r>
+      <w:r>
+        <w:rPr>
+          <w:i w:val="0"/>
+        </w:rPr>
+        <w:t>Find the width illuminated at 3 m by a horn with a 30° beamwidth.</w:t>
+      </w:r>
+    </w:p>
+    <w:p>
       <w:pPr>
         <w:pStyle w:val="Heading1"/>
       </w:pPr>
@@ -10863,6 +11343,87 @@
         <w:rPr>
           <w:i w:val="0"/>
         </w:rPr>
+        <w:t>26.5 The touch-current budget for Y capacitors</w:t>
+      </w:r>
+    </w:p>
+    <w:p>
+      <w:pPr/>
+      <w:r>
+        <w:rPr>
+          <w:i w:val="0"/>
+        </w:rPr>
+        <w:t>A Y capacitor from line to protective earth carries a mains-frequency current I = 2πfCV at all times. In normal use that current returns harmlessly through the earth conductor, but if the earth connection is broken, or the product is double insulated and has no earth, the same current flows through anyone who touches the chassis. Safety standards therefore cap the touch current. The older IEC 60950-1 limited Class II equipment to 0.25 mA, and IEC 62368-1 sets the boundary of energy class ES1 at 0.5 mA rms; medical standards are stricter still. The calculation must use the worst case: the highest rated mains voltage, the highest frequency, 60 Hz rather than 50 Hz, and the capacitor's upper tolerance. That budget fixes the largest total Y capacitance the filter may use, and when it is not enough for the common-mode attenuation, the remaining attenuation must come from the common-mode choke, which has no such limit.</w:t>
+      </w:r>
+    </w:p>
+    <w:p>
+      <w:pPr>
+        <w:jc w:val="center"/>
+      </w:pPr>
+      <w:r>
+        <w:rPr>
+          <w:i w:val="0"/>
+        </w:rPr>
+        <w:t>I_touch = 2π f C V</w:t>
+      </w:r>
+    </w:p>
+    <w:p>
+      <w:pPr>
+        <w:pStyle w:val="Heading2"/>
+      </w:pPr>
+      <w:r>
+        <w:rPr>
+          <w:i w:val="0"/>
+        </w:rPr>
+        <w:t>Worked Example 26.3</w:t>
+      </w:r>
+    </w:p>
+    <w:p>
+      <w:pPr/>
+      <w:r>
+        <w:rPr>
+          <w:b/>
+        </w:rPr>
+        <w:t xml:space="preserve">Problem. </w:t>
+      </w:r>
+      <w:r>
+        <w:rPr>
+          <w:i w:val="0"/>
+        </w:rPr>
+        <w:t>Find the touch current of a 4.7 nF Y capacitor at 230 V, 50 Hz, and at the worst case of 264 V, 60 Hz. What is the largest Y capacitance that keeps the touch current below 0.25 mA at 264 V, 60 Hz?</w:t>
+      </w:r>
+    </w:p>
+    <w:p>
+      <w:pPr/>
+      <w:r>
+        <w:rPr>
+          <w:b/>
+        </w:rPr>
+        <w:t xml:space="preserve">Solution. </w:t>
+      </w:r>
+      <w:r>
+        <w:rPr>
+          <w:i w:val="0"/>
+        </w:rPr>
+        <w:t>At 230 V, 50 Hz, I = 2π × 50 × 4.7 nF × 230 V = 0.34 mA. At 264 V, 60 Hz, I = 2π × 60 × 4.7 nF × 264 V = 0.47 mA, above 0.25 mA. The largest capacitance is C = 0.25 mA / (2π × 60 × 264 V) = 2.5 nF, so a 2.2 nF part, within tolerance, is the practical choice, and the choke must supply the attenuation the smaller capacitor gives up.</w:t>
+      </w:r>
+    </w:p>
+    <w:p>
+      <w:pPr/>
+      <w:r>
+        <w:rPr>
+          <w:i w:val="0"/>
+        </w:rPr>
+        <w:t>Emissions are what a product does to its surroundings. Chapter 27 turns the question around: what the surroundings do to the product.</w:t>
+      </w:r>
+    </w:p>
+    <w:p>
+      <w:pPr>
+        <w:pStyle w:val="Heading2"/>
+      </w:pPr>
+      <w:r>
+        <w:rPr>
+          <w:i w:val="0"/>
+        </w:rPr>
         <w:t>Practice</w:t>
       </w:r>
     </w:p>
@@ -10957,6 +11518,21 @@
       </w:r>
     </w:p>
     <w:p>
+      <w:pPr/>
+      <w:r>
+        <w:rPr>
+          <w:b/>
+        </w:rPr>
+        <w:t xml:space="preserve">7. </w:t>
+      </w:r>
+      <w:r>
+        <w:rPr>
+          <w:i w:val="0"/>
+        </w:rPr>
+        <w:t>Find the touch current of a 2.2 nF Y capacitor at 230 V, 50 Hz.</w:t>
+      </w:r>
+    </w:p>
+    <w:p>
       <w:pPr>
         <w:pStyle w:val="Heading1"/>
       </w:pPr>
@@ -11224,6 +11800,87 @@
         <w:rPr>
           <w:i w:val="0"/>
         </w:rPr>
+        <w:t>27.5 Choosing a TVS diode for a signal line</w:t>
+      </w:r>
+    </w:p>
+    <w:p>
+      <w:pPr/>
+      <w:r>
+        <w:rPr>
+          <w:i w:val="0"/>
+        </w:rPr>
+        <w:t>Surges on signal and data lines are applied through a larger coupling impedance than on mains lines. For unshielded lines IEC 61000-4-5 adds 40 Ω to the generator's 2 Ω, so the current is far smaller than on a power input, but the protected circuit is also far more fragile. A TVS diode conducts above its breakdown voltage V_BR and behaves, once conducting, roughly like a voltage source V_BR in series with a dynamic resistance R_dyn. The clamping voltage is then V_C = V_BR + I_PP R_dyn, and that voltage, not the breakdown voltage, is what the protected pin sees. Choosing a TVS means meeting four conditions at once: its stand-off voltage must exceed the line's highest working voltage so it does not leak in normal use; its clamping voltage at the surge current must stay below the protected part's absolute maximum; its peak pulse power rating for an 8/20 µs pulse must exceed V_C × I_PP; and its capacitance must be small enough not to load the signal, which for multi-gigabit lines means a fraction of a picofarad and a different class of device.</w:t>
+      </w:r>
+    </w:p>
+    <w:p>
+      <w:pPr>
+        <w:jc w:val="center"/>
+      </w:pPr>
+      <w:r>
+        <w:rPr>
+          <w:i w:val="0"/>
+        </w:rPr>
+        <w:t>I_PP ≈ (V_surge − V_C) / 42 Ω,    V_C = V_BR + I_PP R_dyn,    P_PP = V_C I_PP</w:t>
+      </w:r>
+    </w:p>
+    <w:p>
+      <w:pPr>
+        <w:pStyle w:val="Heading2"/>
+      </w:pPr>
+      <w:r>
+        <w:rPr>
+          <w:i w:val="0"/>
+        </w:rPr>
+        <w:t>Worked Example 27.4</w:t>
+      </w:r>
+    </w:p>
+    <w:p>
+      <w:pPr/>
+      <w:r>
+        <w:rPr>
+          <w:b/>
+        </w:rPr>
+        <w:t xml:space="preserve">Problem. </w:t>
+      </w:r>
+      <w:r>
+        <w:rPr>
+          <w:i w:val="0"/>
+        </w:rPr>
+        <w:t>A 24 V industrial input is protected by a TVS with V_BR = 30 V and R_dyn = 0.5 Ω. A 1 kV surge is applied through 42 Ω. Estimate the surge current, the clamping voltage, and the peak power the TVS must handle.</w:t>
+      </w:r>
+    </w:p>
+    <w:p>
+      <w:pPr/>
+      <w:r>
+        <w:rPr>
+          <w:b/>
+        </w:rPr>
+        <w:t xml:space="preserve">Solution. </w:t>
+      </w:r>
+      <w:r>
+        <w:rPr>
+          <w:i w:val="0"/>
+        </w:rPr>
+        <w:t>Taking V_C near 41 V, I_PP ≈ (1000 − 41)/42 = 22.8 A. Then V_C = 30 + 22.8 × 0.5 = 41.4 V, consistent with the estimate. The peak power is 41.4 × 22.8 = 944 W, so the TVS needs an 8/20 µs rating of at least 1 kW, and the input circuit behind it must tolerate about 42 V for 20 µs.</w:t>
+      </w:r>
+    </w:p>
+    <w:p>
+      <w:pPr/>
+      <w:r>
+        <w:rPr>
+          <w:i w:val="0"/>
+        </w:rPr>
+        <w:t>Immunity tests and emission tests are both measurements against limits, and every measurement is made on a few units. Chapter 28 asks how those few units speak for production, and how the simulation flow and the day in the lab fit together.</w:t>
+      </w:r>
+    </w:p>
+    <w:p>
+      <w:pPr>
+        <w:pStyle w:val="Heading2"/>
+      </w:pPr>
+      <w:r>
+        <w:rPr>
+          <w:i w:val="0"/>
+        </w:rPr>
         <w:t>Practice</w:t>
       </w:r>
     </w:p>
@@ -11318,6 +11975,21 @@
       </w:r>
     </w:p>
     <w:p>
+      <w:pPr/>
+      <w:r>
+        <w:rPr>
+          <w:b/>
+        </w:rPr>
+        <w:t xml:space="preserve">7. </w:t>
+      </w:r>
+      <w:r>
+        <w:rPr>
+          <w:i w:val="0"/>
+        </w:rPr>
+        <w:t>A 2 kV surge is applied through 42 Ω to a line clamped at about 40 V. Estimate the surge current.</w:t>
+      </w:r>
+    </w:p>
+    <w:p>
       <w:pPr>
         <w:pStyle w:val="Heading1"/>
       </w:pPr>
@@ -11589,6 +12261,87 @@
         <w:rPr>
           <w:i w:val="0"/>
         </w:rPr>
+        <w:t>28.5 From one unit to production: the 80/80 rule</w:t>
+      </w:r>
+    </w:p>
+    <w:p>
+      <w:pPr/>
+      <w:r>
+        <w:rPr>
+          <w:i w:val="0"/>
+        </w:rPr>
+        <w:t>A compliance test measures one unit, but the declaration covers every unit built. CISPR standards address this with a statistical rule: with 80 % confidence, at least 80 % of the production must comply. When a sample of n units is measured, the rule is met at each frequency if x̄ + kS ≤ L, where x̄ is the mean of the readings in dBµV/m, S is their sample standard deviation, L is the limit, and k is a factor from the non-central t-distribution that falls as the sample grows: 2.04 for 3 units, 1.69 for 4, 1.52 for 5, 1.42 for 6, and 1.20 for 12. A product that passes on a single unit by 1 dB may fail the rule when several units are measured, because the spread of the clock oscillator, the cable dress, and the assembly adds to the mean. This is the second reason, beside measurement uncertainty, for designing to a margin of several decibels.</w:t>
+      </w:r>
+    </w:p>
+    <w:p>
+      <w:pPr>
+        <w:jc w:val="center"/>
+      </w:pPr>
+      <w:r>
+        <w:rPr>
+          <w:i w:val="0"/>
+        </w:rPr>
+        <w:t>x̄ + k S ≤ L,    S = √(Σ(xᵢ − x̄)² / (n − 1))</w:t>
+      </w:r>
+    </w:p>
+    <w:p>
+      <w:pPr>
+        <w:pStyle w:val="Heading2"/>
+      </w:pPr>
+      <w:r>
+        <w:rPr>
+          <w:i w:val="0"/>
+        </w:rPr>
+        <w:t>Worked Example 28.4</w:t>
+      </w:r>
+    </w:p>
+    <w:p>
+      <w:pPr/>
+      <w:r>
+        <w:rPr>
+          <w:b/>
+        </w:rPr>
+        <w:t xml:space="preserve">Problem. </w:t>
+      </w:r>
+      <w:r>
+        <w:rPr>
+          <w:i w:val="0"/>
+        </w:rPr>
+        <w:t>Five units measure 36.1, 37.4, 35.2, 38.0, and 36.8 dBµV/m at one frequency where the limit is 40.0 dBµV/m. Does the sample meet the 80/80 rule?</w:t>
+      </w:r>
+    </w:p>
+    <w:p>
+      <w:pPr/>
+      <w:r>
+        <w:rPr>
+          <w:b/>
+        </w:rPr>
+        <w:t xml:space="preserve">Solution. </w:t>
+      </w:r>
+      <w:r>
+        <w:rPr>
+          <w:i w:val="0"/>
+        </w:rPr>
+        <w:t>The mean is 183.5/5 = 36.7 dBµV/m. The deviations are −0.6, 0.7, −1.5, 1.3, and 0.1 dB, whose squares sum to 4.80, so S = √(4.80/4) = 1.10 dB. With k = 1.52, x̄ + kS = 36.7 + 1.67 = 38.4 dBµV/m, below 40.0, so the sample meets the rule with 1.6 dB to spare, although the worst unit alone had 2.0 dB.</w:t>
+      </w:r>
+    </w:p>
+    <w:p>
+      <w:pPr/>
+      <w:r>
+        <w:rPr>
+          <w:i w:val="0"/>
+        </w:rPr>
+        <w:t>Part II has followed a product from its radiating loops to the certificate. Part III ends the book, and the series, with one product that draws on every earlier book at once.</w:t>
+      </w:r>
+    </w:p>
+    <w:p>
+      <w:pPr>
+        <w:pStyle w:val="Heading2"/>
+      </w:pPr>
+      <w:r>
+        <w:rPr>
+          <w:i w:val="0"/>
+        </w:rPr>
         <w:t>Practice</w:t>
       </w:r>
     </w:p>
@@ -11683,6 +12436,21 @@
       </w:r>
     </w:p>
     <w:p>
+      <w:pPr/>
+      <w:r>
+        <w:rPr>
+          <w:b/>
+        </w:rPr>
+        <w:t xml:space="preserve">7. </w:t>
+      </w:r>
+      <w:r>
+        <w:rPr>
+          <w:i w:val="0"/>
+        </w:rPr>
+        <w:t>Three units have a mean of 37.0 dBµV/m and S = 1.0 dB against a 40.0 dBµV/m limit. Do they meet the 80/80 rule?</w:t>
+      </w:r>
+    </w:p>
+    <w:p>
       <w:pPr>
         <w:pStyle w:val="Heading1"/>
       </w:pPr>
@@ -11898,7 +12666,79 @@
         <w:rPr>
           <w:i w:val="0"/>
         </w:rPr>
-        <w:t>29.4 The boundaries</w:t>
+        <w:t>29.4 The motor drive as a noise source</w:t>
+      </w:r>
+    </w:p>
+    <w:p>
+      <w:pPr/>
+      <w:r>
+        <w:rPr>
+          <w:i w:val="0"/>
+        </w:rPr>
+        <w:t>The boundary problems of a robot are concrete. Each joint's motor drive switches the 48 V bus at tens or hundreds of kilohertz, and with gallium nitride transistors the edges take a few nanoseconds, a dv/dt near 10 kV/µs. Every edge charges the capacitance from the motor winding and its leads to the metal frame of the limb, and that common-mode current, I = C dv/dt, must return to the drive. If its return path runs through the frame, it passes the camera, the encoder, and the joint's data link, and their grounds shift by the current times the impedance of the shared path. The remedies are those of Chapters 22 and 26 applied inside the body: slow the edges where switching loss allows, return the common-mode current locally with a capacitor from the frame to the drive's return, put a common-mode choke or shielded leads on the motor cable with the shield bonded at both ends, and keep the data links differential, balanced, and away from the motor leads.</w:t>
+      </w:r>
+    </w:p>
+    <w:p>
+      <w:pPr>
+        <w:jc w:val="center"/>
+      </w:pPr>
+      <w:r>
+        <w:rPr>
+          <w:i w:val="0"/>
+        </w:rPr>
+        <w:t>I_CM = C dv/dt</w:t>
+      </w:r>
+    </w:p>
+    <w:p>
+      <w:pPr>
+        <w:pStyle w:val="Heading2"/>
+      </w:pPr>
+      <w:r>
+        <w:rPr>
+          <w:i w:val="0"/>
+        </w:rPr>
+        <w:t>Worked Example 29.3</w:t>
+      </w:r>
+    </w:p>
+    <w:p>
+      <w:pPr/>
+      <w:r>
+        <w:rPr>
+          <w:b/>
+        </w:rPr>
+        <w:t xml:space="preserve">Problem. </w:t>
+      </w:r>
+      <w:r>
+        <w:rPr>
+          <w:i w:val="0"/>
+        </w:rPr>
+        <w:t>A GaN motor drive switches 48 V in 5 ns, and the motor and its leads have 1 nF to the frame. Find the dv/dt and the common-mode current. What ground shift does that current produce across 20 mΩ of shared frame return, and how much does slowing the edge to 20 ns help?</w:t>
+      </w:r>
+    </w:p>
+    <w:p>
+      <w:pPr/>
+      <w:r>
+        <w:rPr>
+          <w:b/>
+        </w:rPr>
+        <w:t xml:space="preserve">Solution. </w:t>
+      </w:r>
+      <w:r>
+        <w:rPr>
+          <w:i w:val="0"/>
+        </w:rPr>
+        <w:t>dv/dt = 48 V / 5 ns = 9.6 kV/µs, about 10 kV/µs, so I_CM = 1 nF × 10 kV/µs = 10 A during each edge. Across 20 mΩ that is 0.2 V of ground shift between the camera and the computer, which a differential link rejects only within its common-mode range and only if the link is well balanced. A 20 ns edge gives 2.4 kV/µs and 2.4 A, 20 log₁₀(10/2.4) = 12.4 dB less, at the cost of more switching loss in the drive.</w:t>
+      </w:r>
+    </w:p>
+    <w:p>
+      <w:pPr>
+        <w:pStyle w:val="Heading2"/>
+      </w:pPr>
+      <w:r>
+        <w:rPr>
+          <w:i w:val="0"/>
+        </w:rPr>
+        <w:t>29.5 The boundaries</w:t>
       </w:r>
     </w:p>
     <w:p>
@@ -12012,6 +12852,21 @@
       </w:r>
     </w:p>
     <w:p>
+      <w:pPr/>
+      <w:r>
+        <w:rPr>
+          <w:b/>
+        </w:rPr>
+        <w:t xml:space="preserve">7. </w:t>
+      </w:r>
+      <w:r>
+        <w:rPr>
+          <w:i w:val="0"/>
+        </w:rPr>
+        <w:t>Find the common-mode current through 470 pF at 5 kV/µs.</w:t>
+      </w:r>
+    </w:p>
+    <w:p>
       <w:pPr>
         <w:pStyle w:val="Heading1"/>
       </w:pPr>
@@ -14728,6 +15583,21 @@
       </w:r>
     </w:p>
     <w:p>
+      <w:pPr/>
+      <w:r>
+        <w:rPr>
+          <w:b/>
+        </w:rPr>
+        <w:t xml:space="preserve">7. </w:t>
+      </w:r>
+      <w:r>
+        <w:rPr>
+          <w:i w:val="0"/>
+        </w:rPr>
+        <w:t>3 × 10⁸ / 0.2 = 1.5 GHz.</w:t>
+      </w:r>
+    </w:p>
+    <w:p>
       <w:pPr>
         <w:pStyle w:val="Heading2"/>
       </w:pPr>
@@ -14829,6 +15699,21 @@
       </w:r>
     </w:p>
     <w:p>
+      <w:pPr/>
+      <w:r>
+        <w:rPr>
+          <w:b/>
+        </w:rPr>
+        <w:t xml:space="preserve">7. </w:t>
+      </w:r>
+      <w:r>
+        <w:rPr>
+          <w:i w:val="0"/>
+        </w:rPr>
+        <w:t>3 × 10⁸ / 4 = 75 MHz.</w:t>
+      </w:r>
+    </w:p>
+    <w:p>
       <w:pPr>
         <w:pStyle w:val="Heading2"/>
       </w:pPr>
@@ -14930,6 +15815,21 @@
       </w:r>
     </w:p>
     <w:p>
+      <w:pPr/>
+      <w:r>
+        <w:rPr>
+          <w:b/>
+        </w:rPr>
+        <w:t xml:space="preserve">7. </w:t>
+      </w:r>
+      <w:r>
+        <w:rPr>
+          <w:i w:val="0"/>
+        </w:rPr>
+        <w:t>2 GHz.</w:t>
+      </w:r>
+    </w:p>
+    <w:p>
       <w:pPr>
         <w:pStyle w:val="Heading2"/>
       </w:pPr>
@@ -15031,6 +15931,21 @@
       </w:r>
     </w:p>
     <w:p>
+      <w:pPr/>
+      <w:r>
+        <w:rPr>
+          <w:b/>
+        </w:rPr>
+        <w:t xml:space="preserve">7. </w:t>
+      </w:r>
+      <w:r>
+        <w:rPr>
+          <w:i w:val="0"/>
+        </w:rPr>
+        <w:t>Step 4.5 kHz, 29.85 MHz / 4.5 kHz = 6,633 steps, about 1.8 hours.</w:t>
+      </w:r>
+    </w:p>
+    <w:p>
       <w:pPr>
         <w:pStyle w:val="Heading2"/>
       </w:pPr>
@@ -15132,6 +16047,21 @@
       </w:r>
     </w:p>
     <w:p>
+      <w:pPr/>
+      <w:r>
+        <w:rPr>
+          <w:b/>
+        </w:rPr>
+        <w:t xml:space="preserve">7. </w:t>
+      </w:r>
+      <w:r>
+        <w:rPr>
+          <w:i w:val="0"/>
+        </w:rPr>
+        <w:t>2 × 3 × tan 15° = 1.61 m.</w:t>
+      </w:r>
+    </w:p>
+    <w:p>
       <w:pPr>
         <w:pStyle w:val="Heading2"/>
       </w:pPr>
@@ -15233,6 +16163,21 @@
       </w:r>
     </w:p>
     <w:p>
+      <w:pPr/>
+      <w:r>
+        <w:rPr>
+          <w:b/>
+        </w:rPr>
+        <w:t xml:space="preserve">7. </w:t>
+      </w:r>
+      <w:r>
+        <w:rPr>
+          <w:i w:val="0"/>
+        </w:rPr>
+        <w:t>2π × 50 × 2.2 nF × 230 V = 0.16 mA.</w:t>
+      </w:r>
+    </w:p>
+    <w:p>
       <w:pPr>
         <w:pStyle w:val="Heading2"/>
       </w:pPr>
@@ -15334,6 +16279,21 @@
       </w:r>
     </w:p>
     <w:p>
+      <w:pPr/>
+      <w:r>
+        <w:rPr>
+          <w:b/>
+        </w:rPr>
+        <w:t xml:space="preserve">7. </w:t>
+      </w:r>
+      <w:r>
+        <w:rPr>
+          <w:i w:val="0"/>
+        </w:rPr>
+        <w:t>(2000 − 40)/42 = 46.7 A.</w:t>
+      </w:r>
+    </w:p>
+    <w:p>
       <w:pPr>
         <w:pStyle w:val="Heading2"/>
       </w:pPr>
@@ -15435,6 +16395,21 @@
       </w:r>
     </w:p>
     <w:p>
+      <w:pPr/>
+      <w:r>
+        <w:rPr>
+          <w:b/>
+        </w:rPr>
+        <w:t xml:space="preserve">7. </w:t>
+      </w:r>
+      <w:r>
+        <w:rPr>
+          <w:i w:val="0"/>
+        </w:rPr>
+        <w:t>37.0 + 2.04 × 1.0 = 39.0 dBµV/m, below 40.0, so yes, with 1.0 dB to spare.</w:t>
+      </w:r>
+    </w:p>
+    <w:p>
       <w:pPr>
         <w:pStyle w:val="Heading2"/>
       </w:pPr>
@@ -15533,6 +16508,21 @@
           <w:i w:val="0"/>
         </w:rPr>
         <w:t>The fast feedback loop holds each joint on its trajectory and rejects disturbances between model updates, so the model only needs to set targets at the rate the task changes, not at the rate disturbances arrive.</w:t>
+      </w:r>
+    </w:p>
+    <w:p>
+      <w:pPr/>
+      <w:r>
+        <w:rPr>
+          <w:b/>
+        </w:rPr>
+        <w:t xml:space="preserve">7. </w:t>
+      </w:r>
+      <w:r>
+        <w:rPr>
+          <w:i w:val="0"/>
+        </w:rPr>
+        <w:t>2.35 A.</w:t>
       </w:r>
     </w:p>
     <w:p>

</xml_diff>

<commit_message>
EE Book 7 expansion, second round: 17 new sections and worked examples (multiphase ripple, fan laws, MEMS TCf, bond-wire rise time, HTOL Arrhenius, MLCC DC bias, board thickness/aspect ratio, multi-aggressor crosstalk, jitter, external laser source, magnetometer, TSV energy, 60 GHz link budget, placement Cpk replacing duplicate stencil section, VNA IFBW, pulsed-emission detectors, CM choke); front matter constants and sources; KDP description; master rebuilt (44,860 words)
</commit_message>
<xml_diff>
--- a/EE - Series/Packaging_Layout_EMC_and_Test_Book7.docx
+++ b/EE - Series/Packaging_Layout_EMC_and_Test_Book7.docx
@@ -1629,6 +1629,78 @@
       </w:r>
     </w:p>
     <w:p>
+      <w:pPr>
+        <w:pStyle w:val="Heading2"/>
+      </w:pPr>
+      <w:r>
+        <w:rPr>
+          <w:i w:val="0"/>
+        </w:rPr>
+        <w:t>3.6 Many phases: ripple and interleaving</w:t>
+      </w:r>
+    </w:p>
+    <w:p>
+      <w:pPr/>
+      <w:r>
+        <w:rPr>
+          <w:i w:val="0"/>
+        </w:rPr>
+        <w:t>No single converter phase can carry 875 A, so the regulator is built from many identical buck phases in parallel, each switching at a few hundred kilohertz to a megahertz, with their clocks staggered evenly through the switching period. Each phase's inductor carries a triangular ripple current ΔI = (Vin − Vout) D / (L fs), where D = Vout/Vin is the duty cycle. Interleaving N phases makes the ripples partly cancel at the output and moves the output ripple frequency to N fs, which the output capacitors filter far more easily. More phases also spread the conduction loss and the heat across the board, and modern controllers add and shed phases as the load changes so that light loads do not pay for the switching loss of every phase. The fast load steps of Section 3.3 are still met by the capacitors first; the phases respond within a few switching cycles.</w:t>
+      </w:r>
+    </w:p>
+    <w:p>
+      <w:pPr>
+        <w:jc w:val="center"/>
+      </w:pPr>
+      <w:r>
+        <w:rPr>
+          <w:i w:val="0"/>
+        </w:rPr>
+        <w:t>D = Vout / Vin,    ΔI = (Vin − Vout) D / (L fs),    f_ripple,out = N fs</w:t>
+      </w:r>
+    </w:p>
+    <w:p>
+      <w:pPr>
+        <w:pStyle w:val="Heading2"/>
+      </w:pPr>
+      <w:r>
+        <w:rPr>
+          <w:i w:val="0"/>
+        </w:rPr>
+        <w:t>Worked Example 3.5</w:t>
+      </w:r>
+    </w:p>
+    <w:p>
+      <w:pPr/>
+      <w:r>
+        <w:rPr>
+          <w:b/>
+        </w:rPr>
+        <w:t xml:space="preserve">Problem. </w:t>
+      </w:r>
+      <w:r>
+        <w:rPr>
+          <w:i w:val="0"/>
+        </w:rPr>
+        <w:t>A 24-phase regulator converts 12 V to 0.8 V at 800 kHz with 100 nH per phase and delivers 875 A. Find the current per phase, the ripple per phase, and the output ripple frequency. At 90 % efficiency, how much power does the regulator lose?</w:t>
+      </w:r>
+    </w:p>
+    <w:p>
+      <w:pPr/>
+      <w:r>
+        <w:rPr>
+          <w:b/>
+        </w:rPr>
+        <w:t xml:space="preserve">Solution. </w:t>
+      </w:r>
+      <w:r>
+        <w:rPr>
+          <w:i w:val="0"/>
+        </w:rPr>
+        <w:t>Each phase carries 875/24 = 36.5 A. D = 0.8/12 = 0.067, so ΔI = 11.2 × 0.067 / (100 × 10⁻⁹ × 800 × 10³) = 9.3 A peak to peak, about a quarter of the phase current. The output ripple is at 24 × 0.8 = 19.2 MHz. The load takes 0.8 × 875 = 700 W, so the input is 778 W and the regulator dissipates about 78 W, a heat load of its own that Chapter 6 must remove.</w:t>
+      </w:r>
+    </w:p>
+    <w:p>
       <w:pPr/>
       <w:r>
         <w:rPr>
@@ -1754,6 +1826,21 @@
       </w:r>
     </w:p>
     <w:p>
+      <w:pPr/>
+      <w:r>
+        <w:rPr>
+          <w:b/>
+        </w:rPr>
+        <w:t xml:space="preserve">8. </w:t>
+      </w:r>
+      <w:r>
+        <w:rPr>
+          <w:i w:val="0"/>
+        </w:rPr>
+        <w:t>Find the ripple current of a phase converting 12 V to 1.0 V at 1 MHz with 150 nH.</w:t>
+      </w:r>
+    </w:p>
+    <w:p>
       <w:pPr>
         <w:pStyle w:val="Heading1"/>
       </w:pPr>
@@ -2877,6 +2964,78 @@
       </w:r>
     </w:p>
     <w:p>
+      <w:pPr>
+        <w:pStyle w:val="Heading2"/>
+      </w:pPr>
+      <w:r>
+        <w:rPr>
+          <w:i w:val="0"/>
+        </w:rPr>
+        <w:t>6.6 The fan laws</w:t>
+      </w:r>
+    </w:p>
+    <w:p>
+      <w:pPr/>
+      <w:r>
+        <w:rPr>
+          <w:i w:val="0"/>
+        </w:rPr>
+        <w:t>Air-cooled servers spend a surprising share of their power on fans, and the fan laws explain why. For a given fan and system, the volume flow is proportional to the rotational speed N, the pressure it develops to the square of the speed, and the shaft power to the cube. The acoustic sound power rises even faster, roughly as the fifth power of speed, about 50 log₁₀(N₂/N₁) decibels. Because the heat a stream of air removes at a fixed temperature rise is proportional to its flow, P = ṁ cp ΔT from Section 6.2, each additional watt of cooling bought with fan speed costs disproportionately more fan power. That cube law is one of the strongest arguments for liquid cooling at high rack power: water carries the heat with a few percent of the pumping power, and the fans that remain run slowly.</w:t>
+      </w:r>
+    </w:p>
+    <w:p>
+      <w:pPr>
+        <w:jc w:val="center"/>
+      </w:pPr>
+      <w:r>
+        <w:rPr>
+          <w:i w:val="0"/>
+        </w:rPr>
+        <w:t>Q ∝ N,    Δp ∝ N²,    P_fan ∝ N³,    ΔL_W ≈ 50 log₁₀(N₂/N₁) dB</w:t>
+      </w:r>
+    </w:p>
+    <w:p>
+      <w:pPr>
+        <w:pStyle w:val="Heading2"/>
+      </w:pPr>
+      <w:r>
+        <w:rPr>
+          <w:i w:val="0"/>
+        </w:rPr>
+        <w:t>Worked Example 6.4</w:t>
+      </w:r>
+    </w:p>
+    <w:p>
+      <w:pPr/>
+      <w:r>
+        <w:rPr>
+          <w:b/>
+        </w:rPr>
+        <w:t xml:space="preserve">Problem. </w:t>
+      </w:r>
+      <w:r>
+        <w:rPr>
+          <w:i w:val="0"/>
+        </w:rPr>
+        <w:t>A server's fans draw 15 W each at 8000 rpm. To cool 20 % more heat at the same air temperature rise, the speed is raised to 9600 rpm. Find the new flow, pressure, fan power, and the change in sound power.</w:t>
+      </w:r>
+    </w:p>
+    <w:p>
+      <w:pPr/>
+      <w:r>
+        <w:rPr>
+          <w:b/>
+        </w:rPr>
+        <w:t xml:space="preserve">Solution. </w:t>
+      </w:r>
+      <w:r>
+        <w:rPr>
+          <w:i w:val="0"/>
+        </w:rPr>
+        <w:t>The flow rises by 20 %, which carries 20 % more heat. The pressure rises by 1.2² = 1.44, so 44 %. The fan power rises by 1.2³ = 1.73, to 25.9 W per fan, 73 % more for 20 % more cooling. The sound power rises by about 50 log₁₀(1.2) = 4.0 dB.</w:t>
+      </w:r>
+    </w:p>
+    <w:p>
       <w:pPr/>
       <w:r>
         <w:rPr>
@@ -3002,6 +3161,21 @@
       </w:r>
     </w:p>
     <w:p>
+      <w:pPr/>
+      <w:r>
+        <w:rPr>
+          <w:b/>
+        </w:rPr>
+        <w:t xml:space="preserve">8. </w:t>
+      </w:r>
+      <w:r>
+        <w:rPr>
+          <w:i w:val="0"/>
+        </w:rPr>
+        <w:t>By what factor does fan power rise if the speed doubles?</w:t>
+      </w:r>
+    </w:p>
+    <w:p>
       <w:pPr>
         <w:pStyle w:val="Heading1"/>
       </w:pPr>
@@ -3323,6 +3497,78 @@
       </w:r>
     </w:p>
     <w:p>
+      <w:pPr>
+        <w:pStyle w:val="Heading2"/>
+      </w:pPr>
+      <w:r>
+        <w:rPr>
+          <w:i w:val="0"/>
+        </w:rPr>
+        <w:t>7.6 Temperature and the frequency of a silicon resonator</w:t>
+      </w:r>
+    </w:p>
+    <w:p>
+      <w:pPr/>
+      <w:r>
+        <w:rPr>
+          <w:i w:val="0"/>
+        </w:rPr>
+        <w:t>Silicon becomes softer as it warms: its Young's modulus falls by about 60 ppm per kelvin, and because a resonator's frequency goes as the square root of stiffness, an uncompensated silicon resonator drifts by about −30 ppm/K. Over the industrial range of −40 to 85 °C that is several thousand parts per million, far outside the ±20 to ±50 ppm that timing applications need. MEMS oscillators deal with it in two ways. Passive compensation adds layers whose stiffness rises with temperature, such as silicon dioxide, or uses heavily doped silicon, flattening the curve to a few ppm over the range. Active compensation measures the temperature on the same die and corrects the output frequency with a fractional-N synthesizer, using a calibration table written at the factory. Quartz cut at the right angle is naturally flat, which is why quartz dominated timing for decades; MEMS won its place by combining compensation with small size and robustness to shock.</w:t>
+      </w:r>
+    </w:p>
+    <w:p>
+      <w:pPr>
+        <w:jc w:val="center"/>
+      </w:pPr>
+      <w:r>
+        <w:rPr>
+          <w:i w:val="0"/>
+        </w:rPr>
+        <w:t>TCf ≈ ½ TCE ≈ −30 ppm/K  (uncompensated silicon)</w:t>
+      </w:r>
+    </w:p>
+    <w:p>
+      <w:pPr>
+        <w:pStyle w:val="Heading2"/>
+      </w:pPr>
+      <w:r>
+        <w:rPr>
+          <w:i w:val="0"/>
+        </w:rPr>
+        <w:t>Worked Example 7.5</w:t>
+      </w:r>
+    </w:p>
+    <w:p>
+      <w:pPr/>
+      <w:r>
+        <w:rPr>
+          <w:b/>
+        </w:rPr>
+        <w:t xml:space="preserve">Problem. </w:t>
+      </w:r>
+      <w:r>
+        <w:rPr>
+          <w:i w:val="0"/>
+        </w:rPr>
+        <w:t>An uncompensated 32 MHz silicon resonator has TCf = −30 ppm/K. Find its total frequency change over −40 to 85 °C in ppm and in hertz. What residual linear coefficient would keep the total within ±20 ppm?</w:t>
+      </w:r>
+    </w:p>
+    <w:p>
+      <w:pPr/>
+      <w:r>
+        <w:rPr>
+          <w:b/>
+        </w:rPr>
+        <w:t xml:space="preserve">Solution. </w:t>
+      </w:r>
+      <w:r>
+        <w:rPr>
+          <w:i w:val="0"/>
+        </w:rPr>
+        <w:t>The span is 125 K, so the change is 125 × 30 = 3750 ppm, or 32 MHz × 3.75 × 10⁻³ = 120 kHz. A ±20 ppm total allows 40 ppm across 125 K, a residual of 0.32 ppm/K, about a hundred times flatter than the raw silicon, which is what compensation must achieve.</w:t>
+      </w:r>
+    </w:p>
+    <w:p>
       <w:pPr/>
       <w:r>
         <w:rPr>
@@ -3448,6 +3694,21 @@
       </w:r>
     </w:p>
     <w:p>
+      <w:pPr/>
+      <w:r>
+        <w:rPr>
+          <w:b/>
+        </w:rPr>
+        <w:t xml:space="preserve">8. </w:t>
+      </w:r>
+      <w:r>
+        <w:rPr>
+          <w:i w:val="0"/>
+        </w:rPr>
+        <w:t>Find the frequency change of a −30 ppm/K resonator over 0 to 70 °C.</w:t>
+      </w:r>
+    </w:p>
+    <w:p>
       <w:pPr>
         <w:pStyle w:val="Heading1"/>
       </w:pPr>
@@ -4175,6 +4436,78 @@
       </w:r>
     </w:p>
     <w:p>
+      <w:pPr>
+        <w:pStyle w:val="Heading2"/>
+      </w:pPr>
+      <w:r>
+        <w:rPr>
+          <w:i w:val="0"/>
+        </w:rPr>
+        <w:t>9.6 The bond wire as a low-pass filter</w:t>
+      </w:r>
+    </w:p>
+    <w:p>
+      <w:pPr/>
+      <w:r>
+        <w:rPr>
+          <w:i w:val="0"/>
+        </w:rPr>
+        <w:t>A series inductance in a matched line does not only reflect; it also slows the edge. Seen from the inductance, the line on each side is a resistance Z₀, so the inductance and the 2Z₀ around it form a first-order low-pass filter with time constant τ = L/(2Z₀) and a 10-90 % rise time of about 2.2τ. A wire bond of a couple of nanohenries in a 50 Ω path adds tens of picoseconds of rise time, comparable to the edge of a 25 Gbit/s signal, while a flip-chip bump of a tenth of a nanohenry adds almost nothing. This is the second reason, beside ground bounce, that high-speed parts use flip-chip packages, and why fast wire-bonded parts compensate the wire with added pad capacitance to form a low-pass ladder that is matched to 50 Ω over the band of interest.</w:t>
+      </w:r>
+    </w:p>
+    <w:p>
+      <w:pPr>
+        <w:jc w:val="center"/>
+      </w:pPr>
+      <w:r>
+        <w:rPr>
+          <w:i w:val="0"/>
+        </w:rPr>
+        <w:t>τ = L / (2Z₀),    t_r,added ≈ 2.2 τ</w:t>
+      </w:r>
+    </w:p>
+    <w:p>
+      <w:pPr>
+        <w:pStyle w:val="Heading2"/>
+      </w:pPr>
+      <w:r>
+        <w:rPr>
+          <w:i w:val="0"/>
+        </w:rPr>
+        <w:t>Worked Example 9.4</w:t>
+      </w:r>
+    </w:p>
+    <w:p>
+      <w:pPr/>
+      <w:r>
+        <w:rPr>
+          <w:b/>
+        </w:rPr>
+        <w:t xml:space="preserve">Problem. </w:t>
+      </w:r>
+      <w:r>
+        <w:rPr>
+          <w:i w:val="0"/>
+        </w:rPr>
+        <w:t>Find the added rise time of a 2 nH bond wire and of a 0.1 nH flip-chip bump in a 50 Ω path, and combine the bond wire's contribution with a 30 ps driver edge.</w:t>
+      </w:r>
+    </w:p>
+    <w:p>
+      <w:pPr/>
+      <w:r>
+        <w:rPr>
+          <w:b/>
+        </w:rPr>
+        <w:t xml:space="preserve">Solution. </w:t>
+      </w:r>
+      <w:r>
+        <w:rPr>
+          <w:i w:val="0"/>
+        </w:rPr>
+        <w:t>For the wire, τ = 2 nH / 100 Ω = 20 ps, so it adds about 44 ps. For the bump, τ = 1 ps, adding about 2.2 ps. Rise times of cascaded stages add roughly as the root of the sum of squares: √(30² + 44²) = 53 ps, so the bond wire nearly doubles the edge.</w:t>
+      </w:r>
+    </w:p>
+    <w:p>
       <w:pPr/>
       <w:r>
         <w:rPr>
@@ -4300,6 +4633,21 @@
       </w:r>
     </w:p>
     <w:p>
+      <w:pPr/>
+      <w:r>
+        <w:rPr>
+          <w:b/>
+        </w:rPr>
+        <w:t xml:space="preserve">8. </w:t>
+      </w:r>
+      <w:r>
+        <w:rPr>
+          <w:i w:val="0"/>
+        </w:rPr>
+        <w:t>Find the added rise time of a 1 nH series inductance in a 50 Ω line.</w:t>
+      </w:r>
+    </w:p>
+    <w:p>
       <w:pPr>
         <w:pStyle w:val="Heading1"/>
       </w:pPr>
@@ -4591,6 +4939,78 @@
       </w:r>
     </w:p>
     <w:p>
+      <w:pPr>
+        <w:pStyle w:val="Heading2"/>
+      </w:pPr>
+      <w:r>
+        <w:rPr>
+          <w:i w:val="0"/>
+        </w:rPr>
+        <w:t>10.6 Accelerated life tests and the Arrhenius factor</w:t>
+      </w:r>
+    </w:p>
+    <w:p>
+      <w:pPr/>
+      <w:r>
+        <w:rPr>
+          <w:i w:val="0"/>
+        </w:rPr>
+        <w:t>A product meant to last ten years cannot be tested for ten years, so reliability engineers run it hot and scale the result. For failure mechanisms driven by thermally activated chemistry, the rate rises with temperature as exp(−Ea/kBT), and the acceleration factor between a stress temperature Ts and a use temperature Tu is AF = exp[(Ea/kB)(1/Tu − 1/Ts)], with temperatures in kelvin. The standard high-temperature operating life test, HTOL, runs parts at 125 °C for 1000 hours under bias. The result depends strongly on the activation energy assumed, typically 0.7 eV for generic semiconductor mechanisms, and is meaningful only for mechanisms that the test actually activates. Solder fatigue, Section 10.2, needs temperature cycling instead, and moisture needs humidity tests, so a qualification plan combines several stresses rather than one.</w:t>
+      </w:r>
+    </w:p>
+    <w:p>
+      <w:pPr>
+        <w:jc w:val="center"/>
+      </w:pPr>
+      <w:r>
+        <w:rPr>
+          <w:i w:val="0"/>
+        </w:rPr>
+        <w:t>AF = exp[(Ea / kB)(1/Tu − 1/Ts)],    kB = 8.617 × 10⁻⁵ eV/K</w:t>
+      </w:r>
+    </w:p>
+    <w:p>
+      <w:pPr>
+        <w:pStyle w:val="Heading2"/>
+      </w:pPr>
+      <w:r>
+        <w:rPr>
+          <w:i w:val="0"/>
+        </w:rPr>
+        <w:t>Worked Example 10.4</w:t>
+      </w:r>
+    </w:p>
+    <w:p>
+      <w:pPr/>
+      <w:r>
+        <w:rPr>
+          <w:b/>
+        </w:rPr>
+        <w:t xml:space="preserve">Problem. </w:t>
+      </w:r>
+      <w:r>
+        <w:rPr>
+          <w:i w:val="0"/>
+        </w:rPr>
+        <w:t>A 1000 hour HTOL test runs at 125 °C. With Ea = 0.7 eV, what use time at 55 °C does it represent?</w:t>
+      </w:r>
+    </w:p>
+    <w:p>
+      <w:pPr/>
+      <w:r>
+        <w:rPr>
+          <w:b/>
+        </w:rPr>
+        <w:t xml:space="preserve">Solution. </w:t>
+      </w:r>
+      <w:r>
+        <w:rPr>
+          <w:i w:val="0"/>
+        </w:rPr>
+        <w:t>Tu = 328.15 K and Ts = 398.15 K, so 1/Tu − 1/Ts = 5.36 × 10⁻⁴ K⁻¹. Ea/kB = 0.7/(8.617 × 10⁻⁵) = 8124 K. AF = exp(8124 × 5.36 × 10⁻⁴) = exp(4.35) = 78. The test represents about 78,000 hours, close to nine years at 55 °C, for the mechanisms with that activation energy.</w:t>
+      </w:r>
+    </w:p>
+    <w:p>
       <w:pPr/>
       <w:r>
         <w:rPr>
@@ -4716,6 +5136,21 @@
       </w:r>
     </w:p>
     <w:p>
+      <w:pPr/>
+      <w:r>
+        <w:rPr>
+          <w:b/>
+        </w:rPr>
+        <w:t xml:space="preserve">8. </w:t>
+      </w:r>
+      <w:r>
+        <w:rPr>
+          <w:i w:val="0"/>
+        </w:rPr>
+        <w:t>Find the acceleration factor between 85 °C and 125 °C for Ea = 0.7 eV.</w:t>
+      </w:r>
+    </w:p>
+    <w:p>
       <w:pPr>
         <w:pStyle w:val="Heading1"/>
       </w:pPr>
@@ -5007,6 +5442,78 @@
       </w:r>
     </w:p>
     <w:p>
+      <w:pPr>
+        <w:pStyle w:val="Heading2"/>
+      </w:pPr>
+      <w:r>
+        <w:rPr>
+          <w:i w:val="0"/>
+        </w:rPr>
+        <w:t>11.6 DC bias and the capacitance you actually get</w:t>
+      </w:r>
+    </w:p>
+    <w:p>
+      <w:pPr/>
+      <w:r>
+        <w:rPr>
+          <w:i w:val="0"/>
+        </w:rPr>
+        <w:t>A ceramic capacitor's marked value is measured with almost no DC voltage across it. The high-permittivity dielectrics of X5R and X7R parts are ferroelectric, and their permittivity falls as the DC field rises, so a small, high-value part operated near its rated voltage may keep only a third or half of its marked capacitance. The loss is worst for small case sizes and thin dielectric layers, and the manufacturers publish curves of capacitance against DC bias for each part. The temperature characteristic is a separate allowance: X7R promises ±15 % from −55 to 125 °C, X5R the same to 85 °C, and C0G almost no change at all but much lower values. For the 0.8 V core rails of this chapter the bias loss is small, but for 12 V and 48 V input capacitors it dominates the count, and a design that counts marked microfarads will have half the capacitance it thinks it has.</w:t>
+      </w:r>
+    </w:p>
+    <w:p>
+      <w:pPr>
+        <w:jc w:val="center"/>
+      </w:pPr>
+      <w:r>
+        <w:rPr>
+          <w:i w:val="0"/>
+        </w:rPr>
+        <w:t>C_effective = C_nominal × k_bias × k_temperature</w:t>
+      </w:r>
+    </w:p>
+    <w:p>
+      <w:pPr>
+        <w:pStyle w:val="Heading2"/>
+      </w:pPr>
+      <w:r>
+        <w:rPr>
+          <w:i w:val="0"/>
+        </w:rPr>
+        <w:t>Worked Example 11.4</w:t>
+      </w:r>
+    </w:p>
+    <w:p>
+      <w:pPr/>
+      <w:r>
+        <w:rPr>
+          <w:b/>
+        </w:rPr>
+        <w:t xml:space="preserve">Problem. </w:t>
+      </w:r>
+      <w:r>
+        <w:rPr>
+          <w:i w:val="0"/>
+        </w:rPr>
+        <w:t>A 12 V regulator input needs 100 µF of effective capacitance. The chosen 10 µF, 25 V, 0805 X7R part keeps 40 % of its value at 12 V, and the design must allow a further 15 % loss over temperature. How many parts are needed?</w:t>
+      </w:r>
+    </w:p>
+    <w:p>
+      <w:pPr/>
+      <w:r>
+        <w:rPr>
+          <w:b/>
+        </w:rPr>
+        <w:t xml:space="preserve">Solution. </w:t>
+      </w:r>
+      <w:r>
+        <w:rPr>
+          <w:i w:val="0"/>
+        </w:rPr>
+        <w:t>Each part gives 10 × 0.40 × 0.85 = 3.4 µF at 12 V in the worst-case temperature, so 100/3.4 = 29.4, and 30 parts are needed, three times the ten that the marked value suggests. A larger case size or a 50 V part with thicker layers keeps more of its value and may need fewer parts in the same board area.</w:t>
+      </w:r>
+    </w:p>
+    <w:p>
       <w:pPr/>
       <w:r>
         <w:rPr>
@@ -5132,6 +5639,21 @@
       </w:r>
     </w:p>
     <w:p>
+      <w:pPr/>
+      <w:r>
+        <w:rPr>
+          <w:b/>
+        </w:rPr>
+        <w:t xml:space="preserve">8. </w:t>
+      </w:r>
+      <w:r>
+        <w:rPr>
+          <w:i w:val="0"/>
+        </w:rPr>
+        <w:t>A 22 µF part keeps 35 % of its value at its working voltage. What effective capacitance does it provide, ignoring temperature?</w:t>
+      </w:r>
+    </w:p>
+    <w:p>
       <w:pPr>
         <w:pStyle w:val="Heading1"/>
       </w:pPr>
@@ -5391,6 +5913,78 @@
       </w:r>
     </w:p>
     <w:p>
+      <w:pPr>
+        <w:pStyle w:val="Heading2"/>
+      </w:pPr>
+      <w:r>
+        <w:rPr>
+          <w:i w:val="0"/>
+        </w:rPr>
+        <w:t>12.7 Board thickness and the via aspect ratio</w:t>
+      </w:r>
+    </w:p>
+    <w:p>
+      <w:pPr/>
+      <w:r>
+        <w:rPr>
+          <w:i w:val="0"/>
+        </w:rPr>
+        <w:t>A stack-up is a thickness budget as well as an impedance plan. The finished thickness is the sum of the copper layers, the cores and prepregs between them, and the plating and solder mask on the outside, and it must match the connectors, card guides, and press-fit pins the board will use. That thickness also limits the smallest through-hole via: plating chemistry can deposit copper reliably down a hole only up to a certain ratio of depth to diameter, typically about 10:1 for standard production, and higher only at a cost premium. A thick backplane therefore needs larger drills, which take routing space, or blind, buried, and back-drilled vias that avoid drilling through the whole board. Adding layers to gain routing channels makes the board thicker, which forces larger vias, which consume some of the channels gained, a trade that the stack-up designer must close before layout begins.</w:t>
+      </w:r>
+    </w:p>
+    <w:p>
+      <w:pPr>
+        <w:jc w:val="center"/>
+      </w:pPr>
+      <w:r>
+        <w:rPr>
+          <w:i w:val="0"/>
+        </w:rPr>
+        <w:t>thickness ≈ Σ t_copper + Σ t_dielectric + t_outer,    aspect ratio = thickness / drill diameter</w:t>
+      </w:r>
+    </w:p>
+    <w:p>
+      <w:pPr>
+        <w:pStyle w:val="Heading2"/>
+      </w:pPr>
+      <w:r>
+        <w:rPr>
+          <w:i w:val="0"/>
+        </w:rPr>
+        <w:t>Worked Example 12.3</w:t>
+      </w:r>
+    </w:p>
+    <w:p>
+      <w:pPr/>
+      <w:r>
+        <w:rPr>
+          <w:b/>
+        </w:rPr>
+        <w:t xml:space="preserve">Problem. </w:t>
+      </w:r>
+      <w:r>
+        <w:rPr>
+          <w:i w:val="0"/>
+        </w:rPr>
+        <w:t>A 16-layer board has six plane layers of 35 µm copper, ten signal layers of 18 µm, fifteen dielectric layers of 0.10 mm, and about 0.10 mm of outer plating and mask. Find its thickness and the via aspect ratio for 0.20 mm and 0.25 mm drills.</w:t>
+      </w:r>
+    </w:p>
+    <w:p>
+      <w:pPr/>
+      <w:r>
+        <w:rPr>
+          <w:b/>
+        </w:rPr>
+        <w:t xml:space="preserve">Solution. </w:t>
+      </w:r>
+      <w:r>
+        <w:rPr>
+          <w:i w:val="0"/>
+        </w:rPr>
+        <w:t>Copper: 6 × 0.035 + 10 × 0.018 = 0.39 mm. Dielectric: 1.50 mm. Total: 0.39 + 1.50 + 0.10 = 1.99 mm, about 2.0 mm. With a 0.20 mm drill the aspect ratio is 10:1, at the limit of standard production; a 0.25 mm drill gives 8:1, comfortably inside it.</w:t>
+      </w:r>
+    </w:p>
+    <w:p>
       <w:pPr/>
       <w:r>
         <w:rPr>
@@ -5516,6 +6110,21 @@
       </w:r>
     </w:p>
     <w:p>
+      <w:pPr/>
+      <w:r>
+        <w:rPr>
+          <w:b/>
+        </w:rPr>
+        <w:t xml:space="preserve">8. </w:t>
+      </w:r>
+      <w:r>
+        <w:rPr>
+          <w:i w:val="0"/>
+        </w:rPr>
+        <w:t>What is the smallest drill for a 3.2 mm backplane at a 10:1 aspect ratio?</w:t>
+      </w:r>
+    </w:p>
+    <w:p>
       <w:pPr>
         <w:pStyle w:val="Heading1"/>
       </w:pPr>
@@ -5827,6 +6436,78 @@
       </w:r>
     </w:p>
     <w:p>
+      <w:pPr>
+        <w:pStyle w:val="Heading2"/>
+      </w:pPr>
+      <w:r>
+        <w:rPr>
+          <w:i w:val="0"/>
+        </w:rPr>
+        <w:t>13.7 Adding up many aggressors</w:t>
+      </w:r>
+    </w:p>
+    <w:p>
+      <w:pPr/>
+      <w:r>
+        <w:rPr>
+          <w:i w:val="0"/>
+        </w:rPr>
+        <w:t>A victim trace in a dense bus has neighbors on both sides and more beyond them, and each contributes crosstalk. The worst-case budget adds their amplitudes, assuming every aggressor switches in the direction that hurts the victim at the same instant. For many aggressors with independent data that worst case is rare, and a statistical budget adds their contributions as the root of the sum of squares, which is smaller. Which one is right depends on the error rate required and the data patterns: a parallel memory bus whose lines switch together on the same clock edge can approach the linear sum, while independent serial lanes behave closer to the statistical one. Channel tools such as COM, Section 14.5, model crosstalk statistically and fold it into the noise that sets the error rate.</w:t>
+      </w:r>
+    </w:p>
+    <w:p>
+      <w:pPr>
+        <w:jc w:val="center"/>
+      </w:pPr>
+      <w:r>
+        <w:rPr>
+          <w:i w:val="0"/>
+        </w:rPr>
+        <w:t>worst case: X = Σ|xᵢ|;    statistical: X = √(Σ xᵢ²)</w:t>
+      </w:r>
+    </w:p>
+    <w:p>
+      <w:pPr>
+        <w:pStyle w:val="Heading2"/>
+      </w:pPr>
+      <w:r>
+        <w:rPr>
+          <w:i w:val="0"/>
+        </w:rPr>
+        <w:t>Worked Example 13.4</w:t>
+      </w:r>
+    </w:p>
+    <w:p>
+      <w:pPr/>
+      <w:r>
+        <w:rPr>
+          <w:b/>
+        </w:rPr>
+        <w:t xml:space="preserve">Problem. </w:t>
+      </w:r>
+      <w:r>
+        <w:rPr>
+          <w:i w:val="0"/>
+        </w:rPr>
+        <w:t>A victim has two adjacent aggressors that each couple 2 % and two next-nearest aggressors that each couple 0.5 %. Find the worst-case and statistical crosstalk, and the worst-case noise on an 800 mV swing.</w:t>
+      </w:r>
+    </w:p>
+    <w:p>
+      <w:pPr/>
+      <w:r>
+        <w:rPr>
+          <w:b/>
+        </w:rPr>
+        <w:t xml:space="preserve">Solution. </w:t>
+      </w:r>
+      <w:r>
+        <w:rPr>
+          <w:i w:val="0"/>
+        </w:rPr>
+        <w:t>Worst case: 2 + 2 + 0.5 + 0.5 = 5.0 %, or 40 mV on 800 mV. Statistical: √(2 × 0.02² + 2 × 0.005²) = √(0.00085) = 2.9 %, or 23 mV. The two nearest neighbors dominate both sums, so widening their spacing, Section 13.6, buys most of the improvement.</w:t>
+      </w:r>
+    </w:p>
+    <w:p>
       <w:pPr/>
       <w:r>
         <w:rPr>
@@ -5952,6 +6633,21 @@
       </w:r>
     </w:p>
     <w:p>
+      <w:pPr/>
+      <w:r>
+        <w:rPr>
+          <w:b/>
+        </w:rPr>
+        <w:t xml:space="preserve">8. </w:t>
+      </w:r>
+      <w:r>
+        <w:rPr>
+          <w:i w:val="0"/>
+        </w:rPr>
+        <w:t>Four aggressors each couple 1 %. Find the worst-case and statistical crosstalk.</w:t>
+      </w:r>
+    </w:p>
+    <w:p>
       <w:pPr>
         <w:pStyle w:val="Heading1"/>
       </w:pPr>
@@ -6273,6 +6969,78 @@
       </w:r>
     </w:p>
     <w:p>
+      <w:pPr>
+        <w:pStyle w:val="Heading2"/>
+      </w:pPr>
+      <w:r>
+        <w:rPr>
+          <w:i w:val="0"/>
+        </w:rPr>
+        <w:t>14.6 Jitter and the timing budget</w:t>
+      </w:r>
+    </w:p>
+    <w:p>
+      <w:pPr/>
+      <w:r>
+        <w:rPr>
+          <w:i w:val="0"/>
+        </w:rPr>
+        <w:t>Noise closes the eye vertically; jitter closes it horizontally. Jitter is the deviation of each transition from its ideal time, and it is split into two kinds. Random jitter, RJ, comes from thermal and phase noise, is Gaussian, and is specified by its rms value; because a Gaussian has no bound, its contribution grows with the number of bits observed. Deterministic jitter, DJ, comes from bandwidth limits, reflections, crosstalk, and duty-cycle distortion, and is bounded. The dual-Dirac model combines them at a target bit error ratio as TJ = DJ + 2Q·RJ, where Q is the number of standard deviations that corresponds to that error ratio: 7.03 for 10⁻¹² and 4.75 for 10⁻⁶. Forward error correction, Section 14.4, lets PAM4 links run at raw error ratios near 10⁻⁵ or 10⁻⁶, which shrinks the random-jitter allowance substantially.</w:t>
+      </w:r>
+    </w:p>
+    <w:p>
+      <w:pPr>
+        <w:jc w:val="center"/>
+      </w:pPr>
+      <w:r>
+        <w:rPr>
+          <w:i w:val="0"/>
+        </w:rPr>
+        <w:t>TJ(BER) = DJ + 2 Q(BER) RJ,    Q(10⁻¹²) = 7.03,    Q(10⁻⁶) = 4.75</w:t>
+      </w:r>
+    </w:p>
+    <w:p>
+      <w:pPr>
+        <w:pStyle w:val="Heading2"/>
+      </w:pPr>
+      <w:r>
+        <w:rPr>
+          <w:i w:val="0"/>
+        </w:rPr>
+        <w:t>Worked Example 14.5</w:t>
+      </w:r>
+    </w:p>
+    <w:p>
+      <w:pPr/>
+      <w:r>
+        <w:rPr>
+          <w:b/>
+        </w:rPr>
+        <w:t xml:space="preserve">Problem. </w:t>
+      </w:r>
+      <w:r>
+        <w:rPr>
+          <w:i w:val="0"/>
+        </w:rPr>
+        <w:t>A 106.25 Gbit/s PAM4 lane runs at 53.125 GBd. Its transmitter has RJ = 0.3 ps rms and DJ = 3 ps. Find the unit interval, and the total jitter at error ratios of 10⁻¹² and 10⁻⁶ as fractions of the unit interval.</w:t>
+      </w:r>
+    </w:p>
+    <w:p>
+      <w:pPr/>
+      <w:r>
+        <w:rPr>
+          <w:b/>
+        </w:rPr>
+        <w:t xml:space="preserve">Solution. </w:t>
+      </w:r>
+      <w:r>
+        <w:rPr>
+          <w:i w:val="0"/>
+        </w:rPr>
+        <w:t>UI = 1/53.125 GHz = 18.8 ps. At 10⁻¹², TJ = 3 + 2 × 7.03 × 0.3 = 7.2 ps, 38 % of the UI. At 10⁻⁶, TJ = 3 + 2 × 4.75 × 0.3 = 5.9 ps, 31 %. The FEC's tolerance of a higher raw error ratio returns about 1.3 ps of timing margin.</w:t>
+      </w:r>
+    </w:p>
+    <w:p>
       <w:pPr/>
       <w:r>
         <w:rPr>
@@ -6398,6 +7166,21 @@
       </w:r>
     </w:p>
     <w:p>
+      <w:pPr/>
+      <w:r>
+        <w:rPr>
+          <w:b/>
+        </w:rPr>
+        <w:t xml:space="preserve">8. </w:t>
+      </w:r>
+      <w:r>
+        <w:rPr>
+          <w:i w:val="0"/>
+        </w:rPr>
+        <w:t>Find TJ at 10⁻¹² for RJ = 0.2 ps and DJ = 2 ps.</w:t>
+      </w:r>
+    </w:p>
+    <w:p>
       <w:pPr>
         <w:pStyle w:val="Heading1"/>
       </w:pPr>
@@ -6678,6 +7461,78 @@
       </w:r>
     </w:p>
     <w:p>
+      <w:pPr>
+        <w:pStyle w:val="Heading2"/>
+      </w:pPr>
+      <w:r>
+        <w:rPr>
+          <w:i w:val="0"/>
+        </w:rPr>
+        <w:t>15.6 The external laser source</w:t>
+      </w:r>
+    </w:p>
+    <w:p>
+      <w:pPr/>
+      <w:r>
+        <w:rPr>
+          <w:i w:val="0"/>
+        </w:rPr>
+        <w:t>Lasers are the least heat-tolerant part of an optical link: their efficiency and lifetime fall as they warm, and the inside of a switch package running near 100 °C is a poor place for them. Most co-packaged optics designs therefore keep the lasers outside, in an external laser source, a pluggable module at the cool front panel that sends continuous light through fibers to the modulators in the package. The source can then be replaced in the field like a transceiver, and one laser can be split among several lanes. The price is optical loss in the extra fibers and connectors, which the laser must make up with more output power, and the wall-plug efficiency of the laser, often 10 to 20 % including its drive and temperature control, turns that extra light into several watts of electrical power.</w:t>
+      </w:r>
+    </w:p>
+    <w:p>
+      <w:pPr>
+        <w:jc w:val="center"/>
+      </w:pPr>
+      <w:r>
+        <w:rPr>
+          <w:i w:val="0"/>
+        </w:rPr>
+        <w:t>P_electrical = N × P_lane / (η_coupling × η_wall-plug)</w:t>
+      </w:r>
+    </w:p>
+    <w:p>
+      <w:pPr>
+        <w:pStyle w:val="Heading2"/>
+      </w:pPr>
+      <w:r>
+        <w:rPr>
+          <w:i w:val="0"/>
+        </w:rPr>
+        <w:t>Worked Example 15.4</w:t>
+      </w:r>
+    </w:p>
+    <w:p>
+      <w:pPr/>
+      <w:r>
+        <w:rPr>
+          <w:b/>
+        </w:rPr>
+        <w:t xml:space="preserve">Problem. </w:t>
+      </w:r>
+      <w:r>
+        <w:rPr>
+          <w:i w:val="0"/>
+        </w:rPr>
+        <w:t>An external laser source feeds 16 lanes, each needing 20 mW of light at the modulator. The path from the laser to the modulator loses 3 dB, and the laser's wall-plug efficiency is 15 %. Find the electrical power, and the energy per bit if each lane carries 200 Gbit/s.</w:t>
+      </w:r>
+    </w:p>
+    <w:p>
+      <w:pPr/>
+      <w:r>
+        <w:rPr>
+          <w:b/>
+        </w:rPr>
+        <w:t xml:space="preserve">Solution. </w:t>
+      </w:r>
+      <w:r>
+        <w:rPr>
+          <w:i w:val="0"/>
+        </w:rPr>
+        <w:t>The laser must emit 16 × 20 mW / 0.5 = 640 mW of light, and at 15 % efficiency it draws 640/0.15 = 4.3 W. The lanes carry 3.2 Tbit/s, so the laser costs 4.3/3.2 × 10¹² = 1.3 pJ/bit, about a quarter of a 5 pJ/bit co-packaged budget, which is why every decibel of coupling loss matters.</w:t>
+      </w:r>
+    </w:p>
+    <w:p>
       <w:pPr/>
       <w:r>
         <w:rPr>
@@ -6803,6 +7658,21 @@
       </w:r>
     </w:p>
     <w:p>
+      <w:pPr/>
+      <w:r>
+        <w:rPr>
+          <w:b/>
+        </w:rPr>
+        <w:t xml:space="preserve">8. </w:t>
+      </w:r>
+      <w:r>
+        <w:rPr>
+          <w:i w:val="0"/>
+        </w:rPr>
+        <w:t>How much electrical power does the laser of the example draw if the path loss improves to 2 dB?</w:t>
+      </w:r>
+    </w:p>
+    <w:p>
       <w:pPr>
         <w:pStyle w:val="Heading1"/>
       </w:pPr>
@@ -7094,6 +7964,78 @@
       </w:r>
     </w:p>
     <w:p>
+      <w:pPr>
+        <w:pStyle w:val="Heading2"/>
+      </w:pPr>
+      <w:r>
+        <w:rPr>
+          <w:i w:val="0"/>
+        </w:rPr>
+        <w:t>16.6 The magnetometer and hard-iron error</w:t>
+      </w:r>
+    </w:p>
+    <w:p>
+      <w:pPr/>
+      <w:r>
+        <w:rPr>
+          <w:i w:val="0"/>
+        </w:rPr>
+        <w:t>A gyroscope's heading drifts without bound, and the cheapest absolute heading reference is a three-axis magnetometer measuring the Earth's field. Its horizontal component is only about 15 to 30 µT at mid-latitudes, and anything magnetic on the board or in the product adds to it. A permanent offset, from magnetized steel parts, speaker magnets, or steady currents in nearby traces, is called hard-iron error and shifts the measured field by a fixed vector; soft-iron error, from permeable material that bends the Earth's field, distorts the circle traced by a rotating sensor into an ellipse. Both are removed by calibration: rotating the product through many orientations and fitting the offset and the ellipse. Motor currents in a robot or battery currents in a phone change with operation and cannot be calibrated away, so the magnetometer is placed far from them and the fusion filter of Section 16.3 trusts it less when they are large.</w:t>
+      </w:r>
+    </w:p>
+    <w:p>
+      <w:pPr>
+        <w:jc w:val="center"/>
+      </w:pPr>
+      <w:r>
+        <w:rPr>
+          <w:i w:val="0"/>
+        </w:rPr>
+        <w:t>heading error ≈ arctan(B_offset / H_horizontal)  (offset perpendicular to the field)</w:t>
+      </w:r>
+    </w:p>
+    <w:p>
+      <w:pPr>
+        <w:pStyle w:val="Heading2"/>
+      </w:pPr>
+      <w:r>
+        <w:rPr>
+          <w:i w:val="0"/>
+        </w:rPr>
+        <w:t>Worked Example 16.4</w:t>
+      </w:r>
+    </w:p>
+    <w:p>
+      <w:pPr/>
+      <w:r>
+        <w:rPr>
+          <w:b/>
+        </w:rPr>
+        <w:t xml:space="preserve">Problem. </w:t>
+      </w:r>
+      <w:r>
+        <w:rPr>
+          <w:i w:val="0"/>
+        </w:rPr>
+        <w:t>The Earth's horizontal field is 20 µT. A trace 10 mm from the magnetometer carries a steady 1 A. Find the field it produces and the worst-case heading error if that field is perpendicular to the Earth's.</w:t>
+      </w:r>
+    </w:p>
+    <w:p>
+      <w:pPr/>
+      <w:r>
+        <w:rPr>
+          <w:b/>
+        </w:rPr>
+        <w:t xml:space="preserve">Solution. </w:t>
+      </w:r>
+      <w:r>
+        <w:rPr>
+          <w:i w:val="0"/>
+        </w:rPr>
+        <w:t>A long straight current produces B = µ₀I/(2πr) = 4π × 10⁻⁷ × 1/(2π × 0.01) = 20 µT, as large as the Earth's horizontal field, giving a heading error of arctan(1) = 45°. At 100 mm the field falls to 2 µT and the error to arctan(0.1) = 5.7°, which is why power traces are kept well away from compasses.</w:t>
+      </w:r>
+    </w:p>
+    <w:p>
       <w:pPr/>
       <w:r>
         <w:rPr>
@@ -7219,6 +8161,21 @@
       </w:r>
     </w:p>
     <w:p>
+      <w:pPr/>
+      <w:r>
+        <w:rPr>
+          <w:b/>
+        </w:rPr>
+        <w:t xml:space="preserve">8. </w:t>
+      </w:r>
+      <w:r>
+        <w:rPr>
+          <w:i w:val="0"/>
+        </w:rPr>
+        <w:t>What heading error does a 1 µT perpendicular offset cause in a 20 µT horizontal field?</w:t>
+      </w:r>
+    </w:p>
+    <w:p>
       <w:pPr>
         <w:pStyle w:val="Heading1"/>
       </w:pPr>
@@ -7571,6 +8528,78 @@
       </w:r>
     </w:p>
     <w:p>
+      <w:pPr>
+        <w:pStyle w:val="Heading2"/>
+      </w:pPr>
+      <w:r>
+        <w:rPr>
+          <w:i w:val="0"/>
+        </w:rPr>
+        <w:t>17.7 What a TSV costs in energy</w:t>
+      </w:r>
+    </w:p>
+    <w:p>
+      <w:pPr/>
+      <w:r>
+        <w:rPr>
+          <w:i w:val="0"/>
+        </w:rPr>
+        <w:t>Moving a bit through a through-silicon via is cheap compared with moving it off the stack. A TSV is a short vertical wire with a capacitance of a few tens of femtofarads to the surrounding silicon, set by its diameter, length, and the thickness of its oxide liner, and the small drivers and receivers at each end add a little more. The energy per bit is roughly αCV², where α is the probability that the line switches upward on a given bit, about a quarter to a half for random data depending on the convention, and V is the swing. Because the swing inside the stack can be low and the capacitance is small, the vertical links consume a fraction of a watt even at the full stack bandwidth, while the interface to the processor, Section 17.4, costs tens of watts. The energy of a memory system lives in the horizontal links and the DRAM arrays, not in the vertical wiring.</w:t>
+      </w:r>
+    </w:p>
+    <w:p>
+      <w:pPr>
+        <w:jc w:val="center"/>
+      </w:pPr>
+      <w:r>
+        <w:rPr>
+          <w:i w:val="0"/>
+        </w:rPr>
+        <w:t>E_bit ≈ α C V²</w:t>
+      </w:r>
+    </w:p>
+    <w:p>
+      <w:pPr>
+        <w:pStyle w:val="Heading2"/>
+      </w:pPr>
+      <w:r>
+        <w:rPr>
+          <w:i w:val="0"/>
+        </w:rPr>
+        <w:t>Worked Example 17.5</w:t>
+      </w:r>
+    </w:p>
+    <w:p>
+      <w:pPr/>
+      <w:r>
+        <w:rPr>
+          <w:b/>
+        </w:rPr>
+        <w:t xml:space="preserve">Problem. </w:t>
+      </w:r>
+      <w:r>
+        <w:rPr>
+          <w:i w:val="0"/>
+        </w:rPr>
+        <w:t>A TSV and its driver and receiver present 60 fF, the swing is 0.75 V, and α = 0.5. Find the energy per bit and the power at the stack's 2.8 TB/s, and compare it with the 2 pJ/bit interface.</w:t>
+      </w:r>
+    </w:p>
+    <w:p>
+      <w:pPr/>
+      <w:r>
+        <w:rPr>
+          <w:b/>
+        </w:rPr>
+        <w:t xml:space="preserve">Solution. </w:t>
+      </w:r>
+      <w:r>
+        <w:rPr>
+          <w:i w:val="0"/>
+        </w:rPr>
+        <w:t>E = 0.5 × 60 × 10⁻¹⁵ × 0.75² = 17 fJ/bit. At 2.8 TB/s = 2.24 × 10¹³ bit/s the TSVs take 0.38 W, while the interface at 2 pJ/bit takes 45 W, more than a hundred times as much.</w:t>
+      </w:r>
+    </w:p>
+    <w:p>
       <w:pPr/>
       <w:r>
         <w:rPr>
@@ -7696,6 +8725,21 @@
       </w:r>
     </w:p>
     <w:p>
+      <w:pPr/>
+      <w:r>
+        <w:rPr>
+          <w:b/>
+        </w:rPr>
+        <w:t xml:space="preserve">8. </w:t>
+      </w:r>
+      <w:r>
+        <w:rPr>
+          <w:i w:val="0"/>
+        </w:rPr>
+        <w:t>Find the energy per bit of a 40 fF TSV at 0.5 V swing with α = 0.5.</w:t>
+      </w:r>
+    </w:p>
+    <w:p>
       <w:pPr>
         <w:pStyle w:val="Heading1"/>
       </w:pPr>
@@ -8028,6 +9072,78 @@
       </w:r>
     </w:p>
     <w:p>
+      <w:pPr>
+        <w:pStyle w:val="Heading2"/>
+      </w:pPr>
+      <w:r>
+        <w:rPr>
+          <w:i w:val="0"/>
+        </w:rPr>
+        <w:t>18.6 Closing the link: path loss at millimeter waves</w:t>
+      </w:r>
+    </w:p>
+    <w:p>
+      <w:pPr/>
+      <w:r>
+        <w:rPr>
+          <w:i w:val="0"/>
+        </w:rPr>
+        <w:t>Large arrays exist because millimeter-wave links lose so much in free space. The Friis free-space path loss between isotropic antennas is 20 log₁₀(4πd/λ), which grows with frequency for a fixed antenna gain, and at 60 GHz oxygen adds about 15 dB per kilometer, negligible indoors but decisive over hundreds of meters. The received power is the EIRP minus the path loss plus the receive antenna gain, and the signal-to-noise ratio follows from the thermal noise floor, −174 dBm/Hz plus 10 log₁₀ of the bandwidth plus the receiver noise figure. Because the noise grows with the very wide channels that make millimeter waves attractive, a link of a few gigahertz needs tens of decibels of array gain to work beyond a few meters, and any loss between the radio chip and the antenna, the subject of Section 18.1, comes straight off the margin.</w:t>
+      </w:r>
+    </w:p>
+    <w:p>
+      <w:pPr>
+        <w:jc w:val="center"/>
+      </w:pPr>
+      <w:r>
+        <w:rPr>
+          <w:i w:val="0"/>
+        </w:rPr>
+        <w:t>FSPL = 20 log₁₀(4π d / λ),    P_r = EIRP − FSPL + G_r,    N = −174 + 10 log₁₀ B + NF  (dBm)</w:t>
+      </w:r>
+    </w:p>
+    <w:p>
+      <w:pPr>
+        <w:pStyle w:val="Heading2"/>
+      </w:pPr>
+      <w:r>
+        <w:rPr>
+          <w:i w:val="0"/>
+        </w:rPr>
+        <w:t>Worked Example 18.5</w:t>
+      </w:r>
+    </w:p>
+    <w:p>
+      <w:pPr/>
+      <w:r>
+        <w:rPr>
+          <w:b/>
+        </w:rPr>
+        <w:t xml:space="preserve">Problem. </w:t>
+      </w:r>
+      <w:r>
+        <w:rPr>
+          <w:i w:val="0"/>
+        </w:rPr>
+        <w:t>The 39.1 dBm EIRP array of Worked Example 18.3 transmits at 60 GHz to a receiver 10 m away with 10 dBi of gain, a 2 GHz bandwidth, and a 7 dB noise figure. Find the path loss, the received power, and the signal-to-noise ratio.</w:t>
+      </w:r>
+    </w:p>
+    <w:p>
+      <w:pPr/>
+      <w:r>
+        <w:rPr>
+          <w:b/>
+        </w:rPr>
+        <w:t xml:space="preserve">Solution. </w:t>
+      </w:r>
+      <w:r>
+        <w:rPr>
+          <w:i w:val="0"/>
+        </w:rPr>
+        <w:t>λ = 5 mm, so FSPL = 20 log₁₀(4π × 10/0.005) = 20 log₁₀(25,133) = 88.0 dB; oxygen adds only 0.15 dB. P_r = 39.1 − 88.0 + 10 = −38.9 dBm. The noise is −174 + 93.0 + 7 = −74.0 dBm, so the SNR is about 35 dB, enough for high-order modulation with margin for blockage.</w:t>
+      </w:r>
+    </w:p>
+    <w:p>
       <w:pPr/>
       <w:r>
         <w:rPr>
@@ -8153,6 +9269,21 @@
       </w:r>
     </w:p>
     <w:p>
+      <w:pPr/>
+      <w:r>
+        <w:rPr>
+          <w:b/>
+        </w:rPr>
+        <w:t xml:space="preserve">8. </w:t>
+      </w:r>
+      <w:r>
+        <w:rPr>
+          <w:i w:val="0"/>
+        </w:rPr>
+        <w:t>Find the free-space path loss at 28 GHz over 100 m.</w:t>
+      </w:r>
+    </w:p>
+    <w:p>
       <w:pPr>
         <w:pStyle w:val="Heading1"/>
       </w:pPr>
@@ -8431,16 +9562,16 @@
         <w:rPr>
           <w:i w:val="0"/>
         </w:rPr>
-        <w:t>19.5 Stencils and the area ratio</w:t>
-      </w:r>
-    </w:p>
-    <w:p>
-      <w:pPr/>
-      <w:r>
-        <w:rPr>
-          <w:i w:val="0"/>
-        </w:rPr>
-        <w:t>Most surface-mount defects start at the solder-paste printer. Paste is pushed through apertures in a thin steel stencil, and it releases onto the pad only if the pad pulls it out of the aperture more strongly than the aperture walls hold it. IPC-7525 expresses this as the area ratio, the pad-side opening area divided by the area of the aperture walls; for a circular aperture of diameter D in a foil of thickness T it is D/(4T). Ratios of 0.66 or more release reliably; below about 0.5, paste stays in the stencil and joints are starved. Fine-pitch BGAs and 0201 or 01005 passives therefore push stencils thinner, to 100 µm or less, which then gives too little paste for large connectors, a conflict solved with step stencils of two thicknesses or with laser-cut apertures and nanocoated walls.</w:t>
+        <w:t>19.5 Placement accuracy and process capability</w:t>
+      </w:r>
+    </w:p>
+    <w:p>
+      <w:pPr/>
+      <w:r>
+        <w:rPr>
+          <w:i w:val="0"/>
+        </w:rPr>
+        <w:t>After printing, the placement machine sets each part on its paste, and its accuracy is a statistical quantity. If the offset of placed parts from their pads has a mean µ and a standard deviation σ, and the design tolerates offsets between a lower limit LSL and an upper limit USL, the process capability index Cpk = min(USL − µ, µ − LSL)/(3σ) says how many standard deviations fit between the process and the nearest limit, in units of three. A Cpk of 1.0 puts the nearest limit at 3σ, about 1350 parts per million outside on that side; 1.33 puts it at 4σ, about 32 ppm; and 1.67 at 5σ, about 0.3 ppm. Because a board carries thousands of parts, the per-part rate multiplies, exactly as the defect rate did in Section 19.1, and factories quote Cpk of 1.33 or better for placement. Smaller parts and finer pitches shrink the tolerance faster than machines shrink σ, which is why 01005 and 008004 passives demand the best placement heads and why a mean offset, a calibration error, costs capability as surely as scatter does.</w:t>
       </w:r>
     </w:p>
     <w:p>
@@ -8451,7 +9582,7 @@
         <w:rPr>
           <w:i w:val="0"/>
         </w:rPr>
-        <w:t>area ratio = D / (4T)   (circular aperture)</w:t>
+        <w:t>Cpk = min(USL − µ, µ − LSL) / (3σ)</w:t>
       </w:r>
     </w:p>
     <w:p>
@@ -8477,7 +9608,7 @@
         <w:rPr>
           <w:i w:val="0"/>
         </w:rPr>
-        <w:t>A 0.4 mm-pitch BGA uses 0.25 mm circular apertures. Find the area ratio for a 125 µm and a 100 µm stencil.</w:t>
+        <w:t>A placement process has a mean offset of 5 µm and σ = 15 µm, and the pads tolerate ±75 µm. Find Cpk and the fraction of placements outside the tolerance. What fraction of boards with 2000 parts has at least one?</w:t>
       </w:r>
     </w:p>
     <w:p>
@@ -8492,7 +9623,7 @@
         <w:rPr>
           <w:i w:val="0"/>
         </w:rPr>
-        <w:t>At 125 µm, 0.25/(4 × 0.125) = 0.50, marginal; at 100 µm, 0.25/0.40 = 0.625, close to the 0.66 guideline. The design would use a 100 µm stencil, possibly stepped up to 150 µm around large connectors that need more paste.</w:t>
+        <w:t>Cpk = (75 − 5)/(3 × 15) = 1.56. The near limit is 70/15 = 4.67σ away, a one-sided tail of about 1.5 ppm; the far limit at 5.33σ adds about 0.05 ppm. A board with 2000 parts then has about 2000 × 1.5 × 10⁻⁶ = 0.003, so 0.3 % of boards carry a misplaced part. Removing the 5 µm mean offset would raise Cpk to 1.67 and cut that rate to about 0.6 ppm, nearly three times lower.</w:t>
       </w:r>
     </w:p>
     <w:p>
@@ -8617,7 +9748,7 @@
         <w:rPr>
           <w:i w:val="0"/>
         </w:rPr>
-        <w:t>What aperture diameter gives an area ratio of 0.66 in a 100 µm stencil?</w:t>
+        <w:t>A placement process has no mean offset, σ = 20 µm, and a tolerance of ±60 µm. Find Cpk.</w:t>
       </w:r>
     </w:p>
     <w:p>
@@ -8912,6 +10043,78 @@
       </w:r>
     </w:p>
     <w:p>
+      <w:pPr>
+        <w:pStyle w:val="Heading2"/>
+      </w:pPr>
+      <w:r>
+        <w:rPr>
+          <w:i w:val="0"/>
+        </w:rPr>
+        <w:t>20.6 Dynamic range, IF bandwidth, and sweep time</w:t>
+      </w:r>
+    </w:p>
+    <w:p>
+      <w:pPr/>
+      <w:r>
+        <w:rPr>
+          <w:i w:val="0"/>
+        </w:rPr>
+        <w:t>A VNA's ability to see small signals, such as the far-end crosstalk of a connector or the stopband of a filter, is set by its noise floor, and the noise floor is set by the IF bandwidth, the width of the filter that follows the receiver's mixer. Noise power is proportional to bandwidth, so reducing the IF bandwidth by a factor of ten lowers the noise floor by 10 dB. The price is time: the filter needs about 1/IFBW to settle at each frequency point, so the sweep slows by the same factor. Averaging several sweeps gives the same improvement at the same cost. Engineers therefore choose a wide IF bandwidth for return-loss and insertion-loss sweeps of channels, where the signals are large, and a narrow one only for measurements that need the dynamic range, accepting sweeps of seconds or minutes.</w:t>
+      </w:r>
+    </w:p>
+    <w:p>
+      <w:pPr>
+        <w:jc w:val="center"/>
+      </w:pPr>
+      <w:r>
+        <w:rPr>
+          <w:i w:val="0"/>
+        </w:rPr>
+        <w:t>ΔN = 10 log₁₀(IFBW₂ / IFBW₁) dB,    T_sweep ≈ N_points / IFBW</w:t>
+      </w:r>
+    </w:p>
+    <w:p>
+      <w:pPr>
+        <w:pStyle w:val="Heading2"/>
+      </w:pPr>
+      <w:r>
+        <w:rPr>
+          <w:i w:val="0"/>
+        </w:rPr>
+        <w:t>Worked Example 20.4</w:t>
+      </w:r>
+    </w:p>
+    <w:p>
+      <w:pPr/>
+      <w:r>
+        <w:rPr>
+          <w:b/>
+        </w:rPr>
+        <w:t xml:space="preserve">Problem. </w:t>
+      </w:r>
+      <w:r>
+        <w:rPr>
+          <w:i w:val="0"/>
+        </w:rPr>
+        <w:t>A VNA has a −90 dBm noise floor at a 10 kHz IF bandwidth. What IF bandwidth gives −110 dBm, and how long does a 1601-point sweep take at each setting?</w:t>
+      </w:r>
+    </w:p>
+    <w:p>
+      <w:pPr/>
+      <w:r>
+        <w:rPr>
+          <w:b/>
+        </w:rPr>
+        <w:t xml:space="preserve">Solution. </w:t>
+      </w:r>
+      <w:r>
+        <w:rPr>
+          <w:i w:val="0"/>
+        </w:rPr>
+        <w:t>A 20 dB lower floor needs a hundred times narrower bandwidth, 100 Hz. The sweep time is about 1601/10,000 = 0.16 s at 10 kHz and 1601/100 = 16 s at 100 Hz.</w:t>
+      </w:r>
+    </w:p>
+    <w:p>
       <w:pPr/>
       <w:r>
         <w:rPr>
@@ -9037,6 +10240,21 @@
       </w:r>
     </w:p>
     <w:p>
+      <w:pPr/>
+      <w:r>
+        <w:rPr>
+          <w:b/>
+        </w:rPr>
+        <w:t xml:space="preserve">8. </w:t>
+      </w:r>
+      <w:r>
+        <w:rPr>
+          <w:i w:val="0"/>
+        </w:rPr>
+        <w:t>By how much does the noise floor fall when the IF bandwidth goes from 1 kHz to 10 Hz?</w:t>
+      </w:r>
+    </w:p>
+    <w:p>
       <w:pPr>
         <w:pStyle w:val="Heading1"/>
       </w:pPr>
@@ -10576,6 +11794,78 @@
       </w:r>
     </w:p>
     <w:p>
+      <w:pPr>
+        <w:pStyle w:val="Heading2"/>
+      </w:pPr>
+      <w:r>
+        <w:rPr>
+          <w:i w:val="0"/>
+        </w:rPr>
+        <w:t>24.6 Pulsed emissions: why the peak and average limits differ by 20 dB</w:t>
+      </w:r>
+    </w:p>
+    <w:p>
+      <w:pPr/>
+      <w:r>
+        <w:rPr>
+          <w:i w:val="0"/>
+        </w:rPr>
+        <w:t>Many emissions are not steady. A radio that transmits in bursts, a motor drive that runs intermittently, or a processor whose activity varies produces a signal that is on for a fraction of the time. The peak detector reads the level during the burst; the average detector reads the level averaged over time, which for a signal on for a fraction d of the time is lower by 20 log₁₀(1/d) decibels when the detector averages the voltage envelope, as CISPR average detectors do. The FCC's peak limit above 1 GHz, 20 dB above the average limit, Section 23.5, corresponds exactly to a duty cycle of 10 %: an emission on for less than a tenth of the time is constrained by the peak limit, and one on for more by the average limit. Labs must be told the duty cycle of any bursting source, because a scan that happens to miss bursts underreports both readings.</w:t>
+      </w:r>
+    </w:p>
+    <w:p>
+      <w:pPr>
+        <w:jc w:val="center"/>
+      </w:pPr>
+      <w:r>
+        <w:rPr>
+          <w:i w:val="0"/>
+        </w:rPr>
+        <w:t>E_avg = E_peak − 20 log₁₀(1/d)  (envelope average)</w:t>
+      </w:r>
+    </w:p>
+    <w:p>
+      <w:pPr>
+        <w:pStyle w:val="Heading2"/>
+      </w:pPr>
+      <w:r>
+        <w:rPr>
+          <w:i w:val="0"/>
+        </w:rPr>
+        <w:t>Worked Example 24.3</w:t>
+      </w:r>
+    </w:p>
+    <w:p>
+      <w:pPr/>
+      <w:r>
+        <w:rPr>
+          <w:b/>
+        </w:rPr>
+        <w:t xml:space="preserve">Problem. </w:t>
+      </w:r>
+      <w:r>
+        <w:rPr>
+          <w:i w:val="0"/>
+        </w:rPr>
+        <w:t>A spurious emission at 4.8 GHz from a bursting radio is on 5 % of the time and reads 70 dBµV/m peak at 3 m. Estimate its average reading and the margins to the FCC limits of 74 dBµV/m peak and 54 dBµV/m average.</w:t>
+      </w:r>
+    </w:p>
+    <w:p>
+      <w:pPr/>
+      <w:r>
+        <w:rPr>
+          <w:b/>
+        </w:rPr>
+        <w:t xml:space="preserve">Solution. </w:t>
+      </w:r>
+      <w:r>
+        <w:rPr>
+          <w:i w:val="0"/>
+        </w:rPr>
+        <w:t>20 log₁₀(1/0.05) = 26 dB, so the average is about 44 dBµV/m. The peak margin is 4 dB and the average margin 10 dB, so the peak limit governs this low-duty emission.</w:t>
+      </w:r>
+    </w:p>
+    <w:p>
       <w:pPr/>
       <w:r>
         <w:rPr>
@@ -10701,6 +11991,21 @@
       </w:r>
     </w:p>
     <w:p>
+      <w:pPr/>
+      <w:r>
+        <w:rPr>
+          <w:b/>
+        </w:rPr>
+        <w:t xml:space="preserve">8. </w:t>
+      </w:r>
+      <w:r>
+        <w:rPr>
+          <w:i w:val="0"/>
+        </w:rPr>
+        <w:t>What duty cycle makes the average reading 6 dB below the peak?</w:t>
+      </w:r>
+    </w:p>
+    <w:p>
       <w:pPr>
         <w:pStyle w:val="Heading1"/>
       </w:pPr>
@@ -11408,6 +12713,78 @@
       </w:r>
     </w:p>
     <w:p>
+      <w:pPr>
+        <w:pStyle w:val="Heading2"/>
+      </w:pPr>
+      <w:r>
+        <w:rPr>
+          <w:i w:val="0"/>
+        </w:rPr>
+        <w:t>26.6 Sizing the common-mode choke</w:t>
+      </w:r>
+    </w:p>
+    <w:p>
+      <w:pPr/>
+      <w:r>
+        <w:rPr>
+          <w:i w:val="0"/>
+        </w:rPr>
+        <w:t>Once the touch-current budget has fixed the Y capacitance, the common-mode choke supplies the rest of the common-mode attenuation. For common-mode noise the two Y capacitors act in parallel, from both lines together to earth, and the choke's common-mode inductance forms a second-order low-pass filter with them, falling at 40 dB per decade above its corner. The choke is wound so that the line and neutral currents, equal and opposite, cancel their flux in the core, which keeps the large mains current from saturating it, while common-mode current, flowing the same way in both windings, sees the full inductance. High-permeability ferrite cores give millihenries in a small part, but their permeability and therefore their inductance fall at high frequency, and the inter-winding capacitance of the choke eventually bypasses it, which is why the highest-frequency conducted problems often need a second, smaller choke.</w:t>
+      </w:r>
+    </w:p>
+    <w:p>
+      <w:pPr>
+        <w:jc w:val="center"/>
+      </w:pPr>
+      <w:r>
+        <w:rPr>
+          <w:i w:val="0"/>
+        </w:rPr>
+        <w:t>f₀ = 1 / (2π √(L_CM × 2C_Y))</w:t>
+      </w:r>
+    </w:p>
+    <w:p>
+      <w:pPr>
+        <w:pStyle w:val="Heading2"/>
+      </w:pPr>
+      <w:r>
+        <w:rPr>
+          <w:i w:val="0"/>
+        </w:rPr>
+        <w:t>Worked Example 26.4</w:t>
+      </w:r>
+    </w:p>
+    <w:p>
+      <w:pPr/>
+      <w:r>
+        <w:rPr>
+          <w:b/>
+        </w:rPr>
+        <w:t xml:space="preserve">Problem. </w:t>
+      </w:r>
+      <w:r>
+        <w:rPr>
+          <w:i w:val="0"/>
+        </w:rPr>
+        <w:t>The filter uses two 2.2 nF Y capacitors, the largest allowed by the touch-current budget of Worked Example 26.3. Find the common-mode choke inductance that puts the filter corner at 50 kHz, and the attenuation that corner gives at 500 kHz.</w:t>
+      </w:r>
+    </w:p>
+    <w:p>
+      <w:pPr/>
+      <w:r>
+        <w:rPr>
+          <w:b/>
+        </w:rPr>
+        <w:t xml:space="preserve">Solution. </w:t>
+      </w:r>
+      <w:r>
+        <w:rPr>
+          <w:i w:val="0"/>
+        </w:rPr>
+        <w:t>The two Y capacitors in parallel give 4.4 nF. L = 1/((2π × 50 × 10³)² × 4.4 × 10⁻⁹) = 1/(9.87 × 10¹⁰ × 4.4 × 10⁻⁹) = 2.3 mH. At 500 kHz, a decade above the corner, the second-order filter gives about 40 dB.</w:t>
+      </w:r>
+    </w:p>
+    <w:p>
       <w:pPr/>
       <w:r>
         <w:rPr>
@@ -11533,6 +12910,21 @@
       </w:r>
     </w:p>
     <w:p>
+      <w:pPr/>
+      <w:r>
+        <w:rPr>
+          <w:b/>
+        </w:rPr>
+        <w:t xml:space="preserve">8. </w:t>
+      </w:r>
+      <w:r>
+        <w:rPr>
+          <w:i w:val="0"/>
+        </w:rPr>
+        <w:t>What corner frequency does a 1 mH common-mode choke give with two 2.2 nF Y capacitors?</w:t>
+      </w:r>
+    </w:p>
+    <w:p>
       <w:pPr>
         <w:pStyle w:val="Heading1"/>
       </w:pPr>
@@ -13121,6 +14513,69 @@
       </w:r>
     </w:p>
     <w:p>
+      <w:pPr/>
+      <w:r>
+        <w:rPr>
+          <w:i w:val="0"/>
+        </w:rPr>
+        <w:t>Multiphase buck: D = Vout/Vin; ripple ΔI = (Vin − Vout)D/(L fs); output ripple at N fs. Fan laws: Q ∝ N, Δp ∝ N², P ∝ N³, sound ≈ 50 log₁₀(N₂/N₁) dB.</w:t>
+      </w:r>
+    </w:p>
+    <w:p>
+      <w:pPr/>
+      <w:r>
+        <w:rPr>
+          <w:i w:val="0"/>
+        </w:rPr>
+        <w:t>Silicon resonator TCf ≈ −30 ppm/K uncompensated. Bond-wire low-pass τ = L/(2Z₀), added rise ≈ 2.2τ. Arrhenius AF = exp[(Ea/kB)(1/Tu − 1/Ts)], kB = 8.617 × 10⁻⁵ eV/K.</w:t>
+      </w:r>
+    </w:p>
+    <w:p>
+      <w:pPr/>
+      <w:r>
+        <w:rPr>
+          <w:i w:val="0"/>
+        </w:rPr>
+        <w:t>MLCC effective C = C_nom × k_bias × k_temp (X7R ±15 %). Via aspect ratio = thickness/drill, about 10:1 standard. Crosstalk sums: worst case Σ|xᵢ|, statistical √Σxᵢ². Jitter TJ = DJ + 2Q·RJ; Q(10⁻⁶) = 4.75.</w:t>
+      </w:r>
+    </w:p>
+    <w:p>
+      <w:pPr/>
+      <w:r>
+        <w:rPr>
+          <w:i w:val="0"/>
+        </w:rPr>
+        <w:t>Placement Cpk = min(USL − µ, µ − LSL)/(3σ). Friis FSPL = 20 log₁₀(4πd/λ); noise floor −174 dBm/Hz + 10 log₁₀B + NF. VNA noise floor ∝ IFBW; sweep ≈ points/IFBW. Magnetometer heading error ≈ arctan(B_off/H); wire field µ₀I/(2πr).</w:t>
+      </w:r>
+    </w:p>
+    <w:p>
+      <w:pPr/>
+      <w:r>
+        <w:rPr>
+          <w:i w:val="0"/>
+        </w:rPr>
+        <w:t>Slot resonance f = c/2L; aperture SE ≈ 20 log₁₀(λ/2L). Cable resonance c/2L (λ/2), c/4L (λ/4). Scan to 1, 2, or 5 GHz for highest internal frequency below 108 MHz, 500 MHz, or 1 GHz; above, 5× (FCC ≤ 40 GHz, CISPR 32 ≤ 6 GHz). FCC peak limit = average + 20 dB; average = peak − 20 log₁₀(1/d).</w:t>
+      </w:r>
+    </w:p>
+    <w:p>
+      <w:pPr/>
+      <w:r>
+        <w:rPr>
+          <w:i w:val="0"/>
+        </w:rPr>
+        <w:t>Stepped scan: step ≤ RBW/2; T = steps × dwell. Fully anechoic above 1 GHz: S_VSWR ≤ 6 dB; horn footprint w = 2d tan(θ/2). Touch current I = 2πfCV; CM choke f₀ = 1/(2π√(L·2C_Y)).</w:t>
+      </w:r>
+    </w:p>
+    <w:p>
+      <w:pPr/>
+      <w:r>
+        <w:rPr>
+          <w:i w:val="0"/>
+        </w:rPr>
+        <w:t>Signal-line surge through 42 Ω; TVS V_C = V_BR + I_PP R_dyn. 80/80 rule: x̄ + kS ≤ L, k = 2.04 (3), 1.69 (4), 1.52 (5), 1.42 (6), 1.20 (12). Motor-drive common mode I = C dv/dt.</w:t>
+      </w:r>
+    </w:p>
+    <w:p>
       <w:pPr>
         <w:pStyle w:val="Heading1"/>
       </w:pPr>
@@ -13510,6 +14965,21 @@
       </w:r>
     </w:p>
     <w:p>
+      <w:pPr/>
+      <w:r>
+        <w:rPr>
+          <w:b/>
+        </w:rPr>
+        <w:t xml:space="preserve">8. </w:t>
+      </w:r>
+      <w:r>
+        <w:rPr>
+          <w:i w:val="0"/>
+        </w:rPr>
+        <w:t>D = 0.083; ΔI = 11 × 0.083 / (150 × 10⁻⁹ × 10⁶) = 6.1 A.</w:t>
+      </w:r>
+    </w:p>
+    <w:p>
       <w:pPr>
         <w:pStyle w:val="Heading2"/>
       </w:pPr>
@@ -13858,6 +15328,21 @@
       </w:r>
     </w:p>
     <w:p>
+      <w:pPr/>
+      <w:r>
+        <w:rPr>
+          <w:b/>
+        </w:rPr>
+        <w:t xml:space="preserve">8. </w:t>
+      </w:r>
+      <w:r>
+        <w:rPr>
+          <w:i w:val="0"/>
+        </w:rPr>
+        <w:t>2³ = 8.</w:t>
+      </w:r>
+    </w:p>
+    <w:p>
       <w:pPr>
         <w:pStyle w:val="Heading2"/>
       </w:pPr>
@@ -13974,6 +15459,21 @@
       </w:r>
     </w:p>
     <w:p>
+      <w:pPr/>
+      <w:r>
+        <w:rPr>
+          <w:b/>
+        </w:rPr>
+        <w:t xml:space="preserve">8. </w:t>
+      </w:r>
+      <w:r>
+        <w:rPr>
+          <w:i w:val="0"/>
+        </w:rPr>
+        <w:t>70 × 30 = 2100 ppm.</w:t>
+      </w:r>
+    </w:p>
+    <w:p>
       <w:pPr>
         <w:pStyle w:val="Heading2"/>
       </w:pPr>
@@ -14206,6 +15706,21 @@
       </w:r>
     </w:p>
     <w:p>
+      <w:pPr/>
+      <w:r>
+        <w:rPr>
+          <w:b/>
+        </w:rPr>
+        <w:t xml:space="preserve">8. </w:t>
+      </w:r>
+      <w:r>
+        <w:rPr>
+          <w:i w:val="0"/>
+        </w:rPr>
+        <w:t>τ = 10 ps, so about 22 ps.</w:t>
+      </w:r>
+    </w:p>
+    <w:p>
       <w:pPr>
         <w:pStyle w:val="Heading2"/>
       </w:pPr>
@@ -14322,6 +15837,21 @@
       </w:r>
     </w:p>
     <w:p>
+      <w:pPr/>
+      <w:r>
+        <w:rPr>
+          <w:b/>
+        </w:rPr>
+        <w:t xml:space="preserve">8. </w:t>
+      </w:r>
+      <w:r>
+        <w:rPr>
+          <w:i w:val="0"/>
+        </w:rPr>
+        <w:t>1/358.15 − 1/398.15 = 2.81 × 10⁻⁴; AF = exp(8124 × 2.81 × 10⁻⁴) = exp(2.28) = 9.8.</w:t>
+      </w:r>
+    </w:p>
+    <w:p>
       <w:pPr>
         <w:pStyle w:val="Heading2"/>
       </w:pPr>
@@ -14438,6 +15968,21 @@
       </w:r>
     </w:p>
     <w:p>
+      <w:pPr/>
+      <w:r>
+        <w:rPr>
+          <w:b/>
+        </w:rPr>
+        <w:t xml:space="preserve">8. </w:t>
+      </w:r>
+      <w:r>
+        <w:rPr>
+          <w:i w:val="0"/>
+        </w:rPr>
+        <w:t>7.7 µF.</w:t>
+      </w:r>
+    </w:p>
+    <w:p>
       <w:pPr>
         <w:pStyle w:val="Heading2"/>
       </w:pPr>
@@ -14554,6 +16099,21 @@
       </w:r>
     </w:p>
     <w:p>
+      <w:pPr/>
+      <w:r>
+        <w:rPr>
+          <w:b/>
+        </w:rPr>
+        <w:t xml:space="preserve">8. </w:t>
+      </w:r>
+      <w:r>
+        <w:rPr>
+          <w:i w:val="0"/>
+        </w:rPr>
+        <w:t>0.32 mm.</w:t>
+      </w:r>
+    </w:p>
+    <w:p>
       <w:pPr>
         <w:pStyle w:val="Heading2"/>
       </w:pPr>
@@ -14670,6 +16230,21 @@
       </w:r>
     </w:p>
     <w:p>
+      <w:pPr/>
+      <w:r>
+        <w:rPr>
+          <w:b/>
+        </w:rPr>
+        <w:t xml:space="preserve">8. </w:t>
+      </w:r>
+      <w:r>
+        <w:rPr>
+          <w:i w:val="0"/>
+        </w:rPr>
+        <w:t>4 % and √(4 × 0.01²) = 2 %.</w:t>
+      </w:r>
+    </w:p>
+    <w:p>
       <w:pPr>
         <w:pStyle w:val="Heading2"/>
       </w:pPr>
@@ -14786,6 +16361,21 @@
       </w:r>
     </w:p>
     <w:p>
+      <w:pPr/>
+      <w:r>
+        <w:rPr>
+          <w:b/>
+        </w:rPr>
+        <w:t xml:space="preserve">8. </w:t>
+      </w:r>
+      <w:r>
+        <w:rPr>
+          <w:i w:val="0"/>
+        </w:rPr>
+        <w:t>2 + 14.06 × 0.2 = 4.8 ps.</w:t>
+      </w:r>
+    </w:p>
+    <w:p>
       <w:pPr>
         <w:pStyle w:val="Heading2"/>
       </w:pPr>
@@ -14902,6 +16492,21 @@
       </w:r>
     </w:p>
     <w:p>
+      <w:pPr/>
+      <w:r>
+        <w:rPr>
+          <w:b/>
+        </w:rPr>
+        <w:t xml:space="preserve">8. </w:t>
+      </w:r>
+      <w:r>
+        <w:rPr>
+          <w:i w:val="0"/>
+        </w:rPr>
+        <w:t>320 mW / 0.631 = 507 mW of light, so 507/0.15 = 3.4 W.</w:t>
+      </w:r>
+    </w:p>
+    <w:p>
       <w:pPr>
         <w:pStyle w:val="Heading2"/>
       </w:pPr>
@@ -15018,6 +16623,21 @@
       </w:r>
     </w:p>
     <w:p>
+      <w:pPr/>
+      <w:r>
+        <w:rPr>
+          <w:b/>
+        </w:rPr>
+        <w:t xml:space="preserve">8. </w:t>
+      </w:r>
+      <w:r>
+        <w:rPr>
+          <w:i w:val="0"/>
+        </w:rPr>
+        <w:t>arctan(0.05) = 2.9°.</w:t>
+      </w:r>
+    </w:p>
+    <w:p>
       <w:pPr>
         <w:pStyle w:val="Heading2"/>
       </w:pPr>
@@ -15134,6 +16754,21 @@
       </w:r>
     </w:p>
     <w:p>
+      <w:pPr/>
+      <w:r>
+        <w:rPr>
+          <w:b/>
+        </w:rPr>
+        <w:t xml:space="preserve">8. </w:t>
+      </w:r>
+      <w:r>
+        <w:rPr>
+          <w:i w:val="0"/>
+        </w:rPr>
+        <w:t>0.5 × 40 fF × 0.25 V² = 5 fJ.</w:t>
+      </w:r>
+    </w:p>
+    <w:p>
       <w:pPr>
         <w:pStyle w:val="Heading2"/>
       </w:pPr>
@@ -15250,6 +16885,21 @@
       </w:r>
     </w:p>
     <w:p>
+      <w:pPr/>
+      <w:r>
+        <w:rPr>
+          <w:b/>
+        </w:rPr>
+        <w:t xml:space="preserve">8. </w:t>
+      </w:r>
+      <w:r>
+        <w:rPr>
+          <w:i w:val="0"/>
+        </w:rPr>
+        <w:t>λ = 10.7 mm; 20 log₁₀(4π × 100/0.0107) = 101.4 dB.</w:t>
+      </w:r>
+    </w:p>
+    <w:p>
       <w:pPr>
         <w:pStyle w:val="Heading2"/>
       </w:pPr>
@@ -15362,7 +17012,7 @@
         <w:rPr>
           <w:i w:val="0"/>
         </w:rPr>
-        <w:t>D = 0.66 × 4 × 0.1 = 0.264 mm.</w:t>
+        <w:t>60/(3 × 20) = 1.0.</w:t>
       </w:r>
     </w:p>
     <w:p>
@@ -15482,6 +17132,21 @@
       </w:r>
     </w:p>
     <w:p>
+      <w:pPr/>
+      <w:r>
+        <w:rPr>
+          <w:b/>
+        </w:rPr>
+        <w:t xml:space="preserve">8. </w:t>
+      </w:r>
+      <w:r>
+        <w:rPr>
+          <w:i w:val="0"/>
+        </w:rPr>
+        <w:t>20 dB.</w:t>
+      </w:r>
+    </w:p>
+    <w:p>
       <w:pPr>
         <w:pStyle w:val="Heading2"/>
       </w:pPr>
@@ -15946,6 +17611,21 @@
       </w:r>
     </w:p>
     <w:p>
+      <w:pPr/>
+      <w:r>
+        <w:rPr>
+          <w:b/>
+        </w:rPr>
+        <w:t xml:space="preserve">8. </w:t>
+      </w:r>
+      <w:r>
+        <w:rPr>
+          <w:i w:val="0"/>
+        </w:rPr>
+        <w:t>10^(−6/20) = 0.50, so 50 %.</w:t>
+      </w:r>
+    </w:p>
+    <w:p>
       <w:pPr>
         <w:pStyle w:val="Heading2"/>
       </w:pPr>
@@ -16178,6 +17858,21 @@
       </w:r>
     </w:p>
     <w:p>
+      <w:pPr/>
+      <w:r>
+        <w:rPr>
+          <w:b/>
+        </w:rPr>
+        <w:t xml:space="preserve">8. </w:t>
+      </w:r>
+      <w:r>
+        <w:rPr>
+          <w:i w:val="0"/>
+        </w:rPr>
+        <w:t>1/(2π √(10⁻³ × 4.4 × 10⁻⁹)) = 75.9 kHz.</w:t>
+      </w:r>
+    </w:p>
+    <w:p>
       <w:pPr>
         <w:pStyle w:val="Heading2"/>
       </w:pPr>
@@ -16705,6 +18400,42 @@
           <w:i w:val="0"/>
         </w:rPr>
         <w:t>Keysight PathWave ADS, Cadence AWR Microwave Office, Sonnet, Ansys HFSS, and Dassault CST Studio Suite documentation, as tools named in Chapter 28.</w:t>
+      </w:r>
+    </w:p>
+    <w:p>
+      <w:pPr/>
+      <w:r>
+        <w:rPr>
+          <w:i w:val="0"/>
+        </w:rPr>
+        <w:t>Intel and Infineon multiphase controller application notes, and Robert W. Erickson and Dragan Maksimović, Fundamentals of Power Electronics, 3rd edition, for interleaved phases (Chapter 3); MLCC manufacturers' DC-bias curves (Murata, TDK, Samsung Electro-Mechanics) for Chapter 11.</w:t>
+      </w:r>
+    </w:p>
+    <w:p>
+      <w:pPr/>
+      <w:r>
+        <w:rPr>
+          <w:i w:val="0"/>
+        </w:rPr>
+        <w:t>JEDEC JESD22-A108 (HTOL) and JESD47 for accelerated life qualification (Chapter 10); Douglas C. Montgomery, Introduction to Statistical Quality Control, for process capability (Chapter 19).</w:t>
+      </w:r>
+    </w:p>
+    <w:p>
+      <w:pPr/>
+      <w:r>
+        <w:rPr>
+          <w:i w:val="0"/>
+        </w:rPr>
+        <w:t>CISPR 16-4-3 and CISPR 32 Annex material on the 80/80 statistical assessment of series production (Chapter 28); FCC 47 CFR 15.33 and 15.35 for the upper scan frequency and the peak and average limits above 1 GHz (Chapters 23 and 24).</w:t>
+      </w:r>
+    </w:p>
+    <w:p>
+      <w:pPr/>
+      <w:r>
+        <w:rPr>
+          <w:i w:val="0"/>
+        </w:rPr>
+        <w:t>IEC 62368-1 and IEC 60950-1 for touch-current limits (Chapter 26); Littelfuse and Semtech TVS application notes for surge protection of signal lines (Chapter 27).</w:t>
       </w:r>
     </w:p>
     <w:sectPr>

</xml_diff>